<commit_message>
style(apuntes): encabezado a la izquierda, mayor espaciado entre secciones y salto de pagina previo a conceptos clave
</commit_message>
<xml_diff>
--- a/Temas EB/Tema 1/Apuntes/Tema 1 2627_maquetado.docx
+++ b/Temas EB/Tema 1/Apuntes/Tema 1 2627_maquetado.docx
@@ -132,6 +132,8 @@
     <w:p>
       <w:pPr>
         <w:pStyle w:val="Heading1"/>
+        <w:keepNext/>
+        <w:spacing w:before="520" w:after="120"/>
         <w:jc w:val="left"/>
       </w:pPr>
       <w:r>
@@ -213,6 +215,8 @@
     <w:p>
       <w:pPr>
         <w:pStyle w:val="Heading2"/>
+        <w:keepNext/>
+        <w:spacing w:before="360" w:after="100"/>
         <w:jc w:val="left"/>
       </w:pPr>
       <w:r>
@@ -607,6 +611,8 @@
     <w:p>
       <w:pPr>
         <w:pStyle w:val="Heading2"/>
+        <w:keepNext/>
+        <w:spacing w:before="360" w:after="100"/>
         <w:jc w:val="left"/>
       </w:pPr>
       <w:r>
@@ -1055,6 +1061,8 @@
     <w:p>
       <w:pPr>
         <w:pStyle w:val="Heading3"/>
+        <w:keepNext/>
+        <w:spacing w:before="240" w:after="60"/>
         <w:jc w:val="left"/>
       </w:pPr>
       <w:r>
@@ -1837,6 +1845,8 @@
     <w:p>
       <w:pPr>
         <w:pStyle w:val="Heading3"/>
+        <w:keepNext/>
+        <w:spacing w:before="240" w:after="60"/>
         <w:jc w:val="left"/>
       </w:pPr>
       <w:r>
@@ -1987,6 +1997,8 @@
     <w:p>
       <w:pPr>
         <w:pStyle w:val="Heading3"/>
+        <w:keepNext/>
+        <w:spacing w:before="240" w:after="60"/>
         <w:jc w:val="left"/>
       </w:pPr>
       <w:r>
@@ -2592,6 +2604,8 @@
     <w:p>
       <w:pPr>
         <w:pStyle w:val="Heading1"/>
+        <w:keepNext/>
+        <w:spacing w:before="520" w:after="120"/>
         <w:jc w:val="left"/>
       </w:pPr>
       <w:r>
@@ -2673,6 +2687,8 @@
     <w:p>
       <w:pPr>
         <w:pStyle w:val="Heading2"/>
+        <w:keepNext/>
+        <w:spacing w:before="360" w:after="100"/>
         <w:jc w:val="left"/>
       </w:pPr>
       <w:r>
@@ -3651,6 +3667,8 @@
     <w:p>
       <w:pPr>
         <w:pStyle w:val="Heading2"/>
+        <w:keepNext/>
+        <w:spacing w:before="360" w:after="100"/>
         <w:jc w:val="left"/>
       </w:pPr>
       <w:r>
@@ -4002,6 +4020,8 @@
     <w:p>
       <w:pPr>
         <w:pStyle w:val="Heading3"/>
+        <w:keepNext/>
+        <w:spacing w:before="240" w:after="60"/>
         <w:jc w:val="left"/>
       </w:pPr>
       <w:r>
@@ -4174,6 +4194,8 @@
     <w:p>
       <w:pPr>
         <w:pStyle w:val="Heading3"/>
+        <w:keepNext/>
+        <w:spacing w:before="240" w:after="60"/>
         <w:jc w:val="left"/>
       </w:pPr>
       <w:r>
@@ -4431,6 +4453,8 @@
     <w:p>
       <w:pPr>
         <w:pStyle w:val="Heading2"/>
+        <w:keepNext/>
+        <w:spacing w:before="360" w:after="100"/>
         <w:jc w:val="left"/>
       </w:pPr>
       <w:r>
@@ -4674,6 +4698,8 @@
     <w:p>
       <w:pPr>
         <w:pStyle w:val="Heading1"/>
+        <w:keepNext/>
+        <w:spacing w:before="520" w:after="120"/>
         <w:jc w:val="left"/>
       </w:pPr>
       <w:r>
@@ -4755,6 +4781,8 @@
     <w:p>
       <w:pPr>
         <w:pStyle w:val="Heading2"/>
+        <w:keepNext/>
+        <w:spacing w:before="360" w:after="100"/>
         <w:jc w:val="left"/>
       </w:pPr>
       <w:r>
@@ -5103,6 +5131,8 @@
     <w:p>
       <w:pPr>
         <w:pStyle w:val="Heading2"/>
+        <w:keepNext/>
+        <w:spacing w:before="360" w:after="100"/>
         <w:jc w:val="left"/>
       </w:pPr>
       <w:r>
@@ -5376,6 +5406,8 @@
     <w:p>
       <w:pPr>
         <w:pStyle w:val="Heading2"/>
+        <w:keepNext/>
+        <w:spacing w:before="360" w:after="100"/>
         <w:jc w:val="left"/>
       </w:pPr>
       <w:r>
@@ -5702,6 +5734,8 @@
     <w:p>
       <w:pPr>
         <w:pStyle w:val="Heading2"/>
+        <w:keepNext/>
+        <w:spacing w:before="360" w:after="100"/>
         <w:jc w:val="left"/>
       </w:pPr>
       <w:r>
@@ -6356,6 +6390,8 @@
     <w:p>
       <w:pPr>
         <w:pStyle w:val="Heading1"/>
+        <w:keepNext/>
+        <w:spacing w:before="520" w:after="120"/>
         <w:jc w:val="left"/>
       </w:pPr>
       <w:r>
@@ -6482,6 +6518,8 @@
     <w:p>
       <w:pPr>
         <w:pStyle w:val="Heading2"/>
+        <w:keepNext/>
+        <w:spacing w:before="360" w:after="100"/>
         <w:jc w:val="left"/>
       </w:pPr>
       <w:r>
@@ -6497,6 +6535,8 @@
     <w:p>
       <w:pPr>
         <w:pStyle w:val="Heading3"/>
+        <w:keepNext/>
+        <w:spacing w:before="240" w:after="60"/>
         <w:jc w:val="left"/>
       </w:pPr>
       <w:r>
@@ -6830,6 +6870,8 @@
     <w:p>
       <w:pPr>
         <w:pStyle w:val="Heading3"/>
+        <w:keepNext/>
+        <w:spacing w:before="240" w:after="60"/>
         <w:jc w:val="left"/>
       </w:pPr>
       <w:r>
@@ -7406,6 +7448,8 @@
     <w:p>
       <w:pPr>
         <w:pStyle w:val="Heading2"/>
+        <w:keepNext/>
+        <w:spacing w:before="360" w:after="100"/>
         <w:jc w:val="left"/>
       </w:pPr>
       <w:r>
@@ -7421,6 +7465,8 @@
     <w:p>
       <w:pPr>
         <w:pStyle w:val="Heading3"/>
+        <w:keepNext/>
+        <w:spacing w:before="240" w:after="60"/>
         <w:jc w:val="left"/>
       </w:pPr>
       <w:r>
@@ -7974,6 +8020,8 @@
     <w:p>
       <w:pPr>
         <w:pStyle w:val="Heading3"/>
+        <w:keepNext/>
+        <w:spacing w:before="240" w:after="60"/>
         <w:jc w:val="left"/>
       </w:pPr>
       <w:r>
@@ -8158,6 +8206,8 @@
     <w:p>
       <w:pPr>
         <w:pStyle w:val="Heading3"/>
+        <w:keepNext/>
+        <w:spacing w:before="240" w:after="60"/>
         <w:jc w:val="left"/>
       </w:pPr>
       <w:r>
@@ -8479,6 +8529,8 @@
     <w:p>
       <w:pPr>
         <w:pStyle w:val="Heading2"/>
+        <w:keepNext/>
+        <w:spacing w:before="360" w:after="100"/>
         <w:jc w:val="left"/>
       </w:pPr>
       <w:r>
@@ -8676,6 +8728,8 @@
     <w:p>
       <w:pPr>
         <w:pStyle w:val="Heading2"/>
+        <w:keepNext/>
+        <w:spacing w:before="360" w:after="100"/>
         <w:jc w:val="left"/>
       </w:pPr>
       <w:r>
@@ -9191,6 +9245,8 @@
     <w:p>
       <w:pPr>
         <w:pStyle w:val="Heading1"/>
+        <w:keepNext/>
+        <w:spacing w:before="520" w:after="120"/>
         <w:jc w:val="left"/>
       </w:pPr>
       <w:r>
@@ -9287,6 +9343,8 @@
     <w:p>
       <w:pPr>
         <w:pStyle w:val="Heading2"/>
+        <w:keepNext/>
+        <w:spacing w:before="360" w:after="100"/>
         <w:jc w:val="left"/>
       </w:pPr>
       <w:r>
@@ -9410,6 +9468,8 @@
     <w:p>
       <w:pPr>
         <w:pStyle w:val="Heading2"/>
+        <w:keepNext/>
+        <w:spacing w:before="360" w:after="100"/>
         <w:jc w:val="left"/>
       </w:pPr>
       <w:r>
@@ -9705,6 +9765,8 @@
     <w:p>
       <w:pPr>
         <w:pStyle w:val="Heading2"/>
+        <w:keepNext/>
+        <w:spacing w:before="360" w:after="100"/>
         <w:jc w:val="left"/>
       </w:pPr>
       <w:r>
@@ -9936,6 +9998,8 @@
     <w:p>
       <w:pPr>
         <w:pStyle w:val="Heading2"/>
+        <w:keepNext/>
+        <w:spacing w:before="360" w:after="100"/>
         <w:jc w:val="left"/>
       </w:pPr>
       <w:r>
@@ -10209,6 +10273,8 @@
     <w:p>
       <w:pPr>
         <w:pStyle w:val="Heading1"/>
+        <w:keepNext/>
+        <w:spacing w:before="520" w:after="120"/>
         <w:jc w:val="left"/>
       </w:pPr>
       <w:r>
@@ -10290,6 +10356,8 @@
     <w:p>
       <w:pPr>
         <w:pStyle w:val="Heading2"/>
+        <w:keepNext/>
+        <w:spacing w:before="360" w:after="100"/>
         <w:jc w:val="left"/>
       </w:pPr>
       <w:r>
@@ -10498,6 +10566,8 @@
     <w:p>
       <w:pPr>
         <w:pStyle w:val="Heading2"/>
+        <w:keepNext/>
+        <w:spacing w:before="360" w:after="100"/>
         <w:jc w:val="left"/>
       </w:pPr>
       <w:r>
@@ -10878,6 +10948,8 @@
     <w:p>
       <w:pPr>
         <w:pStyle w:val="Heading2"/>
+        <w:keepNext/>
+        <w:spacing w:before="360" w:after="100"/>
         <w:jc w:val="left"/>
       </w:pPr>
       <w:r>
@@ -11196,6 +11268,8 @@
     <w:p>
       <w:pPr>
         <w:pStyle w:val="Heading2"/>
+        <w:keepNext/>
+        <w:spacing w:before="360" w:after="100"/>
         <w:jc w:val="left"/>
       </w:pPr>
       <w:r>
@@ -11679,6 +11753,8 @@
     <w:p>
       <w:pPr>
         <w:pStyle w:val="Heading2"/>
+        <w:keepNext/>
+        <w:spacing w:before="360" w:after="100"/>
         <w:jc w:val="left"/>
       </w:pPr>
       <w:r>
@@ -12195,6 +12271,948 @@
       </w:r>
     </w:p>
     <w:p>
+      <w:r>
+        <w:br w:type="page"/>
+      </w:r>
+    </w:p>
+    <w:tbl>
+      <w:tblPr>
+        <w:tblW w:type="auto" w:w="0"/>
+        <w:jc w:val="center"/>
+        <w:tblLayout w:type="fixed"/>
+        <w:tblLook w:firstColumn="1" w:firstRow="1" w:lastColumn="0" w:lastRow="0" w:noHBand="0" w:noVBand="1" w:val="04A0"/>
+      </w:tblPr>
+      <w:tblGrid>
+        <w:gridCol w:w="9418"/>
+      </w:tblGrid>
+      <w:tr>
+        <w:tc>
+          <w:tcPr>
+            <w:tcW w:type="dxa" w:w="9360"/>
+            <w:shd w:val="clear" w:color="auto" w:fill="E1F6EA"/>
+            <w:tcMar>
+              <w:top w:w="160" w:type="dxa"/>
+              <w:left w:w="200" w:type="dxa"/>
+              <w:bottom w:w="160" w:type="dxa"/>
+              <w:right w:w="160" w:type="dxa"/>
+            </w:tcMar>
+            <w:tcBorders>
+              <w:top w:val="none"/>
+              <w:left w:val="single" w:sz="26" w:space="0" w:color="76927A"/>
+              <w:bottom w:val="none"/>
+              <w:right w:val="none"/>
+            </w:tcBorders>
+          </w:tcPr>
+          <w:p>
+            <w:pPr>
+              <w:spacing w:before="0" w:after="120"/>
+              <w:jc w:val="left"/>
+            </w:pPr>
+            <w:r>
+              <w:rPr>
+                <w:rFonts w:ascii="Poppins" w:hAnsi="Poppins"/>
+                <w:b/>
+                <w:color w:val="566B56"/>
+                <w:sz w:val="22"/>
+              </w:rPr>
+              <w:t>💡  CONCEPTOS CLAVE DEL TEMA 1 COMPLETO</w:t>
+              <w:br/>
+            </w:r>
+          </w:p>
+          <w:p>
+            <w:pPr>
+              <w:spacing w:before="0" w:after="40" w:line="276" w:lineRule="auto"/>
+              <w:ind w:left="360" w:hanging="216"/>
+              <w:jc w:val="both"/>
+            </w:pPr>
+            <w:r>
+              <w:rPr>
+                <w:rFonts w:ascii="Calibri" w:hAnsi="Calibri"/>
+                <w:b/>
+                <w:color w:val="76927A"/>
+              </w:rPr>
+              <w:t xml:space="preserve">• </w:t>
+            </w:r>
+            <w:r>
+              <w:rPr>
+                <w:rFonts w:ascii="Calibri" w:hAnsi="Calibri"/>
+                <w:b/>
+                <w:color w:val="566B56"/>
+              </w:rPr>
+              <w:t xml:space="preserve">Mercado de trabajo: </w:t>
+            </w:r>
+            <w:r>
+              <w:rPr>
+                <w:rFonts w:ascii="Calibri" w:hAnsi="Calibri"/>
+                <w:color w:val="2F3A30"/>
+                <w:sz w:val="19"/>
+              </w:rPr>
+              <w:t>Ámbito de interacción entre oferta y demanda laboral</w:t>
+            </w:r>
+          </w:p>
+          <w:p>
+            <w:pPr>
+              <w:spacing w:before="60" w:after="40" w:line="276" w:lineRule="auto"/>
+              <w:ind w:left="360" w:hanging="216"/>
+              <w:jc w:val="both"/>
+            </w:pPr>
+            <w:r>
+              <w:rPr>
+                <w:rFonts w:ascii="Calibri" w:hAnsi="Calibri"/>
+                <w:b/>
+                <w:color w:val="76927A"/>
+              </w:rPr>
+              <w:t xml:space="preserve">• </w:t>
+            </w:r>
+            <w:r>
+              <w:rPr>
+                <w:rFonts w:ascii="Calibri" w:hAnsi="Calibri"/>
+                <w:b/>
+                <w:color w:val="566B56"/>
+              </w:rPr>
+              <w:t xml:space="preserve">Población activa: </w:t>
+            </w:r>
+            <w:r>
+              <w:rPr>
+                <w:rFonts w:ascii="Calibri" w:hAnsi="Calibri"/>
+                <w:color w:val="2F3A30"/>
+                <w:sz w:val="19"/>
+              </w:rPr>
+              <w:t>Ocupados + desempleados que buscan empleo</w:t>
+            </w:r>
+          </w:p>
+          <w:p>
+            <w:pPr>
+              <w:spacing w:before="60" w:after="40" w:line="276" w:lineRule="auto"/>
+              <w:ind w:left="360" w:hanging="216"/>
+              <w:jc w:val="both"/>
+            </w:pPr>
+            <w:r>
+              <w:rPr>
+                <w:rFonts w:ascii="Calibri" w:hAnsi="Calibri"/>
+                <w:b/>
+                <w:color w:val="76927A"/>
+              </w:rPr>
+              <w:t xml:space="preserve">• </w:t>
+            </w:r>
+            <w:r>
+              <w:rPr>
+                <w:rFonts w:ascii="Calibri" w:hAnsi="Calibri"/>
+                <w:b/>
+                <w:color w:val="566B56"/>
+              </w:rPr>
+              <w:t xml:space="preserve">Tasa de actividad: </w:t>
+            </w:r>
+            <w:r>
+              <w:rPr>
+                <w:rFonts w:ascii="Calibri" w:hAnsi="Calibri"/>
+                <w:color w:val="2F3A30"/>
+                <w:sz w:val="19"/>
+              </w:rPr>
+              <w:t>Proporción de población que participa en el mercado laboral</w:t>
+            </w:r>
+          </w:p>
+          <w:p>
+            <w:pPr>
+              <w:spacing w:before="60" w:after="40" w:line="276" w:lineRule="auto"/>
+              <w:ind w:left="360" w:hanging="216"/>
+              <w:jc w:val="both"/>
+            </w:pPr>
+            <w:r>
+              <w:rPr>
+                <w:rFonts w:ascii="Calibri" w:hAnsi="Calibri"/>
+                <w:b/>
+                <w:color w:val="76927A"/>
+              </w:rPr>
+              <w:t xml:space="preserve">• </w:t>
+            </w:r>
+            <w:r>
+              <w:rPr>
+                <w:rFonts w:ascii="Calibri" w:hAnsi="Calibri"/>
+                <w:b/>
+                <w:color w:val="566B56"/>
+              </w:rPr>
+              <w:t xml:space="preserve">Tasa de desempleo: </w:t>
+            </w:r>
+            <w:r>
+              <w:rPr>
+                <w:rFonts w:ascii="Calibri" w:hAnsi="Calibri"/>
+                <w:color w:val="2F3A30"/>
+                <w:sz w:val="19"/>
+              </w:rPr>
+              <w:t>Proporción de población activa sin empleo que busca trabajo</w:t>
+            </w:r>
+          </w:p>
+          <w:p>
+            <w:pPr>
+              <w:spacing w:before="60" w:after="40" w:line="276" w:lineRule="auto"/>
+              <w:ind w:left="360" w:hanging="216"/>
+              <w:jc w:val="both"/>
+            </w:pPr>
+            <w:r>
+              <w:rPr>
+                <w:rFonts w:ascii="Calibri" w:hAnsi="Calibri"/>
+                <w:b/>
+                <w:color w:val="76927A"/>
+              </w:rPr>
+              <w:t xml:space="preserve">• </w:t>
+            </w:r>
+            <w:r>
+              <w:rPr>
+                <w:rFonts w:ascii="Calibri" w:hAnsi="Calibri"/>
+                <w:b/>
+                <w:color w:val="566B56"/>
+              </w:rPr>
+              <w:t xml:space="preserve">Tasa de empleo: </w:t>
+            </w:r>
+            <w:r>
+              <w:rPr>
+                <w:rFonts w:ascii="Calibri" w:hAnsi="Calibri"/>
+                <w:color w:val="2F3A30"/>
+                <w:sz w:val="19"/>
+              </w:rPr>
+              <w:t>Proporción de población en edad de trabajar que está empleada</w:t>
+            </w:r>
+          </w:p>
+          <w:p>
+            <w:pPr>
+              <w:spacing w:before="60" w:after="40" w:line="276" w:lineRule="auto"/>
+              <w:ind w:left="360" w:hanging="216"/>
+              <w:jc w:val="both"/>
+            </w:pPr>
+            <w:r>
+              <w:rPr>
+                <w:rFonts w:ascii="Calibri" w:hAnsi="Calibri"/>
+                <w:b/>
+                <w:color w:val="76927A"/>
+              </w:rPr>
+              <w:t xml:space="preserve">• </w:t>
+            </w:r>
+            <w:r>
+              <w:rPr>
+                <w:rFonts w:ascii="Calibri" w:hAnsi="Calibri"/>
+                <w:b/>
+                <w:color w:val="566B56"/>
+              </w:rPr>
+              <w:t xml:space="preserve">PIB: </w:t>
+            </w:r>
+            <w:r>
+              <w:rPr>
+                <w:rFonts w:ascii="Calibri" w:hAnsi="Calibri"/>
+                <w:color w:val="2F3A30"/>
+                <w:sz w:val="19"/>
+              </w:rPr>
+              <w:t>Valor monetario total de bienes y servicios finales producidos en un país</w:t>
+            </w:r>
+          </w:p>
+          <w:p>
+            <w:pPr>
+              <w:spacing w:before="60" w:after="40" w:line="276" w:lineRule="auto"/>
+              <w:ind w:left="360" w:hanging="216"/>
+              <w:jc w:val="both"/>
+            </w:pPr>
+            <w:r>
+              <w:rPr>
+                <w:rFonts w:ascii="Calibri" w:hAnsi="Calibri"/>
+                <w:b/>
+                <w:color w:val="76927A"/>
+              </w:rPr>
+              <w:t xml:space="preserve">• </w:t>
+            </w:r>
+            <w:r>
+              <w:rPr>
+                <w:rFonts w:ascii="Calibri" w:hAnsi="Calibri"/>
+                <w:b/>
+                <w:color w:val="566B56"/>
+              </w:rPr>
+              <w:t xml:space="preserve">Valor Añadido Bruto (VAB): </w:t>
+            </w:r>
+            <w:r>
+              <w:rPr>
+                <w:rFonts w:ascii="Calibri" w:hAnsi="Calibri"/>
+                <w:color w:val="2F3A30"/>
+                <w:sz w:val="19"/>
+              </w:rPr>
+              <w:t>Valor agregado en cada etapa de producción</w:t>
+            </w:r>
+          </w:p>
+          <w:p>
+            <w:pPr>
+              <w:spacing w:before="60" w:after="40" w:line="276" w:lineRule="auto"/>
+              <w:ind w:left="360" w:hanging="216"/>
+              <w:jc w:val="both"/>
+            </w:pPr>
+            <w:r>
+              <w:rPr>
+                <w:rFonts w:ascii="Calibri" w:hAnsi="Calibri"/>
+                <w:b/>
+                <w:color w:val="76927A"/>
+              </w:rPr>
+              <w:t xml:space="preserve">• </w:t>
+            </w:r>
+            <w:r>
+              <w:rPr>
+                <w:rFonts w:ascii="Calibri" w:hAnsi="Calibri"/>
+                <w:b/>
+                <w:color w:val="566B56"/>
+              </w:rPr>
+              <w:t xml:space="preserve">Productividad: </w:t>
+            </w:r>
+            <w:r>
+              <w:rPr>
+                <w:rFonts w:ascii="Calibri" w:hAnsi="Calibri"/>
+                <w:color w:val="2F3A30"/>
+                <w:sz w:val="19"/>
+              </w:rPr>
+              <w:t>Eficiencia en el uso de factores productivos</w:t>
+            </w:r>
+          </w:p>
+          <w:p>
+            <w:pPr>
+              <w:spacing w:before="60" w:after="40" w:line="276" w:lineRule="auto"/>
+              <w:ind w:left="360" w:hanging="216"/>
+              <w:jc w:val="both"/>
+            </w:pPr>
+            <w:r>
+              <w:rPr>
+                <w:rFonts w:ascii="Calibri" w:hAnsi="Calibri"/>
+                <w:b/>
+                <w:color w:val="76927A"/>
+              </w:rPr>
+              <w:t xml:space="preserve">• </w:t>
+            </w:r>
+            <w:r>
+              <w:rPr>
+                <w:rFonts w:ascii="Calibri" w:hAnsi="Calibri"/>
+                <w:b/>
+                <w:color w:val="566B56"/>
+              </w:rPr>
+              <w:t xml:space="preserve">Productividad laboral: </w:t>
+            </w:r>
+            <w:r>
+              <w:rPr>
+                <w:rFonts w:ascii="Calibri" w:hAnsi="Calibri"/>
+                <w:color w:val="2F3A30"/>
+                <w:sz w:val="19"/>
+              </w:rPr>
+              <w:t>Relación entre producción y factor trabajo</w:t>
+            </w:r>
+          </w:p>
+          <w:p>
+            <w:pPr>
+              <w:spacing w:before="60" w:after="40" w:line="276" w:lineRule="auto"/>
+              <w:ind w:left="360" w:hanging="216"/>
+              <w:jc w:val="both"/>
+            </w:pPr>
+            <w:r>
+              <w:rPr>
+                <w:rFonts w:ascii="Calibri" w:hAnsi="Calibri"/>
+                <w:b/>
+                <w:color w:val="76927A"/>
+              </w:rPr>
+              <w:t xml:space="preserve">• </w:t>
+            </w:r>
+            <w:r>
+              <w:rPr>
+                <w:rFonts w:ascii="Calibri" w:hAnsi="Calibri"/>
+                <w:b/>
+                <w:color w:val="566B56"/>
+              </w:rPr>
+              <w:t xml:space="preserve">Capital humano: </w:t>
+            </w:r>
+            <w:r>
+              <w:rPr>
+                <w:rFonts w:ascii="Calibri" w:hAnsi="Calibri"/>
+                <w:color w:val="2F3A30"/>
+                <w:sz w:val="19"/>
+              </w:rPr>
+              <w:t>Formación, experiencia y habilidades de los trabajadores</w:t>
+            </w:r>
+          </w:p>
+          <w:p>
+            <w:pPr>
+              <w:spacing w:before="60" w:after="40" w:line="276" w:lineRule="auto"/>
+              <w:ind w:left="360" w:hanging="216"/>
+              <w:jc w:val="both"/>
+            </w:pPr>
+            <w:r>
+              <w:rPr>
+                <w:rFonts w:ascii="Calibri" w:hAnsi="Calibri"/>
+                <w:b/>
+                <w:color w:val="76927A"/>
+              </w:rPr>
+              <w:t xml:space="preserve">• </w:t>
+            </w:r>
+            <w:r>
+              <w:rPr>
+                <w:rFonts w:ascii="Calibri" w:hAnsi="Calibri"/>
+                <w:b/>
+                <w:color w:val="566B56"/>
+              </w:rPr>
+              <w:t xml:space="preserve">Oferta de trabajo: </w:t>
+            </w:r>
+            <w:r>
+              <w:rPr>
+                <w:rFonts w:ascii="Calibri" w:hAnsi="Calibri"/>
+                <w:color w:val="2F3A30"/>
+                <w:sz w:val="19"/>
+              </w:rPr>
+              <w:t>Cantidad de trabajo que los individuos están dispuestos a ofrecer</w:t>
+            </w:r>
+          </w:p>
+          <w:p>
+            <w:pPr>
+              <w:spacing w:before="60" w:after="40" w:line="276" w:lineRule="auto"/>
+              <w:ind w:left="360" w:hanging="216"/>
+              <w:jc w:val="both"/>
+            </w:pPr>
+            <w:r>
+              <w:rPr>
+                <w:rFonts w:ascii="Calibri" w:hAnsi="Calibri"/>
+                <w:b/>
+                <w:color w:val="76927A"/>
+              </w:rPr>
+              <w:t xml:space="preserve">• </w:t>
+            </w:r>
+            <w:r>
+              <w:rPr>
+                <w:rFonts w:ascii="Calibri" w:hAnsi="Calibri"/>
+                <w:b/>
+                <w:color w:val="566B56"/>
+              </w:rPr>
+              <w:t xml:space="preserve">Demanda de trabajo: </w:t>
+            </w:r>
+            <w:r>
+              <w:rPr>
+                <w:rFonts w:ascii="Calibri" w:hAnsi="Calibri"/>
+                <w:color w:val="2F3A30"/>
+                <w:sz w:val="19"/>
+              </w:rPr>
+              <w:t>Cantidad de trabajo que las empresas desean contratar</w:t>
+            </w:r>
+          </w:p>
+          <w:p>
+            <w:pPr>
+              <w:spacing w:before="60" w:after="40" w:line="276" w:lineRule="auto"/>
+              <w:ind w:left="360" w:hanging="216"/>
+              <w:jc w:val="both"/>
+            </w:pPr>
+            <w:r>
+              <w:rPr>
+                <w:rFonts w:ascii="Calibri" w:hAnsi="Calibri"/>
+                <w:b/>
+                <w:color w:val="76927A"/>
+              </w:rPr>
+              <w:t xml:space="preserve">• </w:t>
+            </w:r>
+            <w:r>
+              <w:rPr>
+                <w:rFonts w:ascii="Calibri" w:hAnsi="Calibri"/>
+                <w:b/>
+                <w:color w:val="566B56"/>
+              </w:rPr>
+              <w:t xml:space="preserve">Efecto sustitución: </w:t>
+            </w:r>
+            <w:r>
+              <w:rPr>
+                <w:rFonts w:ascii="Calibri" w:hAnsi="Calibri"/>
+                <w:color w:val="2F3A30"/>
+                <w:sz w:val="19"/>
+              </w:rPr>
+              <w:t>Aumento de oferta laboral ante subidas salariales (salarios bajos)</w:t>
+            </w:r>
+          </w:p>
+          <w:p>
+            <w:pPr>
+              <w:spacing w:before="60" w:after="40" w:line="276" w:lineRule="auto"/>
+              <w:ind w:left="360" w:hanging="216"/>
+              <w:jc w:val="both"/>
+            </w:pPr>
+            <w:r>
+              <w:rPr>
+                <w:rFonts w:ascii="Calibri" w:hAnsi="Calibri"/>
+                <w:b/>
+                <w:color w:val="76927A"/>
+              </w:rPr>
+              <w:t xml:space="preserve">• </w:t>
+            </w:r>
+            <w:r>
+              <w:rPr>
+                <w:rFonts w:ascii="Calibri" w:hAnsi="Calibri"/>
+                <w:b/>
+                <w:color w:val="566B56"/>
+              </w:rPr>
+              <w:t xml:space="preserve">Efecto renta: </w:t>
+            </w:r>
+            <w:r>
+              <w:rPr>
+                <w:rFonts w:ascii="Calibri" w:hAnsi="Calibri"/>
+                <w:color w:val="2F3A30"/>
+                <w:sz w:val="19"/>
+              </w:rPr>
+              <w:t>Disminución de oferta laboral ante subidas salariales (salarios altos)</w:t>
+            </w:r>
+          </w:p>
+          <w:p>
+            <w:pPr>
+              <w:spacing w:before="60" w:after="40" w:line="276" w:lineRule="auto"/>
+              <w:ind w:left="360" w:hanging="216"/>
+              <w:jc w:val="both"/>
+            </w:pPr>
+            <w:r>
+              <w:rPr>
+                <w:rFonts w:ascii="Calibri" w:hAnsi="Calibri"/>
+                <w:b/>
+                <w:color w:val="76927A"/>
+              </w:rPr>
+              <w:t xml:space="preserve">• </w:t>
+            </w:r>
+            <w:r>
+              <w:rPr>
+                <w:rFonts w:ascii="Calibri" w:hAnsi="Calibri"/>
+                <w:b/>
+                <w:color w:val="566B56"/>
+              </w:rPr>
+              <w:t xml:space="preserve">Negociación colectiva: </w:t>
+            </w:r>
+            <w:r>
+              <w:rPr>
+                <w:rFonts w:ascii="Calibri" w:hAnsi="Calibri"/>
+                <w:color w:val="2F3A30"/>
+                <w:sz w:val="19"/>
+              </w:rPr>
+              <w:t>Proceso de negociación entre empleadores y sindicatos</w:t>
+            </w:r>
+          </w:p>
+          <w:p>
+            <w:pPr>
+              <w:spacing w:before="60" w:after="40" w:line="276" w:lineRule="auto"/>
+              <w:ind w:left="360" w:hanging="216"/>
+              <w:jc w:val="both"/>
+            </w:pPr>
+            <w:r>
+              <w:rPr>
+                <w:rFonts w:ascii="Calibri" w:hAnsi="Calibri"/>
+                <w:b/>
+                <w:color w:val="76927A"/>
+              </w:rPr>
+              <w:t xml:space="preserve">• </w:t>
+            </w:r>
+            <w:r>
+              <w:rPr>
+                <w:rFonts w:ascii="Calibri" w:hAnsi="Calibri"/>
+                <w:b/>
+                <w:color w:val="566B56"/>
+              </w:rPr>
+              <w:t xml:space="preserve">Salario de reserva: </w:t>
+            </w:r>
+            <w:r>
+              <w:rPr>
+                <w:rFonts w:ascii="Calibri" w:hAnsi="Calibri"/>
+                <w:color w:val="2F3A30"/>
+                <w:sz w:val="19"/>
+              </w:rPr>
+              <w:t>Salario mínimo aceptable por los trabajadores</w:t>
+            </w:r>
+          </w:p>
+          <w:p>
+            <w:pPr>
+              <w:spacing w:before="60" w:after="40" w:line="276" w:lineRule="auto"/>
+              <w:ind w:left="360" w:hanging="216"/>
+              <w:jc w:val="both"/>
+            </w:pPr>
+            <w:r>
+              <w:rPr>
+                <w:rFonts w:ascii="Calibri" w:hAnsi="Calibri"/>
+                <w:b/>
+                <w:color w:val="76927A"/>
+              </w:rPr>
+              <w:t xml:space="preserve">• </w:t>
+            </w:r>
+            <w:r>
+              <w:rPr>
+                <w:rFonts w:ascii="Calibri" w:hAnsi="Calibri"/>
+                <w:b/>
+                <w:color w:val="566B56"/>
+              </w:rPr>
+              <w:t xml:space="preserve">Fallos del mercado: </w:t>
+            </w:r>
+            <w:r>
+              <w:rPr>
+                <w:rFonts w:ascii="Calibri" w:hAnsi="Calibri"/>
+                <w:color w:val="2F3A30"/>
+                <w:sz w:val="19"/>
+              </w:rPr>
+              <w:t>Situaciones donde el mercado no produce resultados eficientes</w:t>
+            </w:r>
+          </w:p>
+          <w:p>
+            <w:pPr>
+              <w:spacing w:before="60" w:after="40" w:line="276" w:lineRule="auto"/>
+              <w:ind w:left="360" w:hanging="216"/>
+              <w:jc w:val="both"/>
+            </w:pPr>
+            <w:r>
+              <w:rPr>
+                <w:rFonts w:ascii="Calibri" w:hAnsi="Calibri"/>
+                <w:b/>
+                <w:color w:val="76927A"/>
+              </w:rPr>
+              <w:t xml:space="preserve">• </w:t>
+            </w:r>
+            <w:r>
+              <w:rPr>
+                <w:rFonts w:ascii="Calibri" w:hAnsi="Calibri"/>
+                <w:b/>
+                <w:color w:val="566B56"/>
+              </w:rPr>
+              <w:t xml:space="preserve">Desempleo friccional: </w:t>
+            </w:r>
+            <w:r>
+              <w:rPr>
+                <w:rFonts w:ascii="Calibri" w:hAnsi="Calibri"/>
+                <w:color w:val="2F3A30"/>
+                <w:sz w:val="19"/>
+              </w:rPr>
+              <w:t>Desempleo temporal debido a procesos de búsqueda y emparejamiento</w:t>
+            </w:r>
+          </w:p>
+          <w:p>
+            <w:pPr>
+              <w:spacing w:before="60" w:after="40" w:line="276" w:lineRule="auto"/>
+              <w:ind w:left="360" w:hanging="216"/>
+              <w:jc w:val="both"/>
+            </w:pPr>
+            <w:r>
+              <w:rPr>
+                <w:rFonts w:ascii="Calibri" w:hAnsi="Calibri"/>
+                <w:b/>
+                <w:color w:val="76927A"/>
+              </w:rPr>
+              <w:t xml:space="preserve">• </w:t>
+            </w:r>
+            <w:r>
+              <w:rPr>
+                <w:rFonts w:ascii="Calibri" w:hAnsi="Calibri"/>
+                <w:b/>
+                <w:color w:val="566B56"/>
+              </w:rPr>
+              <w:t xml:space="preserve">Desempleo estructural: </w:t>
+            </w:r>
+            <w:r>
+              <w:rPr>
+                <w:rFonts w:ascii="Calibri" w:hAnsi="Calibri"/>
+                <w:color w:val="2F3A30"/>
+                <w:sz w:val="19"/>
+              </w:rPr>
+              <w:t>Desempleo por desajuste entre habilidades ofrecidas y demandadas</w:t>
+            </w:r>
+          </w:p>
+          <w:p>
+            <w:pPr>
+              <w:spacing w:before="60" w:after="40" w:line="276" w:lineRule="auto"/>
+              <w:ind w:left="360" w:hanging="216"/>
+              <w:jc w:val="both"/>
+            </w:pPr>
+            <w:r>
+              <w:rPr>
+                <w:rFonts w:ascii="Calibri" w:hAnsi="Calibri"/>
+                <w:b/>
+                <w:color w:val="76927A"/>
+              </w:rPr>
+              <w:t xml:space="preserve">• </w:t>
+            </w:r>
+            <w:r>
+              <w:rPr>
+                <w:rFonts w:ascii="Calibri" w:hAnsi="Calibri"/>
+                <w:b/>
+                <w:color w:val="566B56"/>
+              </w:rPr>
+              <w:t xml:space="preserve">Desempleo cíclico: </w:t>
+            </w:r>
+            <w:r>
+              <w:rPr>
+                <w:rFonts w:ascii="Calibri" w:hAnsi="Calibri"/>
+                <w:color w:val="2F3A30"/>
+                <w:sz w:val="19"/>
+              </w:rPr>
+              <w:t>Desempleo vinculado a fluctuaciones del ciclo económico</w:t>
+            </w:r>
+          </w:p>
+          <w:p>
+            <w:pPr>
+              <w:spacing w:before="60" w:after="40" w:line="276" w:lineRule="auto"/>
+              <w:ind w:left="360" w:hanging="216"/>
+              <w:jc w:val="both"/>
+            </w:pPr>
+            <w:r>
+              <w:rPr>
+                <w:rFonts w:ascii="Calibri" w:hAnsi="Calibri"/>
+                <w:b/>
+                <w:color w:val="76927A"/>
+              </w:rPr>
+              <w:t xml:space="preserve">• </w:t>
+            </w:r>
+            <w:r>
+              <w:rPr>
+                <w:rFonts w:ascii="Calibri" w:hAnsi="Calibri"/>
+                <w:b/>
+                <w:color w:val="566B56"/>
+              </w:rPr>
+              <w:t xml:space="preserve">Desempleo estacional: </w:t>
+            </w:r>
+            <w:r>
+              <w:rPr>
+                <w:rFonts w:ascii="Calibri" w:hAnsi="Calibri"/>
+                <w:color w:val="2F3A30"/>
+                <w:sz w:val="19"/>
+              </w:rPr>
+              <w:t>Desempleo por variaciones regulares en demanda sectorial</w:t>
+            </w:r>
+          </w:p>
+          <w:p>
+            <w:pPr>
+              <w:spacing w:before="60" w:after="40" w:line="276" w:lineRule="auto"/>
+              <w:ind w:left="360" w:hanging="216"/>
+              <w:jc w:val="both"/>
+            </w:pPr>
+            <w:r>
+              <w:rPr>
+                <w:rFonts w:ascii="Calibri" w:hAnsi="Calibri"/>
+                <w:b/>
+                <w:color w:val="76927A"/>
+              </w:rPr>
+              <w:t xml:space="preserve">• </w:t>
+            </w:r>
+            <w:r>
+              <w:rPr>
+                <w:rFonts w:ascii="Calibri" w:hAnsi="Calibri"/>
+                <w:b/>
+                <w:color w:val="566B56"/>
+              </w:rPr>
+              <w:t xml:space="preserve">Skill mismatch: </w:t>
+            </w:r>
+            <w:r>
+              <w:rPr>
+                <w:rFonts w:ascii="Calibri" w:hAnsi="Calibri"/>
+                <w:color w:val="2F3A30"/>
+                <w:sz w:val="19"/>
+              </w:rPr>
+              <w:t>Desajuste entre cualificaciones demandadas y ofrecidas</w:t>
+            </w:r>
+          </w:p>
+          <w:p>
+            <w:pPr>
+              <w:spacing w:before="60" w:after="40" w:line="276" w:lineRule="auto"/>
+              <w:ind w:left="360" w:hanging="216"/>
+              <w:jc w:val="both"/>
+            </w:pPr>
+            <w:r>
+              <w:rPr>
+                <w:rFonts w:ascii="Calibri" w:hAnsi="Calibri"/>
+                <w:b/>
+                <w:color w:val="76927A"/>
+              </w:rPr>
+              <w:t xml:space="preserve">• </w:t>
+            </w:r>
+            <w:r>
+              <w:rPr>
+                <w:rFonts w:ascii="Calibri" w:hAnsi="Calibri"/>
+                <w:b/>
+                <w:color w:val="566B56"/>
+              </w:rPr>
+              <w:t xml:space="preserve">Histéresis: </w:t>
+            </w:r>
+            <w:r>
+              <w:rPr>
+                <w:rFonts w:ascii="Calibri" w:hAnsi="Calibri"/>
+                <w:color w:val="2F3A30"/>
+                <w:sz w:val="19"/>
+              </w:rPr>
+              <w:t>Tendencia del desempleo a persistir tras desaparecer sus causas originales</w:t>
+            </w:r>
+          </w:p>
+          <w:p>
+            <w:pPr>
+              <w:spacing w:before="60" w:after="40" w:line="276" w:lineRule="auto"/>
+              <w:ind w:left="360" w:hanging="216"/>
+              <w:jc w:val="both"/>
+            </w:pPr>
+            <w:r>
+              <w:rPr>
+                <w:rFonts w:ascii="Calibri" w:hAnsi="Calibri"/>
+                <w:b/>
+                <w:color w:val="76927A"/>
+              </w:rPr>
+              <w:t xml:space="preserve">• </w:t>
+            </w:r>
+            <w:r>
+              <w:rPr>
+                <w:rFonts w:ascii="Calibri" w:hAnsi="Calibri"/>
+                <w:b/>
+                <w:color w:val="566B56"/>
+              </w:rPr>
+              <w:t xml:space="preserve">NAIRU: </w:t>
+            </w:r>
+            <w:r>
+              <w:rPr>
+                <w:rFonts w:ascii="Calibri" w:hAnsi="Calibri"/>
+                <w:color w:val="2F3A30"/>
+                <w:sz w:val="19"/>
+              </w:rPr>
+              <w:t>Tasa de desempleo no aceleradora de la inflación (tasa natural)</w:t>
+            </w:r>
+          </w:p>
+          <w:p>
+            <w:pPr>
+              <w:spacing w:before="60" w:after="40" w:line="276" w:lineRule="auto"/>
+              <w:ind w:left="360" w:hanging="216"/>
+              <w:jc w:val="both"/>
+            </w:pPr>
+            <w:r>
+              <w:rPr>
+                <w:rFonts w:ascii="Calibri" w:hAnsi="Calibri"/>
+                <w:b/>
+                <w:color w:val="76927A"/>
+              </w:rPr>
+              <w:t xml:space="preserve">• </w:t>
+            </w:r>
+            <w:r>
+              <w:rPr>
+                <w:rFonts w:ascii="Calibri" w:hAnsi="Calibri"/>
+                <w:b/>
+                <w:color w:val="566B56"/>
+              </w:rPr>
+              <w:t xml:space="preserve">Curva de Phillips: </w:t>
+            </w:r>
+            <w:r>
+              <w:rPr>
+                <w:rFonts w:ascii="Calibri" w:hAnsi="Calibri"/>
+                <w:color w:val="2F3A30"/>
+                <w:sz w:val="19"/>
+              </w:rPr>
+              <w:t>Relación entre desempleo e inflación</w:t>
+            </w:r>
+          </w:p>
+          <w:p>
+            <w:pPr>
+              <w:spacing w:before="60" w:after="40" w:line="276" w:lineRule="auto"/>
+              <w:ind w:left="360" w:hanging="216"/>
+              <w:jc w:val="both"/>
+            </w:pPr>
+            <w:r>
+              <w:rPr>
+                <w:rFonts w:ascii="Calibri" w:hAnsi="Calibri"/>
+                <w:b/>
+                <w:color w:val="76927A"/>
+              </w:rPr>
+              <w:t xml:space="preserve">• </w:t>
+            </w:r>
+            <w:r>
+              <w:rPr>
+                <w:rFonts w:ascii="Calibri" w:hAnsi="Calibri"/>
+                <w:b/>
+                <w:color w:val="566B56"/>
+              </w:rPr>
+              <w:t xml:space="preserve">Curva de Beveridge: </w:t>
+            </w:r>
+            <w:r>
+              <w:rPr>
+                <w:rFonts w:ascii="Calibri" w:hAnsi="Calibri"/>
+                <w:color w:val="2F3A30"/>
+                <w:sz w:val="19"/>
+              </w:rPr>
+              <w:t>Relación entre tasa de vacantes y tasa de desempleo</w:t>
+            </w:r>
+          </w:p>
+          <w:p>
+            <w:pPr>
+              <w:spacing w:before="60" w:after="40" w:line="276" w:lineRule="auto"/>
+              <w:ind w:left="360" w:hanging="216"/>
+              <w:jc w:val="both"/>
+            </w:pPr>
+            <w:r>
+              <w:rPr>
+                <w:rFonts w:ascii="Calibri" w:hAnsi="Calibri"/>
+                <w:b/>
+                <w:color w:val="76927A"/>
+              </w:rPr>
+              <w:t xml:space="preserve">• </w:t>
+            </w:r>
+            <w:r>
+              <w:rPr>
+                <w:rFonts w:ascii="Calibri" w:hAnsi="Calibri"/>
+                <w:b/>
+                <w:color w:val="566B56"/>
+              </w:rPr>
+              <w:t xml:space="preserve">Función de emparejamiento: </w:t>
+            </w:r>
+            <w:r>
+              <w:rPr>
+                <w:rFonts w:ascii="Calibri" w:hAnsi="Calibri"/>
+                <w:color w:val="2F3A30"/>
+                <w:sz w:val="19"/>
+              </w:rPr>
+              <w:t>Relación entre contrataciones, desempleados, vacantes y eficiencia</w:t>
+            </w:r>
+          </w:p>
+          <w:p>
+            <w:pPr>
+              <w:spacing w:before="60" w:after="40" w:line="276" w:lineRule="auto"/>
+              <w:ind w:left="360" w:hanging="216"/>
+              <w:jc w:val="both"/>
+            </w:pPr>
+            <w:r>
+              <w:rPr>
+                <w:rFonts w:ascii="Calibri" w:hAnsi="Calibri"/>
+                <w:b/>
+                <w:color w:val="76927A"/>
+              </w:rPr>
+              <w:t xml:space="preserve">• </w:t>
+            </w:r>
+            <w:r>
+              <w:rPr>
+                <w:rFonts w:ascii="Calibri" w:hAnsi="Calibri"/>
+                <w:b/>
+                <w:color w:val="566B56"/>
+              </w:rPr>
+              <w:t xml:space="preserve">Eficiencia del emparejamiento: </w:t>
+            </w:r>
+            <w:r>
+              <w:rPr>
+                <w:rFonts w:ascii="Calibri" w:hAnsi="Calibri"/>
+                <w:color w:val="2F3A30"/>
+                <w:sz w:val="19"/>
+              </w:rPr>
+              <w:t>Capacidad del mercado laboral para conectar trabajadores con empleos</w:t>
+            </w:r>
+          </w:p>
+        </w:tc>
+      </w:tr>
+    </w:tbl>
+    <w:p>
+      <w:pPr>
+        <w:spacing w:before="0" w:after="160"/>
+      </w:pPr>
+    </w:p>
+    <w:p>
+      <w:pPr>
+        <w:pStyle w:val="Heading1"/>
+        <w:keepNext/>
+        <w:spacing w:before="520" w:after="120"/>
+        <w:jc w:val="left"/>
+      </w:pPr>
+      <w:r>
+        <w:rPr>
+          <w:rFonts w:ascii="Poppins" w:hAnsi="Poppins"/>
+          <w:b/>
+          <w:color w:val="566B56"/>
+          <w:sz w:val="30"/>
+        </w:rPr>
+        <w:t>PREGUNTAS PARA EL DEBATE</w:t>
+      </w:r>
+    </w:p>
+    <w:p>
       <w:pPr>
         <w:spacing w:after="90" w:line="276" w:lineRule="auto"/>
         <w:ind w:left="0" w:firstLine="0"/>
@@ -12203,866 +13221,10 @@
       <w:r>
         <w:rPr>
           <w:rFonts w:ascii="Calibri" w:hAnsi="Calibri"/>
-          <w:b/>
-          <w:color w:val="566B56"/>
+          <w:color w:val="2F3A30"/>
           <w:sz w:val="21"/>
         </w:rPr>
-        <w:t>Conceptos clave del Tema 1 completo:</w:t>
-      </w:r>
-    </w:p>
-    <w:p>
-      <w:pPr>
-        <w:spacing w:after="70"/>
-        <w:ind w:left="504" w:hanging="259"/>
-        <w:jc w:val="both"/>
-      </w:pPr>
-      <w:r>
-        <w:rPr>
-          <w:rFonts w:ascii="Calibri" w:hAnsi="Calibri"/>
-          <w:b/>
-          <w:color w:val="76927A"/>
-        </w:rPr>
-        <w:t xml:space="preserve">•  </w:t>
-      </w:r>
-      <w:r>
-        <w:rPr>
-          <w:rFonts w:ascii="Calibri" w:hAnsi="Calibri"/>
-          <w:b/>
-          <w:color w:val="566B56"/>
-        </w:rPr>
-        <w:t xml:space="preserve">Mercado de trabajo: </w:t>
-      </w:r>
-      <w:r>
-        <w:rPr>
-          <w:rFonts w:ascii="Calibri" w:hAnsi="Calibri"/>
-          <w:color w:val="2F3A30"/>
-        </w:rPr>
-        <w:t>Ámbito de interacción entre oferta y demanda laboral</w:t>
-      </w:r>
-    </w:p>
-    <w:p>
-      <w:pPr>
-        <w:spacing w:after="70"/>
-        <w:ind w:left="504" w:hanging="259"/>
-        <w:jc w:val="both"/>
-      </w:pPr>
-      <w:r>
-        <w:rPr>
-          <w:rFonts w:ascii="Calibri" w:hAnsi="Calibri"/>
-          <w:b/>
-          <w:color w:val="76927A"/>
-        </w:rPr>
-        <w:t xml:space="preserve">•  </w:t>
-      </w:r>
-      <w:r>
-        <w:rPr>
-          <w:rFonts w:ascii="Calibri" w:hAnsi="Calibri"/>
-          <w:b/>
-          <w:color w:val="566B56"/>
-        </w:rPr>
-        <w:t xml:space="preserve">Población activa: </w:t>
-      </w:r>
-      <w:r>
-        <w:rPr>
-          <w:rFonts w:ascii="Calibri" w:hAnsi="Calibri"/>
-          <w:color w:val="2F3A30"/>
-        </w:rPr>
-        <w:t>Ocupados + desempleados que buscan empleo</w:t>
-      </w:r>
-    </w:p>
-    <w:p>
-      <w:pPr>
-        <w:spacing w:after="70"/>
-        <w:ind w:left="504" w:hanging="259"/>
-        <w:jc w:val="both"/>
-      </w:pPr>
-      <w:r>
-        <w:rPr>
-          <w:rFonts w:ascii="Calibri" w:hAnsi="Calibri"/>
-          <w:b/>
-          <w:color w:val="76927A"/>
-        </w:rPr>
-        <w:t xml:space="preserve">•  </w:t>
-      </w:r>
-      <w:r>
-        <w:rPr>
-          <w:rFonts w:ascii="Calibri" w:hAnsi="Calibri"/>
-          <w:b/>
-          <w:color w:val="566B56"/>
-        </w:rPr>
-        <w:t xml:space="preserve">Tasa de actividad: </w:t>
-      </w:r>
-      <w:r>
-        <w:rPr>
-          <w:rFonts w:ascii="Calibri" w:hAnsi="Calibri"/>
-          <w:color w:val="2F3A30"/>
-        </w:rPr>
-        <w:t>Proporción de población que participa en el mercado laboral</w:t>
-      </w:r>
-    </w:p>
-    <w:p>
-      <w:pPr>
-        <w:spacing w:after="70"/>
-        <w:ind w:left="504" w:hanging="259"/>
-        <w:jc w:val="both"/>
-      </w:pPr>
-      <w:r>
-        <w:rPr>
-          <w:rFonts w:ascii="Calibri" w:hAnsi="Calibri"/>
-          <w:b/>
-          <w:color w:val="76927A"/>
-        </w:rPr>
-        <w:t xml:space="preserve">•  </w:t>
-      </w:r>
-      <w:r>
-        <w:rPr>
-          <w:rFonts w:ascii="Calibri" w:hAnsi="Calibri"/>
-          <w:b/>
-          <w:color w:val="566B56"/>
-        </w:rPr>
-        <w:t xml:space="preserve">Tasa de desempleo: </w:t>
-      </w:r>
-      <w:r>
-        <w:rPr>
-          <w:rFonts w:ascii="Calibri" w:hAnsi="Calibri"/>
-          <w:color w:val="2F3A30"/>
-        </w:rPr>
-        <w:t>Proporción de población activa sin empleo que busca trabajo</w:t>
-      </w:r>
-    </w:p>
-    <w:p>
-      <w:pPr>
-        <w:spacing w:after="70"/>
-        <w:ind w:left="504" w:hanging="259"/>
-        <w:jc w:val="both"/>
-      </w:pPr>
-      <w:r>
-        <w:rPr>
-          <w:rFonts w:ascii="Calibri" w:hAnsi="Calibri"/>
-          <w:b/>
-          <w:color w:val="76927A"/>
-        </w:rPr>
-        <w:t xml:space="preserve">•  </w:t>
-      </w:r>
-      <w:r>
-        <w:rPr>
-          <w:rFonts w:ascii="Calibri" w:hAnsi="Calibri"/>
-          <w:b/>
-          <w:color w:val="566B56"/>
-        </w:rPr>
-        <w:t xml:space="preserve">Tasa de empleo: </w:t>
-      </w:r>
-      <w:r>
-        <w:rPr>
-          <w:rFonts w:ascii="Calibri" w:hAnsi="Calibri"/>
-          <w:color w:val="2F3A30"/>
-        </w:rPr>
-        <w:t>Proporción de población en edad de trabajar que está empleada</w:t>
-      </w:r>
-    </w:p>
-    <w:p>
-      <w:pPr>
-        <w:spacing w:after="70"/>
-        <w:ind w:left="504" w:hanging="259"/>
-        <w:jc w:val="both"/>
-      </w:pPr>
-      <w:r>
-        <w:rPr>
-          <w:rFonts w:ascii="Calibri" w:hAnsi="Calibri"/>
-          <w:b/>
-          <w:color w:val="76927A"/>
-        </w:rPr>
-        <w:t xml:space="preserve">•  </w:t>
-      </w:r>
-      <w:r>
-        <w:rPr>
-          <w:rFonts w:ascii="Calibri" w:hAnsi="Calibri"/>
-          <w:b/>
-          <w:color w:val="566B56"/>
-        </w:rPr>
-        <w:t xml:space="preserve">PIB: </w:t>
-      </w:r>
-      <w:r>
-        <w:rPr>
-          <w:rFonts w:ascii="Calibri" w:hAnsi="Calibri"/>
-          <w:color w:val="2F3A30"/>
-        </w:rPr>
-        <w:t>Valor monetario total de bienes y servicios finales producidos en un país</w:t>
-      </w:r>
-    </w:p>
-    <w:p>
-      <w:pPr>
-        <w:spacing w:after="70"/>
-        <w:ind w:left="504" w:hanging="259"/>
-        <w:jc w:val="both"/>
-      </w:pPr>
-      <w:r>
-        <w:rPr>
-          <w:rFonts w:ascii="Calibri" w:hAnsi="Calibri"/>
-          <w:b/>
-          <w:color w:val="76927A"/>
-        </w:rPr>
-        <w:t xml:space="preserve">•  </w:t>
-      </w:r>
-      <w:r>
-        <w:rPr>
-          <w:rFonts w:ascii="Calibri" w:hAnsi="Calibri"/>
-          <w:b/>
-          <w:color w:val="566B56"/>
-        </w:rPr>
-        <w:t xml:space="preserve">Valor Añadido Bruto (VAB): </w:t>
-      </w:r>
-      <w:r>
-        <w:rPr>
-          <w:rFonts w:ascii="Calibri" w:hAnsi="Calibri"/>
-          <w:color w:val="2F3A30"/>
-        </w:rPr>
-        <w:t>Valor agregado en cada etapa de producción</w:t>
-      </w:r>
-    </w:p>
-    <w:p>
-      <w:pPr>
-        <w:spacing w:after="70"/>
-        <w:ind w:left="504" w:hanging="259"/>
-        <w:jc w:val="both"/>
-      </w:pPr>
-      <w:r>
-        <w:rPr>
-          <w:rFonts w:ascii="Calibri" w:hAnsi="Calibri"/>
-          <w:b/>
-          <w:color w:val="76927A"/>
-        </w:rPr>
-        <w:t xml:space="preserve">•  </w:t>
-      </w:r>
-      <w:r>
-        <w:rPr>
-          <w:rFonts w:ascii="Calibri" w:hAnsi="Calibri"/>
-          <w:b/>
-          <w:color w:val="566B56"/>
-        </w:rPr>
-        <w:t xml:space="preserve">Productividad: </w:t>
-      </w:r>
-      <w:r>
-        <w:rPr>
-          <w:rFonts w:ascii="Calibri" w:hAnsi="Calibri"/>
-          <w:color w:val="2F3A30"/>
-        </w:rPr>
-        <w:t>Eficiencia en el uso de factores productivos</w:t>
-      </w:r>
-    </w:p>
-    <w:p>
-      <w:pPr>
-        <w:spacing w:after="70"/>
-        <w:ind w:left="504" w:hanging="259"/>
-        <w:jc w:val="both"/>
-      </w:pPr>
-      <w:r>
-        <w:rPr>
-          <w:rFonts w:ascii="Calibri" w:hAnsi="Calibri"/>
-          <w:b/>
-          <w:color w:val="76927A"/>
-        </w:rPr>
-        <w:t xml:space="preserve">•  </w:t>
-      </w:r>
-      <w:r>
-        <w:rPr>
-          <w:rFonts w:ascii="Calibri" w:hAnsi="Calibri"/>
-          <w:b/>
-          <w:color w:val="566B56"/>
-        </w:rPr>
-        <w:t xml:space="preserve">Productividad laboral: </w:t>
-      </w:r>
-      <w:r>
-        <w:rPr>
-          <w:rFonts w:ascii="Calibri" w:hAnsi="Calibri"/>
-          <w:color w:val="2F3A30"/>
-        </w:rPr>
-        <w:t>Relación entre producción y factor trabajo</w:t>
-      </w:r>
-    </w:p>
-    <w:p>
-      <w:pPr>
-        <w:spacing w:after="70"/>
-        <w:ind w:left="504" w:hanging="259"/>
-        <w:jc w:val="both"/>
-      </w:pPr>
-      <w:r>
-        <w:rPr>
-          <w:rFonts w:ascii="Calibri" w:hAnsi="Calibri"/>
-          <w:b/>
-          <w:color w:val="76927A"/>
-        </w:rPr>
-        <w:t xml:space="preserve">•  </w:t>
-      </w:r>
-      <w:r>
-        <w:rPr>
-          <w:rFonts w:ascii="Calibri" w:hAnsi="Calibri"/>
-          <w:b/>
-          <w:color w:val="566B56"/>
-        </w:rPr>
-        <w:t xml:space="preserve">Capital humano: </w:t>
-      </w:r>
-      <w:r>
-        <w:rPr>
-          <w:rFonts w:ascii="Calibri" w:hAnsi="Calibri"/>
-          <w:color w:val="2F3A30"/>
-        </w:rPr>
-        <w:t>Formación, experiencia y habilidades de los trabajadores</w:t>
-      </w:r>
-    </w:p>
-    <w:p>
-      <w:pPr>
-        <w:spacing w:after="70"/>
-        <w:ind w:left="504" w:hanging="259"/>
-        <w:jc w:val="both"/>
-      </w:pPr>
-      <w:r>
-        <w:rPr>
-          <w:rFonts w:ascii="Calibri" w:hAnsi="Calibri"/>
-          <w:b/>
-          <w:color w:val="76927A"/>
-        </w:rPr>
-        <w:t xml:space="preserve">•  </w:t>
-      </w:r>
-      <w:r>
-        <w:rPr>
-          <w:rFonts w:ascii="Calibri" w:hAnsi="Calibri"/>
-          <w:b/>
-          <w:color w:val="566B56"/>
-        </w:rPr>
-        <w:t xml:space="preserve">Oferta de trabajo: </w:t>
-      </w:r>
-      <w:r>
-        <w:rPr>
-          <w:rFonts w:ascii="Calibri" w:hAnsi="Calibri"/>
-          <w:color w:val="2F3A30"/>
-        </w:rPr>
-        <w:t>Cantidad de trabajo que los individuos están dispuestos a ofrecer</w:t>
-      </w:r>
-    </w:p>
-    <w:p>
-      <w:pPr>
-        <w:spacing w:after="70"/>
-        <w:ind w:left="504" w:hanging="259"/>
-        <w:jc w:val="both"/>
-      </w:pPr>
-      <w:r>
-        <w:rPr>
-          <w:rFonts w:ascii="Calibri" w:hAnsi="Calibri"/>
-          <w:b/>
-          <w:color w:val="76927A"/>
-        </w:rPr>
-        <w:t xml:space="preserve">•  </w:t>
-      </w:r>
-      <w:r>
-        <w:rPr>
-          <w:rFonts w:ascii="Calibri" w:hAnsi="Calibri"/>
-          <w:b/>
-          <w:color w:val="566B56"/>
-        </w:rPr>
-        <w:t xml:space="preserve">Demanda de trabajo: </w:t>
-      </w:r>
-      <w:r>
-        <w:rPr>
-          <w:rFonts w:ascii="Calibri" w:hAnsi="Calibri"/>
-          <w:color w:val="2F3A30"/>
-        </w:rPr>
-        <w:t>Cantidad de trabajo que las empresas desean contratar</w:t>
-      </w:r>
-    </w:p>
-    <w:p>
-      <w:pPr>
-        <w:spacing w:after="70"/>
-        <w:ind w:left="504" w:hanging="259"/>
-        <w:jc w:val="both"/>
-      </w:pPr>
-      <w:r>
-        <w:rPr>
-          <w:rFonts w:ascii="Calibri" w:hAnsi="Calibri"/>
-          <w:b/>
-          <w:color w:val="76927A"/>
-        </w:rPr>
-        <w:t xml:space="preserve">•  </w:t>
-      </w:r>
-      <w:r>
-        <w:rPr>
-          <w:rFonts w:ascii="Calibri" w:hAnsi="Calibri"/>
-          <w:b/>
-          <w:color w:val="566B56"/>
-        </w:rPr>
-        <w:t xml:space="preserve">Efecto sustitución: </w:t>
-      </w:r>
-      <w:r>
-        <w:rPr>
-          <w:rFonts w:ascii="Calibri" w:hAnsi="Calibri"/>
-          <w:color w:val="2F3A30"/>
-        </w:rPr>
-        <w:t>Aumento de oferta laboral ante subidas salariales (salarios bajos)</w:t>
-      </w:r>
-    </w:p>
-    <w:p>
-      <w:pPr>
-        <w:spacing w:after="70"/>
-        <w:ind w:left="504" w:hanging="259"/>
-        <w:jc w:val="both"/>
-      </w:pPr>
-      <w:r>
-        <w:rPr>
-          <w:rFonts w:ascii="Calibri" w:hAnsi="Calibri"/>
-          <w:b/>
-          <w:color w:val="76927A"/>
-        </w:rPr>
-        <w:t xml:space="preserve">•  </w:t>
-      </w:r>
-      <w:r>
-        <w:rPr>
-          <w:rFonts w:ascii="Calibri" w:hAnsi="Calibri"/>
-          <w:b/>
-          <w:color w:val="566B56"/>
-        </w:rPr>
-        <w:t xml:space="preserve">Efecto renta: </w:t>
-      </w:r>
-      <w:r>
-        <w:rPr>
-          <w:rFonts w:ascii="Calibri" w:hAnsi="Calibri"/>
-          <w:color w:val="2F3A30"/>
-        </w:rPr>
-        <w:t>Disminución de oferta laboral ante subidas salariales (salarios altos)</w:t>
-      </w:r>
-    </w:p>
-    <w:p>
-      <w:pPr>
-        <w:spacing w:after="70"/>
-        <w:ind w:left="504" w:hanging="259"/>
-        <w:jc w:val="both"/>
-      </w:pPr>
-      <w:r>
-        <w:rPr>
-          <w:rFonts w:ascii="Calibri" w:hAnsi="Calibri"/>
-          <w:b/>
-          <w:color w:val="76927A"/>
-        </w:rPr>
-        <w:t xml:space="preserve">•  </w:t>
-      </w:r>
-      <w:r>
-        <w:rPr>
-          <w:rFonts w:ascii="Calibri" w:hAnsi="Calibri"/>
-          <w:b/>
-          <w:color w:val="566B56"/>
-        </w:rPr>
-        <w:t xml:space="preserve">Negociación colectiva: </w:t>
-      </w:r>
-      <w:r>
-        <w:rPr>
-          <w:rFonts w:ascii="Calibri" w:hAnsi="Calibri"/>
-          <w:color w:val="2F3A30"/>
-        </w:rPr>
-        <w:t>Proceso de negociación entre empleadores y sindicatos</w:t>
-      </w:r>
-    </w:p>
-    <w:p>
-      <w:pPr>
-        <w:spacing w:after="70"/>
-        <w:ind w:left="504" w:hanging="259"/>
-        <w:jc w:val="both"/>
-      </w:pPr>
-      <w:r>
-        <w:rPr>
-          <w:rFonts w:ascii="Calibri" w:hAnsi="Calibri"/>
-          <w:b/>
-          <w:color w:val="76927A"/>
-        </w:rPr>
-        <w:t xml:space="preserve">•  </w:t>
-      </w:r>
-      <w:r>
-        <w:rPr>
-          <w:rFonts w:ascii="Calibri" w:hAnsi="Calibri"/>
-          <w:b/>
-          <w:color w:val="566B56"/>
-        </w:rPr>
-        <w:t xml:space="preserve">Salario de reserva: </w:t>
-      </w:r>
-      <w:r>
-        <w:rPr>
-          <w:rFonts w:ascii="Calibri" w:hAnsi="Calibri"/>
-          <w:color w:val="2F3A30"/>
-        </w:rPr>
-        <w:t>Salario mínimo aceptable por los trabajadores</w:t>
-      </w:r>
-    </w:p>
-    <w:p>
-      <w:pPr>
-        <w:spacing w:after="70"/>
-        <w:ind w:left="504" w:hanging="259"/>
-        <w:jc w:val="both"/>
-      </w:pPr>
-      <w:r>
-        <w:rPr>
-          <w:rFonts w:ascii="Calibri" w:hAnsi="Calibri"/>
-          <w:b/>
-          <w:color w:val="76927A"/>
-        </w:rPr>
-        <w:t xml:space="preserve">•  </w:t>
-      </w:r>
-      <w:r>
-        <w:rPr>
-          <w:rFonts w:ascii="Calibri" w:hAnsi="Calibri"/>
-          <w:b/>
-          <w:color w:val="566B56"/>
-        </w:rPr>
-        <w:t xml:space="preserve">Fallos del mercado: </w:t>
-      </w:r>
-      <w:r>
-        <w:rPr>
-          <w:rFonts w:ascii="Calibri" w:hAnsi="Calibri"/>
-          <w:color w:val="2F3A30"/>
-        </w:rPr>
-        <w:t>Situaciones donde el mercado no produce resultados eficientes</w:t>
-      </w:r>
-    </w:p>
-    <w:p>
-      <w:pPr>
-        <w:spacing w:after="70"/>
-        <w:ind w:left="504" w:hanging="259"/>
-        <w:jc w:val="both"/>
-      </w:pPr>
-      <w:r>
-        <w:rPr>
-          <w:rFonts w:ascii="Calibri" w:hAnsi="Calibri"/>
-          <w:b/>
-          <w:color w:val="76927A"/>
-        </w:rPr>
-        <w:t xml:space="preserve">•  </w:t>
-      </w:r>
-      <w:r>
-        <w:rPr>
-          <w:rFonts w:ascii="Calibri" w:hAnsi="Calibri"/>
-          <w:b/>
-          <w:color w:val="566B56"/>
-        </w:rPr>
-        <w:t xml:space="preserve">Desempleo friccional: </w:t>
-      </w:r>
-      <w:r>
-        <w:rPr>
-          <w:rFonts w:ascii="Calibri" w:hAnsi="Calibri"/>
-          <w:color w:val="2F3A30"/>
-        </w:rPr>
-        <w:t>Desempleo temporal debido a procesos de búsqueda y emparejamiento</w:t>
-      </w:r>
-    </w:p>
-    <w:p>
-      <w:pPr>
-        <w:spacing w:after="70"/>
-        <w:ind w:left="504" w:hanging="259"/>
-        <w:jc w:val="both"/>
-      </w:pPr>
-      <w:r>
-        <w:rPr>
-          <w:rFonts w:ascii="Calibri" w:hAnsi="Calibri"/>
-          <w:b/>
-          <w:color w:val="76927A"/>
-        </w:rPr>
-        <w:t xml:space="preserve">•  </w:t>
-      </w:r>
-      <w:r>
-        <w:rPr>
-          <w:rFonts w:ascii="Calibri" w:hAnsi="Calibri"/>
-          <w:b/>
-          <w:color w:val="566B56"/>
-        </w:rPr>
-        <w:t xml:space="preserve">Desempleo estructural: </w:t>
-      </w:r>
-      <w:r>
-        <w:rPr>
-          <w:rFonts w:ascii="Calibri" w:hAnsi="Calibri"/>
-          <w:color w:val="2F3A30"/>
-        </w:rPr>
-        <w:t>Desempleo por desajuste entre habilidades ofrecidas y demandadas</w:t>
-      </w:r>
-    </w:p>
-    <w:p>
-      <w:pPr>
-        <w:spacing w:after="70"/>
-        <w:ind w:left="504" w:hanging="259"/>
-        <w:jc w:val="both"/>
-      </w:pPr>
-      <w:r>
-        <w:rPr>
-          <w:rFonts w:ascii="Calibri" w:hAnsi="Calibri"/>
-          <w:b/>
-          <w:color w:val="76927A"/>
-        </w:rPr>
-        <w:t xml:space="preserve">•  </w:t>
-      </w:r>
-      <w:r>
-        <w:rPr>
-          <w:rFonts w:ascii="Calibri" w:hAnsi="Calibri"/>
-          <w:b/>
-          <w:color w:val="566B56"/>
-        </w:rPr>
-        <w:t xml:space="preserve">Desempleo cíclico: </w:t>
-      </w:r>
-      <w:r>
-        <w:rPr>
-          <w:rFonts w:ascii="Calibri" w:hAnsi="Calibri"/>
-          <w:color w:val="2F3A30"/>
-        </w:rPr>
-        <w:t>Desempleo vinculado a fluctuaciones del ciclo económico</w:t>
-      </w:r>
-    </w:p>
-    <w:p>
-      <w:pPr>
-        <w:spacing w:after="70"/>
-        <w:ind w:left="504" w:hanging="259"/>
-        <w:jc w:val="both"/>
-      </w:pPr>
-      <w:r>
-        <w:rPr>
-          <w:rFonts w:ascii="Calibri" w:hAnsi="Calibri"/>
-          <w:b/>
-          <w:color w:val="76927A"/>
-        </w:rPr>
-        <w:t xml:space="preserve">•  </w:t>
-      </w:r>
-      <w:r>
-        <w:rPr>
-          <w:rFonts w:ascii="Calibri" w:hAnsi="Calibri"/>
-          <w:b/>
-          <w:color w:val="566B56"/>
-        </w:rPr>
-        <w:t xml:space="preserve">Desempleo estacional: </w:t>
-      </w:r>
-      <w:r>
-        <w:rPr>
-          <w:rFonts w:ascii="Calibri" w:hAnsi="Calibri"/>
-          <w:color w:val="2F3A30"/>
-        </w:rPr>
-        <w:t>Desempleo por variaciones regulares en demanda sectorial</w:t>
-      </w:r>
-    </w:p>
-    <w:p>
-      <w:pPr>
-        <w:spacing w:after="70"/>
-        <w:ind w:left="504" w:hanging="259"/>
-        <w:jc w:val="both"/>
-      </w:pPr>
-      <w:r>
-        <w:rPr>
-          <w:rFonts w:ascii="Calibri" w:hAnsi="Calibri"/>
-          <w:b/>
-          <w:color w:val="76927A"/>
-        </w:rPr>
-        <w:t xml:space="preserve">•  </w:t>
-      </w:r>
-      <w:r>
-        <w:rPr>
-          <w:rFonts w:ascii="Calibri" w:hAnsi="Calibri"/>
-          <w:b/>
-          <w:color w:val="566B56"/>
-        </w:rPr>
-        <w:t xml:space="preserve">Skill mismatch: </w:t>
-      </w:r>
-      <w:r>
-        <w:rPr>
-          <w:rFonts w:ascii="Calibri" w:hAnsi="Calibri"/>
-          <w:color w:val="2F3A30"/>
-        </w:rPr>
-        <w:t>Desajuste entre cualificaciones demandadas y ofrecidas</w:t>
-      </w:r>
-    </w:p>
-    <w:p>
-      <w:pPr>
-        <w:spacing w:after="70"/>
-        <w:ind w:left="504" w:hanging="259"/>
-        <w:jc w:val="both"/>
-      </w:pPr>
-      <w:r>
-        <w:rPr>
-          <w:rFonts w:ascii="Calibri" w:hAnsi="Calibri"/>
-          <w:b/>
-          <w:color w:val="76927A"/>
-        </w:rPr>
-        <w:t xml:space="preserve">•  </w:t>
-      </w:r>
-      <w:r>
-        <w:rPr>
-          <w:rFonts w:ascii="Calibri" w:hAnsi="Calibri"/>
-          <w:b/>
-          <w:color w:val="566B56"/>
-        </w:rPr>
-        <w:t xml:space="preserve">Histéresis: </w:t>
-      </w:r>
-      <w:r>
-        <w:rPr>
-          <w:rFonts w:ascii="Calibri" w:hAnsi="Calibri"/>
-          <w:color w:val="2F3A30"/>
-        </w:rPr>
-        <w:t>Tendencia del desempleo a persistir tras desaparecer sus causas originales</w:t>
-      </w:r>
-    </w:p>
-    <w:p>
-      <w:pPr>
-        <w:spacing w:after="70"/>
-        <w:ind w:left="504" w:hanging="259"/>
-        <w:jc w:val="both"/>
-      </w:pPr>
-      <w:r>
-        <w:rPr>
-          <w:rFonts w:ascii="Calibri" w:hAnsi="Calibri"/>
-          <w:b/>
-          <w:color w:val="76927A"/>
-        </w:rPr>
-        <w:t xml:space="preserve">•  </w:t>
-      </w:r>
-      <w:r>
-        <w:rPr>
-          <w:rFonts w:ascii="Calibri" w:hAnsi="Calibri"/>
-          <w:b/>
-          <w:color w:val="566B56"/>
-        </w:rPr>
-        <w:t xml:space="preserve">NAIRU: </w:t>
-      </w:r>
-      <w:r>
-        <w:rPr>
-          <w:rFonts w:ascii="Calibri" w:hAnsi="Calibri"/>
-          <w:color w:val="2F3A30"/>
-        </w:rPr>
-        <w:t>Tasa de desempleo no aceleradora de la inflación (tasa natural)</w:t>
-      </w:r>
-    </w:p>
-    <w:p>
-      <w:pPr>
-        <w:spacing w:after="70"/>
-        <w:ind w:left="504" w:hanging="259"/>
-        <w:jc w:val="both"/>
-      </w:pPr>
-      <w:r>
-        <w:rPr>
-          <w:rFonts w:ascii="Calibri" w:hAnsi="Calibri"/>
-          <w:b/>
-          <w:color w:val="76927A"/>
-        </w:rPr>
-        <w:t xml:space="preserve">•  </w:t>
-      </w:r>
-      <w:r>
-        <w:rPr>
-          <w:rFonts w:ascii="Calibri" w:hAnsi="Calibri"/>
-          <w:b/>
-          <w:color w:val="566B56"/>
-        </w:rPr>
-        <w:t xml:space="preserve">Curva de Phillips: </w:t>
-      </w:r>
-      <w:r>
-        <w:rPr>
-          <w:rFonts w:ascii="Calibri" w:hAnsi="Calibri"/>
-          <w:color w:val="2F3A30"/>
-        </w:rPr>
-        <w:t>Relación entre desempleo e inflación</w:t>
-      </w:r>
-    </w:p>
-    <w:p>
-      <w:pPr>
-        <w:spacing w:after="70"/>
-        <w:ind w:left="504" w:hanging="259"/>
-        <w:jc w:val="both"/>
-      </w:pPr>
-      <w:r>
-        <w:rPr>
-          <w:rFonts w:ascii="Calibri" w:hAnsi="Calibri"/>
-          <w:b/>
-          <w:color w:val="76927A"/>
-        </w:rPr>
-        <w:t xml:space="preserve">•  </w:t>
-      </w:r>
-      <w:r>
-        <w:rPr>
-          <w:rFonts w:ascii="Calibri" w:hAnsi="Calibri"/>
-          <w:b/>
-          <w:color w:val="566B56"/>
-        </w:rPr>
-        <w:t xml:space="preserve">Curva de Beveridge: </w:t>
-      </w:r>
-      <w:r>
-        <w:rPr>
-          <w:rFonts w:ascii="Calibri" w:hAnsi="Calibri"/>
-          <w:color w:val="2F3A30"/>
-        </w:rPr>
-        <w:t>Relación entre tasa de vacantes y tasa de desempleo</w:t>
-      </w:r>
-    </w:p>
-    <w:p>
-      <w:pPr>
-        <w:spacing w:after="70"/>
-        <w:ind w:left="504" w:hanging="259"/>
-        <w:jc w:val="both"/>
-      </w:pPr>
-      <w:r>
-        <w:rPr>
-          <w:rFonts w:ascii="Calibri" w:hAnsi="Calibri"/>
-          <w:b/>
-          <w:color w:val="76927A"/>
-        </w:rPr>
-        <w:t xml:space="preserve">•  </w:t>
-      </w:r>
-      <w:r>
-        <w:rPr>
-          <w:rFonts w:ascii="Calibri" w:hAnsi="Calibri"/>
-          <w:b/>
-          <w:color w:val="566B56"/>
-        </w:rPr>
-        <w:t xml:space="preserve">Función de emparejamiento: </w:t>
-      </w:r>
-      <w:r>
-        <w:rPr>
-          <w:rFonts w:ascii="Calibri" w:hAnsi="Calibri"/>
-          <w:color w:val="2F3A30"/>
-        </w:rPr>
-        <w:t>Relación entre contrataciones, desempleados, vacantes y eficiencia</w:t>
-      </w:r>
-    </w:p>
-    <w:p>
-      <w:pPr>
-        <w:spacing w:after="70"/>
-        <w:ind w:left="504" w:hanging="259"/>
-        <w:jc w:val="both"/>
-      </w:pPr>
-      <w:r>
-        <w:rPr>
-          <w:rFonts w:ascii="Calibri" w:hAnsi="Calibri"/>
-          <w:b/>
-          <w:color w:val="76927A"/>
-        </w:rPr>
-        <w:t xml:space="preserve">•  </w:t>
-      </w:r>
-      <w:r>
-        <w:rPr>
-          <w:rFonts w:ascii="Calibri" w:hAnsi="Calibri"/>
-          <w:b/>
-          <w:color w:val="566B56"/>
-        </w:rPr>
-        <w:t xml:space="preserve">Eficiencia del emparejamiento: </w:t>
-      </w:r>
-      <w:r>
-        <w:rPr>
-          <w:rFonts w:ascii="Calibri" w:hAnsi="Calibri"/>
-          <w:color w:val="2F3A30"/>
-        </w:rPr>
-        <w:t>Capacidad del mercado laboral para conectar trabajadores con empleos</w:t>
-      </w:r>
-    </w:p>
-    <w:p>
-      <w:pPr>
-        <w:pStyle w:val="Heading1"/>
-        <w:jc w:val="left"/>
-      </w:pPr>
-      <w:r>
-        <w:rPr>
-          <w:rFonts w:ascii="Poppins" w:hAnsi="Poppins"/>
-          <w:b/>
-          <w:color w:val="566B56"/>
-          <w:sz w:val="30"/>
-        </w:rPr>
-        <w:t>PREGUNTAS PARA EL DEBATE</w:t>
+        <w:t>Antes de cerrar el tema, estas preguntas abren la discusión sobre los retos de reforma del mercado de trabajo español y la agenda 2025-2030 (para profundizar, ver el bloque final de las diapositivas del tema):</w:t>
       </w:r>
     </w:p>
     <w:p>
@@ -13077,7 +13239,7 @@
           <w:color w:val="2F3A30"/>
           <w:sz w:val="21"/>
         </w:rPr>
-        <w:t>Antes de cerrar el tema, estas preguntas abren la discusión sobre los retos de reforma del mercado de trabajo español y la agenda 2025-2030 (para profundizar, ver el bloque final de las diapositivas del tema):</w:t>
+        <w:t>Si la digitalización y la transición ecológica van a destruir empleos en unos sectores y crear otros nuevos, ¿qué papel debe jugar la política pública en gestionar esa transición? ¿Confías más en que el mercado se ajuste solo, o en una intervención activa del Estado?</w:t>
       </w:r>
     </w:p>
     <w:p>
@@ -13092,7 +13254,7 @@
           <w:color w:val="2F3A30"/>
           <w:sz w:val="21"/>
         </w:rPr>
-        <w:t>Si la digitalización y la transición ecológica van a destruir empleos en unos sectores y crear otros nuevos, ¿qué papel debe jugar la política pública en gestionar esa transición? ¿Confías más en que el mercado se ajuste solo, o en una intervención activa del Estado?</w:t>
+        <w:t>El tema plantea que vincular los convenios colectivos a la productividad de cada empresa podría ayudar a reducir la NAIRU. ¿Qué se pierde y qué se gana si los salarios dejan de negociarse de forma sectorial y pasan a depender más de cada empresa?</w:t>
       </w:r>
     </w:p>
     <w:p>
@@ -13107,7 +13269,7 @@
           <w:color w:val="2F3A30"/>
           <w:sz w:val="21"/>
         </w:rPr>
-        <w:t>El tema plantea que vincular los convenios colectivos a la productividad de cada empresa podría ayudar a reducir la NAIRU. ¿Qué se pierde y qué se gana si los salarios dejan de negociarse de forma sectorial y pasan a depender más de cada empresa?</w:t>
+        <w:t>El envejecimiento de la población podría, paradójicamente, reducir la NAIRU si los trabajadores mayores mantienen bajo desempleo, pero al mismo tiempo presiona el sistema de pensiones. ¿Es un buen equilibrio? ¿Cómo conectarías esta política con las que se estudiarán en el Tema 7?</w:t>
       </w:r>
     </w:p>
     <w:p>
@@ -13122,7 +13284,7 @@
           <w:color w:val="2F3A30"/>
           <w:sz w:val="21"/>
         </w:rPr>
-        <w:t>El envejecimiento de la población podría, paradójicamente, reducir la NAIRU si los trabajadores mayores mantienen bajo desempleo, pero al mismo tiempo presiona el sistema de pensiones. ¿Es un buen equilibrio? ¿Cómo conectarías esta política con las que se estudiarán en el Tema 7?</w:t>
+        <w:t>La gobernanza del mercado de trabajo en España se reparte entre el Estado, las comunidades autónomas y los ayuntamientos. ¿Esta descentralización ayuda a adaptar las políticas a la realidad de cada territorio, o genera duplicidades y desigualdad entre regiones?</w:t>
       </w:r>
     </w:p>
     <w:p>
@@ -13137,27 +13299,14 @@
           <w:color w:val="2F3A30"/>
           <w:sz w:val="21"/>
         </w:rPr>
-        <w:t>La gobernanza del mercado de trabajo en España se reparte entre el Estado, las comunidades autónomas y los ayuntamientos. ¿Esta descentralización ayuda a adaptar las políticas a la realidad de cada territorio, o genera duplicidades y desigualdad entre regiones?</w:t>
-      </w:r>
-    </w:p>
-    <w:p>
-      <w:pPr>
-        <w:spacing w:after="90" w:line="276" w:lineRule="auto"/>
-        <w:ind w:left="0" w:firstLine="0"/>
-        <w:jc w:val="both"/>
-      </w:pPr>
-      <w:r>
-        <w:rPr>
-          <w:rFonts w:ascii="Calibri" w:hAnsi="Calibri"/>
-          <w:color w:val="2F3A30"/>
-          <w:sz w:val="21"/>
-        </w:rPr>
         <w:t>Si tuvieras que priorizar la agenda de políticas sociolaborales para España de aquí a 2030, ¿qué pondrías primero: reducir la NAIRU, mejorar la calidad del empleo, o preparar la fuerza laboral para la transición digital y verde? Justifica tu elección.</w:t>
       </w:r>
     </w:p>
     <w:p>
       <w:pPr>
         <w:pStyle w:val="Heading1"/>
+        <w:keepNext/>
+        <w:spacing w:before="520" w:after="120"/>
         <w:jc w:val="left"/>
       </w:pPr>
       <w:r>
@@ -13269,7 +13418,7 @@
   <w:p>
     <w:pPr>
       <w:pStyle w:val="Header"/>
-      <w:jc w:val="right"/>
+      <w:jc w:val="left"/>
     </w:pPr>
     <w:r>
       <w:rPr>
@@ -13711,7 +13860,7 @@
     <w:pPr>
       <w:keepNext/>
       <w:keepLines/>
-      <w:spacing w:before="280" w:after="80"/>
+      <w:spacing w:before="520" w:after="120"/>
       <w:outlineLvl w:val="0"/>
     </w:pPr>
     <w:rPr>
@@ -13735,7 +13884,7 @@
     <w:pPr>
       <w:keepNext/>
       <w:keepLines/>
-      <w:spacing w:before="200" w:after="60"/>
+      <w:spacing w:before="360" w:after="100"/>
       <w:outlineLvl w:val="1"/>
     </w:pPr>
     <w:rPr>
@@ -13759,7 +13908,7 @@
     <w:pPr>
       <w:keepNext/>
       <w:keepLines/>
-      <w:spacing w:before="140" w:after="40"/>
+      <w:spacing w:before="240" w:after="60"/>
       <w:outlineLvl w:val="2"/>
     </w:pPr>
     <w:rPr>

</xml_diff>

<commit_message>
style(apuntes): alinear a la izquierda la cabecera institucional inicial y sus lineas de metadatos
</commit_message>
<xml_diff>
--- a/Temas EB/Tema 1/Apuntes/Tema 1 2627_maquetado.docx
+++ b/Temas EB/Tema 1/Apuntes/Tema 1 2627_maquetado.docx
@@ -5,7 +5,7 @@
     <w:tbl>
       <w:tblPr>
         <w:tblW w:type="auto" w:w="0"/>
-        <w:jc w:val="center"/>
+        <w:jc w:val="left"/>
         <w:tblLayout w:type="fixed"/>
         <w:tblLook w:firstColumn="1" w:firstRow="1" w:lastColumn="0" w:lastRow="0" w:noHBand="0" w:noVBand="1" w:val="04A0"/>
       </w:tblPr>
@@ -20,7 +20,8 @@
           </w:tcPr>
           <w:p>
             <w:pPr>
-              <w:spacing w:before="0" w:after="40"/>
+              <w:spacing w:before="0" w:after="30"/>
+              <w:jc w:val="left"/>
             </w:pPr>
             <w:r>
               <w:rPr>
@@ -30,8 +31,13 @@
                 <w:sz w:val="18"/>
               </w:rPr>
               <w:t>UNIVERSIDAD PABLO DE OLAVIDE</w:t>
-              <w:br/>
             </w:r>
+          </w:p>
+          <w:p>
+            <w:pPr>
+              <w:spacing w:before="0" w:after="30"/>
+              <w:jc w:val="left"/>
+            </w:pPr>
             <w:r>
               <w:rPr>
                 <w:rFonts w:ascii="Calibri" w:hAnsi="Calibri"/>
@@ -39,8 +45,13 @@
                 <w:sz w:val="17"/>
               </w:rPr>
               <w:t>Facultad de Ciencias del Trabajo · Grado en RRLL y Recursos Humanos</w:t>
-              <w:br/>
             </w:r>
+          </w:p>
+          <w:p>
+            <w:pPr>
+              <w:spacing w:before="0" w:after="30"/>
+              <w:jc w:val="left"/>
+            </w:pPr>
             <w:r>
               <w:rPr>
                 <w:rFonts w:ascii="Calibri" w:hAnsi="Calibri"/>
@@ -48,7 +59,19 @@
                 <w:sz w:val="17"/>
               </w:rPr>
               <w:t>Políticas Sociolaborales y de Empleo (Código 102023) | Curso 2026-2027</w:t>
-              <w:br/>
+            </w:r>
+          </w:p>
+          <w:p>
+            <w:pPr>
+              <w:spacing w:before="0" w:after="0"/>
+              <w:jc w:val="left"/>
+            </w:pPr>
+            <w:r>
+              <w:rPr>
+                <w:rFonts w:ascii="Calibri" w:hAnsi="Calibri"/>
+                <w:color w:val="2F3A30"/>
+                <w:sz w:val="17"/>
+              </w:rPr>
               <w:t>Prof. Manuel A. Hidalgo Pérez</w:t>
             </w:r>
           </w:p>
@@ -102,7 +125,8 @@
     </w:tbl>
     <w:p>
       <w:pPr>
-        <w:spacing w:before="120" w:after="320"/>
+        <w:spacing w:before="80" w:after="320"/>
+        <w:jc w:val="left"/>
       </w:pPr>
       <w:r>
         <w:rPr>

</xml_diff>

<commit_message>
feat(figuras): remasterizar Figura 1.3 (VAB y proceso del pan) en 300 DPI con paleta PSLL
</commit_message>
<xml_diff>
--- a/Temas EB/Tema 1/Apuntes/Tema 1 2627_maquetado.docx
+++ b/Temas EB/Tema 1/Apuntes/Tema 1 2627_maquetado.docx
@@ -1576,7 +1576,7 @@
       <w:r>
         <w:drawing>
           <wp:inline xmlns:a="http://schemas.openxmlformats.org/drawingml/2006/main" xmlns:pic="http://schemas.openxmlformats.org/drawingml/2006/picture">
-            <wp:extent cx="5669280" cy="3248235"/>
+            <wp:extent cx="5669280" cy="3349130"/>
             <wp:docPr id="3" name="Picture 3"/>
             <wp:cNvGraphicFramePr>
               <a:graphicFrameLocks noChangeAspect="1"/>
@@ -1585,7 +1585,7 @@
               <a:graphicData uri="http://schemas.openxmlformats.org/drawingml/2006/picture">
                 <pic:pic>
                   <pic:nvPicPr>
-                    <pic:cNvPr id="0" name="image2.png"/>
+                    <pic:cNvPr id="0" name="epa_decision_tree.png"/>
                     <pic:cNvPicPr/>
                   </pic:nvPicPr>
                   <pic:blipFill>
@@ -1597,7 +1597,7 @@
                   <pic:spPr>
                     <a:xfrm>
                       <a:off x="0" y="0"/>
-                      <a:ext cx="5669280" cy="3248235"/>
+                      <a:ext cx="5669280" cy="3349130"/>
                     </a:xfrm>
                     <a:prstGeom prst="rect"/>
                   </pic:spPr>
@@ -1621,7 +1621,7 @@
           <w:color w:val="566B56"/>
           <w:sz w:val="18"/>
         </w:rPr>
-        <w:t>Figura 1.2: Factores determinantes y dinámicas de la tasa de actividad.</w:t>
+        <w:t>Figura 1.2: Algoritmo y criterios de clasificación de la población laboral según la OIT y la EPA.</w:t>
       </w:r>
     </w:p>
     <w:p>
@@ -1636,7 +1636,7 @@
           <w:color w:val="6F8073"/>
           <w:sz w:val="16"/>
         </w:rPr>
-        <w:t>Fuente: Elaboración propia para Políticas Sociolaborales (UPO).</w:t>
+        <w:t>Fuente: Elaboración propia a partir de los criterios metodológicos de la OIT y la Encuesta de Población Activa (INE).</w:t>
       </w:r>
     </w:p>
     <w:p>
@@ -3094,7 +3094,7 @@
       <w:r>
         <w:drawing>
           <wp:inline xmlns:a="http://schemas.openxmlformats.org/drawingml/2006/main" xmlns:pic="http://schemas.openxmlformats.org/drawingml/2006/picture">
-            <wp:extent cx="5669280" cy="2281064"/>
+            <wp:extent cx="5669280" cy="3225040"/>
             <wp:docPr id="4" name="Picture 4"/>
             <wp:cNvGraphicFramePr>
               <a:graphicFrameLocks noChangeAspect="1"/>
@@ -3103,7 +3103,7 @@
               <a:graphicData uri="http://schemas.openxmlformats.org/drawingml/2006/picture">
                 <pic:pic>
                   <pic:nvPicPr>
-                    <pic:cNvPr id="0" name="image3.png"/>
+                    <pic:cNvPr id="0" name="vab_pan.png"/>
                     <pic:cNvPicPr/>
                   </pic:nvPicPr>
                   <pic:blipFill>
@@ -3115,7 +3115,7 @@
                   <pic:spPr>
                     <a:xfrm>
                       <a:off x="0" y="0"/>
-                      <a:ext cx="5669280" cy="2281064"/>
+                      <a:ext cx="5669280" cy="3225040"/>
                     </a:xfrm>
                     <a:prstGeom prst="rect"/>
                   </pic:spPr>
@@ -3139,7 +3139,7 @@
           <w:color w:val="566B56"/>
           <w:sz w:val="18"/>
         </w:rPr>
-        <w:t>Figura 1.3: Cadena de valor añadido y generación del VAB en las fases del pan.</w:t>
+        <w:t>Figura 1.3: Cadena de valor añadido bruto (VAB) y proceso de producción del pan.</w:t>
       </w:r>
     </w:p>
     <w:p>
@@ -3154,7 +3154,7 @@
           <w:color w:val="6F8073"/>
           <w:sz w:val="16"/>
         </w:rPr>
-        <w:t>Fuente: Elaboración propia para Políticas Sociolaborales (UPO).</w:t>
+        <w:t>Fuente: Elaboración propia para Políticas Sociolaborales (UPO). Metodología de Contabilidad Nacional (INE / SEC-2010).</w:t>
       </w:r>
     </w:p>
     <w:p>

</xml_diff>

<commit_message>
feat(figuras): remasterizar Figura 1.4 con serie actualizada de PIB interanual (2022T1-2026T2)
</commit_message>
<xml_diff>
--- a/Temas EB/Tema 1/Apuntes/Tema 1 2627_maquetado.docx
+++ b/Temas EB/Tema 1/Apuntes/Tema 1 2627_maquetado.docx
@@ -3506,7 +3506,7 @@
       <w:r>
         <w:drawing>
           <wp:inline xmlns:a="http://schemas.openxmlformats.org/drawingml/2006/main" xmlns:pic="http://schemas.openxmlformats.org/drawingml/2006/picture">
-            <wp:extent cx="5669280" cy="3530062"/>
+            <wp:extent cx="5669280" cy="3443261"/>
             <wp:docPr id="5" name="Picture 5"/>
             <wp:cNvGraphicFramePr>
               <a:graphicFrameLocks noChangeAspect="1"/>
@@ -3515,7 +3515,7 @@
               <a:graphicData uri="http://schemas.openxmlformats.org/drawingml/2006/picture">
                 <pic:pic>
                   <pic:nvPicPr>
-                    <pic:cNvPr id="0" name="image4.jpeg"/>
+                    <pic:cNvPr id="0" name="pib_interanual.png"/>
                     <pic:cNvPicPr/>
                   </pic:nvPicPr>
                   <pic:blipFill>
@@ -3527,7 +3527,7 @@
                   <pic:spPr>
                     <a:xfrm>
                       <a:off x="0" y="0"/>
-                      <a:ext cx="5669280" cy="3530062"/>
+                      <a:ext cx="5669280" cy="3443261"/>
                     </a:xfrm>
                     <a:prstGeom prst="rect"/>
                   </pic:spPr>
@@ -3551,7 +3551,7 @@
           <w:color w:val="566B56"/>
           <w:sz w:val="18"/>
         </w:rPr>
-        <w:t>Figura 1.4: Medición del Producto Interior Bruto: Enfoque de la producción y valor añadido.</w:t>
+        <w:t>Figura 1.4: Evolución del Producto Interior Bruto (PIB) en España: tasas de variación interanual en volumen encadenado (2022T1 - 2026T2).</w:t>
       </w:r>
     </w:p>
     <w:p>
@@ -3566,7 +3566,7 @@
           <w:color w:val="6F8073"/>
           <w:sz w:val="16"/>
         </w:rPr>
-        <w:t>Fuente: Elaboración propia a partir de la Contabilidad Nacional (INE).</w:t>
+        <w:t>Fuente: Instituto Nacional de Estadística (INE), Contabilidad Nacional Trimestral de España (CNTR).</w:t>
       </w:r>
     </w:p>
     <w:p>

</xml_diff>

<commit_message>
feat(figuras): añadir pie de fuente institucional (INE/CNTR) dentro del gráfico de PIB interanual
</commit_message>
<xml_diff>
--- a/Temas EB/Tema 1/Apuntes/Tema 1 2627_maquetado.docx
+++ b/Temas EB/Tema 1/Apuntes/Tema 1 2627_maquetado.docx
@@ -3506,7 +3506,7 @@
       <w:r>
         <w:drawing>
           <wp:inline xmlns:a="http://schemas.openxmlformats.org/drawingml/2006/main" xmlns:pic="http://schemas.openxmlformats.org/drawingml/2006/picture">
-            <wp:extent cx="5669280" cy="3443261"/>
+            <wp:extent cx="5669280" cy="3670895"/>
             <wp:docPr id="5" name="Picture 5"/>
             <wp:cNvGraphicFramePr>
               <a:graphicFrameLocks noChangeAspect="1"/>
@@ -3527,7 +3527,7 @@
                   <pic:spPr>
                     <a:xfrm>
                       <a:off x="0" y="0"/>
-                      <a:ext cx="5669280" cy="3443261"/>
+                      <a:ext cx="5669280" cy="3670895"/>
                     </a:xfrm>
                     <a:prstGeom prst="rect"/>
                   </pic:spPr>

</xml_diff>

<commit_message>
feat(figuras): remasterizar Figura 1.5 (Productividad vs Salarios OCDE 2024) en alta resolución
</commit_message>
<xml_diff>
--- a/Temas EB/Tema 1/Apuntes/Tema 1 2627_maquetado.docx
+++ b/Temas EB/Tema 1/Apuntes/Tema 1 2627_maquetado.docx
@@ -4579,7 +4579,7 @@
       <w:r>
         <w:drawing>
           <wp:inline xmlns:a="http://schemas.openxmlformats.org/drawingml/2006/main" xmlns:pic="http://schemas.openxmlformats.org/drawingml/2006/picture">
-            <wp:extent cx="5669280" cy="4286529"/>
+            <wp:extent cx="5669280" cy="3489693"/>
             <wp:docPr id="6" name="Picture 6"/>
             <wp:cNvGraphicFramePr>
               <a:graphicFrameLocks noChangeAspect="1"/>
@@ -4588,7 +4588,7 @@
               <a:graphicData uri="http://schemas.openxmlformats.org/drawingml/2006/picture">
                 <pic:pic>
                   <pic:nvPicPr>
-                    <pic:cNvPr id="0" name="image5.png"/>
+                    <pic:cNvPr id="0" name="productividad_salarios.png"/>
                     <pic:cNvPicPr/>
                   </pic:nvPicPr>
                   <pic:blipFill>
@@ -4600,7 +4600,7 @@
                   <pic:spPr>
                     <a:xfrm>
                       <a:off x="0" y="0"/>
-                      <a:ext cx="5669280" cy="4286529"/>
+                      <a:ext cx="5669280" cy="3489693"/>
                     </a:xfrm>
                     <a:prstGeom prst="rect"/>
                   </pic:spPr>
@@ -4624,7 +4624,7 @@
           <w:color w:val="566B56"/>
           <w:sz w:val="18"/>
         </w:rPr>
-        <w:t>Figura 1.5: Relación a largo plazo entre productividad laboral y salarios reales.</w:t>
+        <w:t>Figura 1.5: Relación entre productividad por hora trabajada y salario medio en la OCDE (2024).</w:t>
       </w:r>
     </w:p>
     <w:p>
@@ -4639,7 +4639,7 @@
           <w:color w:val="6F8073"/>
           <w:sz w:val="16"/>
         </w:rPr>
-        <w:t>Fuente: Elaboración propia para Políticas Sociolaborales (UPO).</w:t>
+        <w:t>Fuente: Elaboración propia a partir de datos oficiales de la OCDE (Productivity Statistics &amp; Employment Outlook, 2024).</w:t>
       </w:r>
     </w:p>
     <w:p>

</xml_diff>

<commit_message>
feat(figuras): remasterizar Figura 1.6 (modelo neoclasico de desempleo) en 300 DPI e integrar en apuntes
</commit_message>
<xml_diff>
--- a/Temas EB/Tema 1/Apuntes/Tema 1 2627_maquetado.docx
+++ b/Temas EB/Tema 1/Apuntes/Tema 1 2627_maquetado.docx
@@ -5241,7 +5241,7 @@
       <w:r>
         <w:drawing>
           <wp:inline xmlns:a="http://schemas.openxmlformats.org/drawingml/2006/main" xmlns:pic="http://schemas.openxmlformats.org/drawingml/2006/picture">
-            <wp:extent cx="5669280" cy="4081492"/>
+            <wp:extent cx="5669280" cy="3898763"/>
             <wp:docPr id="7" name="Picture 7"/>
             <wp:cNvGraphicFramePr>
               <a:graphicFrameLocks noChangeAspect="1"/>
@@ -5250,7 +5250,7 @@
               <a:graphicData uri="http://schemas.openxmlformats.org/drawingml/2006/picture">
                 <pic:pic>
                   <pic:nvPicPr>
-                    <pic:cNvPr id="0" name="image6.jpeg"/>
+                    <pic:cNvPr id="0" name="modelo_desempleo_neoclasico.png"/>
                     <pic:cNvPicPr/>
                   </pic:nvPicPr>
                   <pic:blipFill>
@@ -5262,7 +5262,7 @@
                   <pic:spPr>
                     <a:xfrm>
                       <a:off x="0" y="0"/>
-                      <a:ext cx="5669280" cy="4081492"/>
+                      <a:ext cx="5669280" cy="3898763"/>
                     </a:xfrm>
                     <a:prstGeom prst="rect"/>
                   </pic:spPr>
@@ -5286,7 +5286,7 @@
           <w:color w:val="566B56"/>
           <w:sz w:val="18"/>
         </w:rPr>
-        <w:t>Figura 1.6: Teoría de la elección ocio-consumo y derivación de la oferta individual de trabajo.</w:t>
+        <w:t>Figura 1.6: El desempleo en el modelo neoclásico del mercado de trabajo: rigidez salarial y exceso de oferta.</w:t>
       </w:r>
     </w:p>
     <w:p>
@@ -5301,7 +5301,7 @@
           <w:color w:val="6F8073"/>
           <w:sz w:val="16"/>
         </w:rPr>
-        <w:t>Fuente: Modelo microeconómico neoclásico del mercado de trabajo.</w:t>
+        <w:t>Fuente: Elaboración propia a partir del modelo neoclásico del mercado de trabajo (adaptado de M. Barneto).</w:t>
       </w:r>
     </w:p>
     <w:p>

</xml_diff>

<commit_message>
feat(figuras): remasterizar Figura 1.7 (desempleo y NAIRU 1980-2024 Espana vs Eurozona) en 300 DPI con sombreado ciclico
</commit_message>
<xml_diff>
--- a/Temas EB/Tema 1/Apuntes/Tema 1 2627_maquetado.docx
+++ b/Temas EB/Tema 1/Apuntes/Tema 1 2627_maquetado.docx
@@ -9882,7 +9882,7 @@
       <w:r>
         <w:drawing>
           <wp:inline xmlns:a="http://schemas.openxmlformats.org/drawingml/2006/main" xmlns:pic="http://schemas.openxmlformats.org/drawingml/2006/picture">
-            <wp:extent cx="5669280" cy="6517744"/>
+            <wp:extent cx="5669280" cy="4679696"/>
             <wp:docPr id="8" name="Picture 8"/>
             <wp:cNvGraphicFramePr>
               <a:graphicFrameLocks noChangeAspect="1"/>
@@ -9891,7 +9891,7 @@
               <a:graphicData uri="http://schemas.openxmlformats.org/drawingml/2006/picture">
                 <pic:pic>
                   <pic:nvPicPr>
-                    <pic:cNvPr id="0" name="image7.png"/>
+                    <pic:cNvPr id="0" name="tasa_natural_nairu.png"/>
                     <pic:cNvPicPr/>
                   </pic:nvPicPr>
                   <pic:blipFill>
@@ -9903,7 +9903,7 @@
                   <pic:spPr>
                     <a:xfrm>
                       <a:off x="0" y="0"/>
-                      <a:ext cx="5669280" cy="6517744"/>
+                      <a:ext cx="5669280" cy="4679696"/>
                     </a:xfrm>
                     <a:prstGeom prst="rect"/>
                   </pic:spPr>
@@ -9927,7 +9927,7 @@
           <w:color w:val="566B56"/>
           <w:sz w:val="18"/>
         </w:rPr>
-        <w:t>Figura 1.7: La Tasa Natural de Desempleo (NAIRU) y equilibrio en el mercado de trabajo.</w:t>
+        <w:t>Figura 1.7: Tasa de desempleo observada y tasa natural de desempleo (NAIRU) en España y la Zona Euro (1980–2024): desempleo estructural vs. desempleo cíclico.</w:t>
       </w:r>
     </w:p>
     <w:p>
@@ -9942,7 +9942,7 @@
           <w:color w:val="6F8073"/>
           <w:sz w:val="16"/>
         </w:rPr>
-        <w:t>Fuente: Elaboración propia para Políticas Sociolaborales (UPO).</w:t>
+        <w:t>Fuente: Elaboración propia a partir de datos oficiales de la base AMECO (Comisión Europea, DG ECFIN, 2024).</w:t>
       </w:r>
     </w:p>
     <w:p>

</xml_diff>

<commit_message>
feat(figuras): remasterizar Figura 1.8 (Curva de Phillips dual: teoria Friedman-Phelps y evidencia Espana 2002-2024 INE) en 300 DPI
</commit_message>
<xml_diff>
--- a/Temas EB/Tema 1/Apuntes/Tema 1 2627_maquetado.docx
+++ b/Temas EB/Tema 1/Apuntes/Tema 1 2627_maquetado.docx
@@ -10321,7 +10321,7 @@
       <w:r>
         <w:drawing>
           <wp:inline xmlns:a="http://schemas.openxmlformats.org/drawingml/2006/main" xmlns:pic="http://schemas.openxmlformats.org/drawingml/2006/picture">
-            <wp:extent cx="5669280" cy="3618084"/>
+            <wp:extent cx="5669280" cy="3011056"/>
             <wp:docPr id="9" name="Picture 9"/>
             <wp:cNvGraphicFramePr>
               <a:graphicFrameLocks noChangeAspect="1"/>
@@ -10330,7 +10330,7 @@
               <a:graphicData uri="http://schemas.openxmlformats.org/drawingml/2006/picture">
                 <pic:pic>
                   <pic:nvPicPr>
-                    <pic:cNvPr id="0" name="image8.png"/>
+                    <pic:cNvPr id="0" name="curva_phillips_dual.png"/>
                     <pic:cNvPicPr/>
                   </pic:nvPicPr>
                   <pic:blipFill>
@@ -10342,7 +10342,7 @@
                   <pic:spPr>
                     <a:xfrm>
                       <a:off x="0" y="0"/>
-                      <a:ext cx="5669280" cy="3618084"/>
+                      <a:ext cx="5669280" cy="3011056"/>
                     </a:xfrm>
                     <a:prstGeom prst="rect"/>
                   </pic:spPr>
@@ -10366,7 +10366,7 @@
           <w:color w:val="566B56"/>
           <w:sz w:val="18"/>
         </w:rPr>
-        <w:t>Figura 1.8: La Curva de Phillips y la hipótesis de la tasa natural de desempleo.</w:t>
+        <w:t>Figura 1.8: La Curva de Phillips: modelo teórico de expectativas aceleracionistas (Friedman-Phelps) y evidencia empírica en España (2002–2024).</w:t>
       </w:r>
     </w:p>
     <w:p>
@@ -10381,7 +10381,7 @@
           <w:color w:val="6F8073"/>
           <w:sz w:val="16"/>
         </w:rPr>
-        <w:t>Fuente: Elaboración propia a partir de Friedman y Phelps.</w:t>
+        <w:t>Fuente: Elaboración propia para Políticas Sociolaborales (UPO) a partir de Friedman (1968), Phelps (1967) e Instituto Nacional de Estadística (EPA y ETCL, 2024).</w:t>
       </w:r>
     </w:p>
     <w:p>

</xml_diff>

<commit_message>
feat(figuras): unificar y remasterizar Curva de Beveridge (Figura 1.9 dual: teoria DMP y evidencia Espana 1980-2024) en 300 DPI
</commit_message>
<xml_diff>
--- a/Temas EB/Tema 1/Apuntes/Tema 1 2627_maquetado.docx
+++ b/Temas EB/Tema 1/Apuntes/Tema 1 2627_maquetado.docx
@@ -11183,7 +11183,7 @@
       <w:r>
         <w:drawing>
           <wp:inline xmlns:a="http://schemas.openxmlformats.org/drawingml/2006/main" xmlns:pic="http://schemas.openxmlformats.org/drawingml/2006/picture">
-            <wp:extent cx="5669280" cy="4122045"/>
+            <wp:extent cx="5669280" cy="3019265"/>
             <wp:docPr id="10" name="Picture 10"/>
             <wp:cNvGraphicFramePr>
               <a:graphicFrameLocks noChangeAspect="1"/>
@@ -11192,7 +11192,7 @@
               <a:graphicData uri="http://schemas.openxmlformats.org/drawingml/2006/picture">
                 <pic:pic>
                   <pic:nvPicPr>
-                    <pic:cNvPr id="0" name="beveridge.png"/>
+                    <pic:cNvPr id="0" name="curva_beveridge_dual.png"/>
                     <pic:cNvPicPr/>
                   </pic:nvPicPr>
                   <pic:blipFill>
@@ -11204,7 +11204,7 @@
                   <pic:spPr>
                     <a:xfrm>
                       <a:off x="0" y="0"/>
-                      <a:ext cx="5669280" cy="4122045"/>
+                      <a:ext cx="5669280" cy="3019265"/>
                     </a:xfrm>
                     <a:prstGeom prst="rect"/>
                   </pic:spPr>
@@ -11228,7 +11228,7 @@
           <w:color w:val="566B56"/>
           <w:sz w:val="18"/>
         </w:rPr>
-        <w:t>Figura 1.9: La Curva de Beveridge. Desplazamientos a lo largo de la curva vs. desplazamientos estructurales.</w:t>
+        <w:t>Figura 1.9: La Curva de Beveridge: modelo teórico de emparejamiento (DMP) y evidencia empírica en España (1980–2024).</w:t>
       </w:r>
     </w:p>
     <w:p>
@@ -11243,7 +11243,7 @@
           <w:color w:val="6F8073"/>
           <w:sz w:val="16"/>
         </w:rPr>
-        <w:t>Fuente: Elaboración propia para Políticas Sociolaborales (UPO). Modelo Diamond-Mortensen-Pissarides.</w:t>
+        <w:t>Fuente: Elaboración propia para Políticas Sociolaborales (UPO) a partir de FEDEA (2017), Nada es Gratis e Instituto Nacional de Estadística (EPA y ETCL, 2024).</w:t>
       </w:r>
     </w:p>
     <w:p>
@@ -12483,78 +12483,6 @@
     </w:p>
     <w:p>
       <w:pPr>
-        <w:keepNext/>
-        <w:spacing w:before="160" w:after="60"/>
-        <w:jc w:val="center"/>
-      </w:pPr>
-      <w:r>
-        <w:drawing>
-          <wp:inline xmlns:a="http://schemas.openxmlformats.org/drawingml/2006/main" xmlns:pic="http://schemas.openxmlformats.org/drawingml/2006/picture">
-            <wp:extent cx="5669280" cy="4143553"/>
-            <wp:docPr id="11" name="Picture 11"/>
-            <wp:cNvGraphicFramePr>
-              <a:graphicFrameLocks noChangeAspect="1"/>
-            </wp:cNvGraphicFramePr>
-            <a:graphic>
-              <a:graphicData uri="http://schemas.openxmlformats.org/drawingml/2006/picture">
-                <pic:pic>
-                  <pic:nvPicPr>
-                    <pic:cNvPr id="0" name="image10.png"/>
-                    <pic:cNvPicPr/>
-                  </pic:nvPicPr>
-                  <pic:blipFill>
-                    <a:blip r:embed="rId19"/>
-                    <a:stretch>
-                      <a:fillRect/>
-                    </a:stretch>
-                  </pic:blipFill>
-                  <pic:spPr>
-                    <a:xfrm>
-                      <a:off x="0" y="0"/>
-                      <a:ext cx="5669280" cy="4143553"/>
-                    </a:xfrm>
-                    <a:prstGeom prst="rect"/>
-                  </pic:spPr>
-                </pic:pic>
-              </a:graphicData>
-            </a:graphic>
-          </wp:inline>
-        </w:drawing>
-      </w:r>
-    </w:p>
-    <w:p>
-      <w:pPr>
-        <w:keepNext/>
-        <w:spacing w:before="0" w:after="20"/>
-        <w:jc w:val="center"/>
-      </w:pPr>
-      <w:r>
-        <w:rPr>
-          <w:rFonts w:ascii="Poppins" w:hAnsi="Poppins"/>
-          <w:b/>
-          <w:color w:val="566B56"/>
-          <w:sz w:val="18"/>
-        </w:rPr>
-        <w:t>Figura 1.10: Estimación empírica de la Curva de Beveridge en España (1980-2016).</w:t>
-      </w:r>
-    </w:p>
-    <w:p>
-      <w:pPr>
-        <w:spacing w:before="0" w:after="160"/>
-        <w:jc w:val="center"/>
-      </w:pPr>
-      <w:r>
-        <w:rPr>
-          <w:rFonts w:ascii="Calibri" w:hAnsi="Calibri"/>
-          <w:i/>
-          <w:color w:val="6F8073"/>
-          <w:sz w:val="16"/>
-        </w:rPr>
-        <w:t>Fuente: Fundación de Estudios de Economía Aplicada (FEDEA, 2017).</w:t>
-      </w:r>
-    </w:p>
-    <w:p>
-      <w:pPr>
         <w:spacing w:after="90" w:line="276" w:lineRule="auto"/>
         <w:ind w:left="0" w:firstLine="0"/>
         <w:jc w:val="both"/>
@@ -12824,78 +12752,6 @@
           <w:sz w:val="21"/>
         </w:rPr>
         <w:t>Posiblemente influenciada por la reforma laboral de 2012 y los cambios en la negociación colectiva</w:t>
-      </w:r>
-    </w:p>
-    <w:p>
-      <w:pPr>
-        <w:keepNext/>
-        <w:spacing w:before="160" w:after="60"/>
-        <w:jc w:val="center"/>
-      </w:pPr>
-      <w:r>
-        <w:drawing>
-          <wp:inline xmlns:a="http://schemas.openxmlformats.org/drawingml/2006/main" xmlns:pic="http://schemas.openxmlformats.org/drawingml/2006/picture">
-            <wp:extent cx="5669280" cy="4761309"/>
-            <wp:docPr id="12" name="Picture 12"/>
-            <wp:cNvGraphicFramePr>
-              <a:graphicFrameLocks noChangeAspect="1"/>
-            </wp:cNvGraphicFramePr>
-            <a:graphic>
-              <a:graphicData uri="http://schemas.openxmlformats.org/drawingml/2006/picture">
-                <pic:pic>
-                  <pic:nvPicPr>
-                    <pic:cNvPr id="0" name="image11.png"/>
-                    <pic:cNvPicPr/>
-                  </pic:nvPicPr>
-                  <pic:blipFill>
-                    <a:blip r:embed="rId20"/>
-                    <a:stretch>
-                      <a:fillRect/>
-                    </a:stretch>
-                  </pic:blipFill>
-                  <pic:spPr>
-                    <a:xfrm>
-                      <a:off x="0" y="0"/>
-                      <a:ext cx="5669280" cy="4761309"/>
-                    </a:xfrm>
-                    <a:prstGeom prst="rect"/>
-                  </pic:spPr>
-                </pic:pic>
-              </a:graphicData>
-            </a:graphic>
-          </wp:inline>
-        </w:drawing>
-      </w:r>
-    </w:p>
-    <w:p>
-      <w:pPr>
-        <w:keepNext/>
-        <w:spacing w:before="0" w:after="20"/>
-        <w:jc w:val="center"/>
-      </w:pPr>
-      <w:r>
-        <w:rPr>
-          <w:rFonts w:ascii="Poppins" w:hAnsi="Poppins"/>
-          <w:b/>
-          <w:color w:val="566B56"/>
-          <w:sz w:val="18"/>
-        </w:rPr>
-        <w:t>Figura 1.11: Dinámica de la Curva de Beveridge española por subperiodos y efecto de la reforma de 2012.</w:t>
-      </w:r>
-    </w:p>
-    <w:p>
-      <w:pPr>
-        <w:spacing w:before="0" w:after="160"/>
-        <w:jc w:val="center"/>
-      </w:pPr>
-      <w:r>
-        <w:rPr>
-          <w:rFonts w:ascii="Calibri" w:hAnsi="Calibri"/>
-          <w:i/>
-          <w:color w:val="6F8073"/>
-          <w:sz w:val="16"/>
-        </w:rPr>
-        <w:t>Fuente: FEDEA (2017), Colección Estudios sobre la Economía Española.</w:t>
       </w:r>
     </w:p>
     <w:p>
@@ -14162,8 +14018,8 @@
       </w:r>
     </w:p>
     <w:sectPr>
-      <w:headerReference w:type="default" r:id="rId21"/>
-      <w:footerReference w:type="default" r:id="rId22"/>
+      <w:headerReference w:type="default" r:id="rId19"/>
+      <w:footerReference w:type="default" r:id="rId20"/>
       <w:pgSz w:w="12240" w:h="15840"/>
       <w:pgMar w:top="1411" w:right="1411" w:bottom="1411" w:left="1411" w:header="720" w:footer="720" w:gutter="0"/>
       <w:cols w:space="720"/>

</xml_diff>

<commit_message>
feat(apuntes): perfeccionar maquetacion de Tema 1 con extraccion completa de formulas matematicas y armonizacion textual con figuras duales
</commit_message>
<xml_diff>
--- a/Temas EB/Tema 1/Apuntes/Tema 1 2627_maquetado.docx
+++ b/Temas EB/Tema 1/Apuntes/Tema 1 2627_maquetado.docx
@@ -713,6 +713,21 @@
           <w:sz w:val="21"/>
         </w:rPr>
         <w:t>La tasa de actividad constituye el indicador estadístico básico de la oferta de trabajo más comúnmente utilizado. Representa la proporción de la población activa en relación con la población en edad de trabajar.</w:t>
+      </w:r>
+    </w:p>
+    <w:p>
+      <w:pPr>
+        <w:spacing w:after="90" w:line="276" w:lineRule="auto"/>
+        <w:ind w:left="0" w:firstLine="0"/>
+        <w:jc w:val="both"/>
+      </w:pPr>
+      <w:r>
+        <w:rPr>
+          <w:rFonts w:ascii="Calibri" w:hAnsi="Calibri"/>
+          <w:color w:val="2F3A30"/>
+          <w:sz w:val="21"/>
+        </w:rPr>
+        <w:t>Tasa de actividad% = Población que desea trabajarPoblación en edad de trabajar×100</w:t>
       </w:r>
     </w:p>
     <w:p>
@@ -2036,6 +2051,21 @@
           <w:color w:val="2F3A30"/>
           <w:sz w:val="21"/>
         </w:rPr>
+        <w:t>Tasa de desempleo%=Población desempleadaPoblación activa×100</w:t>
+      </w:r>
+    </w:p>
+    <w:p>
+      <w:pPr>
+        <w:spacing w:after="90" w:line="276" w:lineRule="auto"/>
+        <w:ind w:left="0" w:firstLine="0"/>
+        <w:jc w:val="both"/>
+      </w:pPr>
+      <w:r>
+        <w:rPr>
+          <w:rFonts w:ascii="Calibri" w:hAnsi="Calibri"/>
+          <w:color w:val="2F3A30"/>
+          <w:sz w:val="21"/>
+        </w:rPr>
         <w:t>Para ser considerado desempleado según la Encuesta de Población Activa (EPA), una persona debe cumplir simultáneamente tres requisitos estrictos:</w:t>
       </w:r>
     </w:p>
@@ -2174,6 +2204,21 @@
           <w:sz w:val="21"/>
         </w:rPr>
         <w:t>La tasa de empleo se refiere al porcentaje de la población en edad de trabajar que está efectivamente empleada. Este indicador complementa la tasa de desempleo y proporciona una visión de la capacidad de la economía para crear y mantener empleos.</w:t>
+      </w:r>
+    </w:p>
+    <w:p>
+      <w:pPr>
+        <w:spacing w:after="90" w:line="276" w:lineRule="auto"/>
+        <w:ind w:left="0" w:firstLine="0"/>
+        <w:jc w:val="both"/>
+      </w:pPr>
+      <w:r>
+        <w:rPr>
+          <w:rFonts w:ascii="Calibri" w:hAnsi="Calibri"/>
+          <w:color w:val="2F3A30"/>
+          <w:sz w:val="21"/>
+        </w:rPr>
+        <w:t>Tasa de empleo%=Población ocupadaPoblación en edad de trabajar×100</w:t>
       </w:r>
     </w:p>
     <w:p>
@@ -3418,6 +3463,21 @@
     </w:p>
     <w:p>
       <w:pPr>
+        <w:spacing w:before="120" w:after="120"/>
+        <w:jc w:val="center"/>
+      </w:pPr>
+      <w:r>
+        <w:rPr>
+          <w:rFonts w:ascii="Calibri" w:hAnsi="Calibri"/>
+          <w:b/>
+          <w:color w:val="566B56"/>
+          <w:sz w:val="22"/>
+        </w:rPr>
+        <w:t>PIB = VAB + Impuestos indirectos netos de subvenciones</w:t>
+      </w:r>
+    </w:p>
+    <w:p>
+      <w:pPr>
         <w:spacing w:after="90" w:line="276" w:lineRule="auto"/>
         <w:ind w:left="0" w:firstLine="0"/>
         <w:jc w:val="both"/>
@@ -3740,6 +3800,21 @@
     </w:p>
     <w:p>
       <w:pPr>
+        <w:spacing w:before="120" w:after="120"/>
+        <w:jc w:val="center"/>
+      </w:pPr>
+      <w:r>
+        <w:rPr>
+          <w:rFonts w:ascii="Calibri" w:hAnsi="Calibri"/>
+          <w:b/>
+          <w:color w:val="566B56"/>
+          <w:sz w:val="22"/>
+        </w:rPr>
+        <w:t>Tasa de variación interanual:  t.c. X_t = [(X_t - X_{t-1}) / X_{t-1}] × 100</w:t>
+      </w:r>
+    </w:p>
+    <w:p>
+      <w:pPr>
         <w:spacing w:after="90" w:line="276" w:lineRule="auto"/>
         <w:ind w:left="0" w:firstLine="0"/>
         <w:jc w:val="both"/>
@@ -3802,6 +3877,21 @@
     </w:p>
     <w:p>
       <w:pPr>
+        <w:spacing w:before="120" w:after="120"/>
+        <w:jc w:val="center"/>
+      </w:pPr>
+      <w:r>
+        <w:rPr>
+          <w:rFonts w:ascii="Calibri" w:hAnsi="Calibri"/>
+          <w:b/>
+          <w:color w:val="566B56"/>
+          <w:sz w:val="22"/>
+        </w:rPr>
+        <w:t>PIB per cápita = PIB total / Población total</w:t>
+      </w:r>
+    </w:p>
+    <w:p>
+      <w:pPr>
         <w:spacing w:after="90" w:line="276" w:lineRule="auto"/>
         <w:ind w:left="0" w:firstLine="0"/>
         <w:jc w:val="both"/>
@@ -4249,6 +4339,21 @@
           <w:sz w:val="21"/>
         </w:rPr>
         <w:t>Es la medida más comúnmente utilizada y se calcula como:</w:t>
+      </w:r>
+    </w:p>
+    <w:p>
+      <w:pPr>
+        <w:spacing w:after="90" w:line="276" w:lineRule="auto"/>
+        <w:ind w:left="0" w:firstLine="0"/>
+        <w:jc w:val="both"/>
+      </w:pPr>
+      <w:r>
+        <w:rPr>
+          <w:rFonts w:ascii="Calibri" w:hAnsi="Calibri"/>
+          <w:color w:val="2F3A30"/>
+          <w:sz w:val="21"/>
+        </w:rPr>
+        <w:t>Productividad laboral = Producción total (PIB) / (Número de trabajadores o de horas trabajadas)</w:t>
       </w:r>
     </w:p>
     <w:p>
@@ -10072,6 +10177,21 @@
     </w:p>
     <w:p>
       <w:pPr>
+        <w:spacing w:before="120" w:after="120"/>
+        <w:jc w:val="center"/>
+      </w:pPr>
+      <w:r>
+        <w:rPr>
+          <w:rFonts w:ascii="Calibri" w:hAnsi="Calibri"/>
+          <w:b/>
+          <w:color w:val="566B56"/>
+          <w:sz w:val="22"/>
+        </w:rPr>
+        <w:t>π_t = π_t^e - λ · (u_t - u_n)</w:t>
+      </w:r>
+    </w:p>
+    <w:p>
+      <w:pPr>
         <w:spacing w:after="90" w:line="276" w:lineRule="auto"/>
         <w:ind w:left="0" w:firstLine="0"/>
         <w:jc w:val="both"/>
@@ -10100,7 +10220,22 @@
           <w:color w:val="566B56"/>
           <w:sz w:val="21"/>
         </w:rPr>
-        <w:t>= Tasa de inflación actual</w:t>
+        <w:t>π_t: Tasa de inflación observada actual</w:t>
+      </w:r>
+    </w:p>
+    <w:p>
+      <w:pPr>
+        <w:spacing w:after="90" w:line="276" w:lineRule="auto"/>
+        <w:ind w:left="0" w:firstLine="0"/>
+        <w:jc w:val="both"/>
+      </w:pPr>
+      <w:r>
+        <w:rPr>
+          <w:rFonts w:ascii="Calibri" w:hAnsi="Calibri"/>
+          <w:color w:val="2F3A30"/>
+          <w:sz w:val="21"/>
+        </w:rPr>
+        <w:t>π_t^e: Tasa de inflación esperada por los agentes económicos</w:t>
       </w:r>
     </w:p>
     <w:p>
@@ -10117,7 +10252,7 @@
           <w:color w:val="566B56"/>
           <w:sz w:val="21"/>
         </w:rPr>
-        <w:t>= Tasa de inflación esperada</w:t>
+        <w:t>u_t: Tasa de desempleo observada en el período</w:t>
       </w:r>
     </w:p>
     <w:p>
@@ -10134,24 +10269,7 @@
           <w:color w:val="566B56"/>
           <w:sz w:val="21"/>
         </w:rPr>
-        <w:t>= Tasa de desempleo actual</w:t>
-      </w:r>
-    </w:p>
-    <w:p>
-      <w:pPr>
-        <w:keepNext/>
-        <w:spacing w:after="40" w:line="276" w:lineRule="auto" w:before="160"/>
-        <w:ind w:left="0" w:firstLine="0"/>
-        <w:jc w:val="left"/>
-      </w:pPr>
-      <w:r>
-        <w:rPr>
-          <w:rFonts w:ascii="Calibri" w:hAnsi="Calibri"/>
-          <w:b/>
-          <w:color w:val="566B56"/>
-          <w:sz w:val="21"/>
-        </w:rPr>
-        <w:t>= Tasa natural de desempleo (NAIRU)</w:t>
+        <w:t>u_n: Tasa natural de desempleo o NAIRU</w:t>
       </w:r>
     </w:p>
     <w:p>
@@ -10166,7 +10284,7 @@
           <w:color w:val="2F3A30"/>
           <w:sz w:val="21"/>
         </w:rPr>
-        <w:t>= Parámetro que mide la sensibilidad de la inflación al desempleo</w:t>
+        <w:t>λ: Parámetro de sensibilidad de la inflación a la brecha de desempleo</w:t>
       </w:r>
     </w:p>
     <w:p>
@@ -10263,53 +10381,92 @@
     </w:p>
     <w:p>
       <w:pPr>
-        <w:keepNext/>
-        <w:spacing w:after="40" w:line="276" w:lineRule="auto" w:before="160"/>
-        <w:ind w:left="0" w:firstLine="0"/>
-        <w:jc w:val="left"/>
-      </w:pPr>
+        <w:spacing w:after="70"/>
+        <w:ind w:left="504" w:hanging="259"/>
+        <w:jc w:val="both"/>
+      </w:pPr>
+      <w:r>
+        <w:rPr>
+          <w:rFonts w:ascii="Calibri" w:hAnsi="Calibri"/>
+          <w:b/>
+          <w:color w:val="76927A"/>
+        </w:rPr>
+        <w:t xml:space="preserve">•  </w:t>
+      </w:r>
       <w:r>
         <w:rPr>
           <w:rFonts w:ascii="Calibri" w:hAnsi="Calibri"/>
           <w:b/>
           <w:color w:val="566B56"/>
-          <w:sz w:val="21"/>
-        </w:rPr>
-        <w:t>Si , se produce una reducción de la tasa de inflación</w:t>
-      </w:r>
-    </w:p>
-    <w:p>
-      <w:pPr>
-        <w:keepNext/>
-        <w:spacing w:after="40" w:line="276" w:lineRule="auto" w:before="160"/>
-        <w:ind w:left="0" w:firstLine="0"/>
-        <w:jc w:val="left"/>
-      </w:pPr>
+        </w:rPr>
+        <w:t xml:space="preserve">Si u_t &gt; u_n: </w:t>
+      </w:r>
+      <w:r>
+        <w:rPr>
+          <w:rFonts w:ascii="Calibri" w:hAnsi="Calibri"/>
+          <w:color w:val="2F3A30"/>
+        </w:rPr>
+        <w:t>se generan presiones deflacionarias (la tasa de inflación se reduce).</w:t>
+      </w:r>
+    </w:p>
+    <w:p>
+      <w:pPr>
+        <w:spacing w:after="70"/>
+        <w:ind w:left="504" w:hanging="259"/>
+        <w:jc w:val="both"/>
+      </w:pPr>
+      <w:r>
+        <w:rPr>
+          <w:rFonts w:ascii="Calibri" w:hAnsi="Calibri"/>
+          <w:b/>
+          <w:color w:val="76927A"/>
+        </w:rPr>
+        <w:t xml:space="preserve">•  </w:t>
+      </w:r>
       <w:r>
         <w:rPr>
           <w:rFonts w:ascii="Calibri" w:hAnsi="Calibri"/>
           <w:b/>
           <w:color w:val="566B56"/>
-          <w:sz w:val="21"/>
-        </w:rPr>
-        <w:t>Si , se produce un aumento de la tasa de inflación</w:t>
-      </w:r>
-    </w:p>
-    <w:p>
-      <w:pPr>
-        <w:keepNext/>
-        <w:spacing w:after="40" w:line="276" w:lineRule="auto" w:before="160"/>
-        <w:ind w:left="0" w:firstLine="0"/>
-        <w:jc w:val="left"/>
-      </w:pPr>
+        </w:rPr>
+        <w:t xml:space="preserve">Si u_t &lt; u_n: </w:t>
+      </w:r>
+      <w:r>
+        <w:rPr>
+          <w:rFonts w:ascii="Calibri" w:hAnsi="Calibri"/>
+          <w:color w:val="2F3A30"/>
+        </w:rPr>
+        <w:t>se generan presiones inflacionarias (la tasa de inflación aumenta).</w:t>
+      </w:r>
+    </w:p>
+    <w:p>
+      <w:pPr>
+        <w:spacing w:after="70"/>
+        <w:ind w:left="504" w:hanging="259"/>
+        <w:jc w:val="both"/>
+      </w:pPr>
+      <w:r>
+        <w:rPr>
+          <w:rFonts w:ascii="Calibri" w:hAnsi="Calibri"/>
+          <w:b/>
+          <w:color w:val="76927A"/>
+        </w:rPr>
+        <w:t xml:space="preserve">•  </w:t>
+      </w:r>
       <w:r>
         <w:rPr>
           <w:rFonts w:ascii="Calibri" w:hAnsi="Calibri"/>
           <w:b/>
           <w:color w:val="566B56"/>
-          <w:sz w:val="21"/>
-        </w:rPr>
-        <w:t>Si , la tasa de inflación no varía</w:t>
+        </w:rPr>
+        <w:t xml:space="preserve">Si u_t = u_n: </w:t>
+      </w:r>
+      <w:r>
+        <w:rPr>
+          <w:rFonts w:ascii="Calibri" w:hAnsi="Calibri"/>
+          <w:color w:val="2F3A30"/>
+        </w:rPr>
+        <w:t>la inflación se mantiene estable en el nivel esperado (equilibrio NAIRU).</w:t>
       </w:r>
     </w:p>
     <w:p>
@@ -10382,6 +10539,21 @@
           <w:sz w:val="16"/>
         </w:rPr>
         <w:t>Fuente: Elaboración propia para Políticas Sociolaborales (UPO) a partir de Friedman (1968), Phelps (1967) e Instituto Nacional de Estadística (EPA y ETCL, 2024).</w:t>
+      </w:r>
+    </w:p>
+    <w:p>
+      <w:pPr>
+        <w:spacing w:before="80" w:after="120" w:line="276" w:lineRule="auto"/>
+        <w:jc w:val="both"/>
+      </w:pPr>
+      <w:r>
+        <w:rPr>
+          <w:rFonts w:ascii="Calibri" w:hAnsi="Calibri"/>
+          <w:i/>
+          <w:color w:val="2F3A30"/>
+          <w:sz w:val="19"/>
+        </w:rPr>
+        <w:t>Interpretación analítica de la Figura 1.8: En el Panel A (modelo teórico de Friedman-Phelps), un estímulo de demanda reduce coyunturalmente el desempleo a corto plazo desplazando la economía de A a B sobre CP₁; sin embargo, la revisión al alza de las expectativas de inflación desplaza la curva a CP₂, retornando el desempleo a la NAIRU en C (curva vertical a largo plazo LP). En el Panel B, la serie empírica de España (2002–2024) confirma esta dinámica: la fase de burbuja (2002-2007) dio paso a la severa devaluación salarial de 2012 (-3,6% con paro al 26%) y, tras la recuperación, al reciente shock inflacionista post-COVID con aumentos de costes salariales superiores al 5%.</w:t>
       </w:r>
     </w:p>
     <w:p>
@@ -11113,6 +11285,21 @@
     </w:p>
     <w:p>
       <w:pPr>
+        <w:spacing w:before="120" w:after="120"/>
+        <w:jc w:val="center"/>
+      </w:pPr>
+      <w:r>
+        <w:rPr>
+          <w:rFonts w:ascii="Calibri" w:hAnsi="Calibri"/>
+          <w:b/>
+          <w:color w:val="566B56"/>
+          <w:sz w:val="22"/>
+        </w:rPr>
+        <w:t>Condición de equilibrio dinámico:  ΔU = s · E - f · U = 0</w:t>
+      </w:r>
+    </w:p>
+    <w:p>
+      <w:pPr>
         <w:spacing w:after="90" w:line="276" w:lineRule="auto"/>
         <w:ind w:left="0" w:firstLine="0"/>
         <w:jc w:val="both"/>
@@ -11124,6 +11311,21 @@
           <w:sz w:val="21"/>
         </w:rPr>
         <w:t>Despejando esta condición de equilibrio se obtiene la tasa de desempleo de equilibrio:</w:t>
+      </w:r>
+    </w:p>
+    <w:p>
+      <w:pPr>
+        <w:spacing w:before="120" w:after="120"/>
+        <w:jc w:val="center"/>
+      </w:pPr>
+      <w:r>
+        <w:rPr>
+          <w:rFonts w:ascii="Calibri" w:hAnsi="Calibri"/>
+          <w:b/>
+          <w:color w:val="566B56"/>
+          <w:sz w:val="22"/>
+        </w:rPr>
+        <w:t>Tasa de desempleo de estado estacionario:  u* = s / (s + f)</w:t>
       </w:r>
     </w:p>
     <w:p>
@@ -11248,6 +11450,21 @@
     </w:p>
     <w:p>
       <w:pPr>
+        <w:spacing w:before="80" w:after="120" w:line="276" w:lineRule="auto"/>
+        <w:jc w:val="both"/>
+      </w:pPr>
+      <w:r>
+        <w:rPr>
+          <w:rFonts w:ascii="Calibri" w:hAnsi="Calibri"/>
+          <w:i/>
+          <w:color w:val="2F3A30"/>
+          <w:sz w:val="19"/>
+        </w:rPr>
+        <w:t>Interpretación analítica de la Figura 1.9: El Panel A sintetiza el modelo teórico de emparejamiento (DMP): los ciclos económicos generan oscilaciones a lo largo de la curva (expansión vs. recesión), mientras que los desajustes estructurales de cualificación (mismatch) desplazan la curva hacia el exterior (E₁ → E₂). El Panel B muestra la estimación empírica en España (1980–2024): tras el shock de la Gran Recesión que desplazó la curva del Punto A al Punto B (+5 p.p. de paro estructural), la recuperación reciente hasta 2024 ha situado las vacantes en máximos históricos (0,73%) mientras el desempleo se sitúa en el 11,3%, confirmando un problema persistente de emparejamiento.</w:t>
+      </w:r>
+    </w:p>
+    <w:p>
+      <w:pPr>
         <w:spacing w:after="70"/>
         <w:ind w:left="504" w:hanging="259"/>
         <w:jc w:val="both"/>
@@ -11489,6 +11706,21 @@
     </w:p>
     <w:p>
       <w:pPr>
+        <w:spacing w:before="120" w:after="120"/>
+        <w:jc w:val="center"/>
+      </w:pPr>
+      <w:r>
+        <w:rPr>
+          <w:rFonts w:ascii="Calibri" w:hAnsi="Calibri"/>
+          <w:b/>
+          <w:color w:val="566B56"/>
+          <w:sz w:val="22"/>
+        </w:rPr>
+        <w:t>Función de emparejamiento (matching function):  m = f(U, V, A) = A · U^α · V^(1-α)</w:t>
+      </w:r>
+    </w:p>
+    <w:p>
+      <w:pPr>
         <w:spacing w:after="90" w:line="276" w:lineRule="auto"/>
         <w:ind w:left="0" w:firstLine="0"/>
         <w:jc w:val="both"/>
@@ -11515,7 +11747,1085 @@
           <w:color w:val="2F3A30"/>
           <w:sz w:val="21"/>
         </w:rPr>
-        <w:t>= Número de emparejamientos (contrataciones) por período</w:t>
+        <w:t>m: Número de contrataciones o emparejamientos realizados por período</w:t>
+      </w:r>
+    </w:p>
+    <w:p>
+      <w:pPr>
+        <w:spacing w:after="90" w:line="276" w:lineRule="auto"/>
+        <w:ind w:left="0" w:firstLine="0"/>
+        <w:jc w:val="both"/>
+      </w:pPr>
+      <w:r>
+        <w:rPr>
+          <w:rFonts w:ascii="Calibri" w:hAnsi="Calibri"/>
+          <w:color w:val="2F3A30"/>
+          <w:sz w:val="21"/>
+        </w:rPr>
+        <w:t>U: Stock de personas desempleadas al inicio del período</w:t>
+      </w:r>
+    </w:p>
+    <w:p>
+      <w:pPr>
+        <w:spacing w:after="90" w:line="276" w:lineRule="auto"/>
+        <w:ind w:left="0" w:firstLine="0"/>
+        <w:jc w:val="both"/>
+      </w:pPr>
+      <w:r>
+        <w:rPr>
+          <w:rFonts w:ascii="Calibri" w:hAnsi="Calibri"/>
+          <w:color w:val="2F3A30"/>
+          <w:sz w:val="21"/>
+        </w:rPr>
+        <w:t>V: Stock de puestos de trabajo vacantes disponibles en la economía</w:t>
+      </w:r>
+    </w:p>
+    <w:p>
+      <w:pPr>
+        <w:spacing w:after="90" w:line="276" w:lineRule="auto"/>
+        <w:ind w:left="0" w:firstLine="0"/>
+        <w:jc w:val="both"/>
+      </w:pPr>
+      <w:r>
+        <w:rPr>
+          <w:rFonts w:ascii="Calibri" w:hAnsi="Calibri"/>
+          <w:color w:val="2F3A30"/>
+          <w:sz w:val="21"/>
+        </w:rPr>
+        <w:t>A: Parámetro de eficiencia tecnológica e institucional del emparejamiento</w:t>
+      </w:r>
+    </w:p>
+    <w:p>
+      <w:pPr>
+        <w:spacing w:after="70"/>
+        <w:ind w:left="504" w:hanging="259"/>
+        <w:jc w:val="both"/>
+      </w:pPr>
+      <w:r>
+        <w:rPr>
+          <w:rFonts w:ascii="Calibri" w:hAnsi="Calibri"/>
+          <w:b/>
+          <w:color w:val="76927A"/>
+        </w:rPr>
+        <w:t xml:space="preserve">•  </w:t>
+      </w:r>
+      <w:r>
+        <w:rPr>
+          <w:rFonts w:ascii="Calibri" w:hAnsi="Calibri"/>
+          <w:b/>
+          <w:color w:val="566B56"/>
+        </w:rPr>
+        <w:t xml:space="preserve">Insight fundamental: </w:t>
+      </w:r>
+      <w:r>
+        <w:rPr>
+          <w:rFonts w:ascii="Calibri" w:hAnsi="Calibri"/>
+          <w:color w:val="2F3A30"/>
+        </w:rPr>
+        <w:t>Esta ecuación destaca que el número de contrataciones no solo depende del número de vacantes y desempleados, sino también de la eficiencia del proceso de emparejamiento. Dos economías con el mismo número de vacantes y desempleados podrían tener diferentes tasas de paro debido a diferencias en la eficiencia del emparejamiento.</w:t>
+      </w:r>
+    </w:p>
+    <w:p>
+      <w:pPr>
+        <w:pStyle w:val="Heading2"/>
+        <w:keepNext/>
+        <w:spacing w:before="360" w:after="100"/>
+        <w:jc w:val="left"/>
+      </w:pPr>
+      <w:r>
+        <w:rPr>
+          <w:rFonts w:ascii="Poppins" w:hAnsi="Poppins"/>
+          <w:b/>
+          <w:color w:val="76927A"/>
+          <w:sz w:val="25"/>
+        </w:rPr>
+        <w:t>6.2. Interpretación de movimientos y desplazamientos</w:t>
+      </w:r>
+    </w:p>
+    <w:p>
+      <w:pPr>
+        <w:spacing w:after="90" w:line="276" w:lineRule="auto"/>
+        <w:ind w:left="0" w:firstLine="0"/>
+        <w:jc w:val="both"/>
+      </w:pPr>
+      <w:r>
+        <w:rPr>
+          <w:rFonts w:ascii="Calibri" w:hAnsi="Calibri"/>
+          <w:b/>
+          <w:color w:val="2F3A30"/>
+          <w:sz w:val="21"/>
+        </w:rPr>
+        <w:t>Características Clave de la Curva de Beveridge:</w:t>
+      </w:r>
+    </w:p>
+    <w:p>
+      <w:pPr>
+        <w:spacing w:after="70"/>
+        <w:ind w:left="504" w:hanging="259"/>
+        <w:jc w:val="both"/>
+      </w:pPr>
+      <w:r>
+        <w:rPr>
+          <w:rFonts w:ascii="Calibri" w:hAnsi="Calibri"/>
+          <w:b/>
+          <w:color w:val="76927A"/>
+        </w:rPr>
+        <w:t xml:space="preserve">•  </w:t>
+      </w:r>
+      <w:r>
+        <w:rPr>
+          <w:rFonts w:ascii="Calibri" w:hAnsi="Calibri"/>
+          <w:b/>
+          <w:color w:val="566B56"/>
+        </w:rPr>
+        <w:t xml:space="preserve">Forma: </w:t>
+      </w:r>
+      <w:r>
+        <w:rPr>
+          <w:rFonts w:ascii="Calibri" w:hAnsi="Calibri"/>
+          <w:color w:val="2F3A30"/>
+        </w:rPr>
+        <w:t>La curva tiene una pendiente negativa, reflejando la relación inversa entre vacantes y desempleo.</w:t>
+      </w:r>
+    </w:p>
+    <w:p>
+      <w:pPr>
+        <w:spacing w:after="70"/>
+        <w:ind w:left="504" w:hanging="259"/>
+        <w:jc w:val="both"/>
+      </w:pPr>
+      <w:r>
+        <w:rPr>
+          <w:rFonts w:ascii="Calibri" w:hAnsi="Calibri"/>
+          <w:b/>
+          <w:color w:val="76927A"/>
+        </w:rPr>
+        <w:t xml:space="preserve">•  </w:t>
+      </w:r>
+      <w:r>
+        <w:rPr>
+          <w:rFonts w:ascii="Calibri" w:hAnsi="Calibri"/>
+          <w:b/>
+          <w:color w:val="566B56"/>
+        </w:rPr>
+        <w:t xml:space="preserve">No intersección con los ejes: </w:t>
+      </w:r>
+      <w:r>
+        <w:rPr>
+          <w:rFonts w:ascii="Calibri" w:hAnsi="Calibri"/>
+          <w:color w:val="2F3A30"/>
+        </w:rPr>
+        <w:t>La curva nunca corta los ejes, indicando que siempre existirá algún nivel de vacantes y desempleo en la economía.</w:t>
+      </w:r>
+    </w:p>
+    <w:p>
+      <w:pPr>
+        <w:spacing w:after="70"/>
+        <w:ind w:left="504" w:hanging="259"/>
+        <w:jc w:val="both"/>
+      </w:pPr>
+      <w:r>
+        <w:rPr>
+          <w:rFonts w:ascii="Calibri" w:hAnsi="Calibri"/>
+          <w:b/>
+          <w:color w:val="76927A"/>
+        </w:rPr>
+        <w:t xml:space="preserve">•  </w:t>
+      </w:r>
+      <w:r>
+        <w:rPr>
+          <w:rFonts w:ascii="Calibri" w:hAnsi="Calibri"/>
+          <w:b/>
+          <w:color w:val="566B56"/>
+        </w:rPr>
+        <w:t xml:space="preserve">Punto de equilibrio: </w:t>
+      </w:r>
+      <w:r>
+        <w:rPr>
+          <w:rFonts w:ascii="Calibri" w:hAnsi="Calibri"/>
+          <w:color w:val="2F3A30"/>
+        </w:rPr>
+        <w:t>El punto donde la curva cruza la línea de 45 grados representa la tasa natural de desempleo, donde la tasa de vacantes iguala a la tasa de paro.</w:t>
+      </w:r>
+    </w:p>
+    <w:p>
+      <w:pPr>
+        <w:spacing w:after="90" w:line="276" w:lineRule="auto"/>
+        <w:ind w:left="0" w:firstLine="0"/>
+        <w:jc w:val="both"/>
+      </w:pPr>
+      <w:r>
+        <w:rPr>
+          <w:rFonts w:ascii="Calibri" w:hAnsi="Calibri"/>
+          <w:b/>
+          <w:color w:val="2F3A30"/>
+          <w:sz w:val="21"/>
+        </w:rPr>
+        <w:t>Interpretación de movimientos:</w:t>
+      </w:r>
+    </w:p>
+    <w:p>
+      <w:pPr>
+        <w:spacing w:after="90" w:line="276" w:lineRule="auto"/>
+        <w:ind w:left="0" w:firstLine="0"/>
+        <w:jc w:val="both"/>
+      </w:pPr>
+      <w:r>
+        <w:rPr>
+          <w:rFonts w:ascii="Calibri" w:hAnsi="Calibri"/>
+          <w:color w:val="2F3A30"/>
+          <w:sz w:val="21"/>
+        </w:rPr>
+        <w:t>La Curva de Beveridge proporciona información valiosa sobre el estado del mercado laboral:</w:t>
+      </w:r>
+    </w:p>
+    <w:p>
+      <w:pPr>
+        <w:spacing w:after="70"/>
+        <w:ind w:left="504" w:hanging="259"/>
+        <w:jc w:val="both"/>
+      </w:pPr>
+      <w:r>
+        <w:rPr>
+          <w:rFonts w:ascii="Calibri" w:hAnsi="Calibri"/>
+          <w:b/>
+          <w:color w:val="76927A"/>
+        </w:rPr>
+        <w:t xml:space="preserve">•  </w:t>
+      </w:r>
+      <w:r>
+        <w:rPr>
+          <w:rFonts w:ascii="Calibri" w:hAnsi="Calibri"/>
+          <w:b/>
+          <w:color w:val="566B56"/>
+        </w:rPr>
+        <w:t xml:space="preserve">Movimientos a lo largo de la curva: </w:t>
+      </w:r>
+      <w:r>
+        <w:rPr>
+          <w:rFonts w:ascii="Calibri" w:hAnsi="Calibri"/>
+          <w:color w:val="2F3A30"/>
+        </w:rPr>
+        <w:t>Reflejan cambios cíclicos en la economía:</w:t>
+      </w:r>
+    </w:p>
+    <w:p>
+      <w:pPr>
+        <w:spacing w:after="70"/>
+        <w:ind w:left="504" w:hanging="259"/>
+        <w:jc w:val="both"/>
+      </w:pPr>
+      <w:r>
+        <w:rPr>
+          <w:rFonts w:ascii="Calibri" w:hAnsi="Calibri"/>
+          <w:b/>
+          <w:color w:val="76927A"/>
+        </w:rPr>
+        <w:t xml:space="preserve">•  </w:t>
+      </w:r>
+      <w:r>
+        <w:rPr>
+          <w:rFonts w:ascii="Calibri" w:hAnsi="Calibri"/>
+          <w:b/>
+          <w:color w:val="566B56"/>
+        </w:rPr>
+        <w:t xml:space="preserve">Durante una recesión: </w:t>
+      </w:r>
+      <w:r>
+        <w:rPr>
+          <w:rFonts w:ascii="Calibri" w:hAnsi="Calibri"/>
+          <w:color w:val="2F3A30"/>
+        </w:rPr>
+        <w:t>La economía se mueve hacia arriba y a la derecha (mayor desempleo, menos vacantes)</w:t>
+      </w:r>
+    </w:p>
+    <w:p>
+      <w:pPr>
+        <w:spacing w:after="70"/>
+        <w:ind w:left="504" w:hanging="259"/>
+        <w:jc w:val="both"/>
+      </w:pPr>
+      <w:r>
+        <w:rPr>
+          <w:rFonts w:ascii="Calibri" w:hAnsi="Calibri"/>
+          <w:b/>
+          <w:color w:val="76927A"/>
+        </w:rPr>
+        <w:t xml:space="preserve">•  </w:t>
+      </w:r>
+      <w:r>
+        <w:rPr>
+          <w:rFonts w:ascii="Calibri" w:hAnsi="Calibri"/>
+          <w:b/>
+          <w:color w:val="566B56"/>
+        </w:rPr>
+        <w:t xml:space="preserve">En períodos de expansión: </w:t>
+      </w:r>
+      <w:r>
+        <w:rPr>
+          <w:rFonts w:ascii="Calibri" w:hAnsi="Calibri"/>
+          <w:color w:val="2F3A30"/>
+        </w:rPr>
+        <w:t>Se mueve hacia abajo y a la izquierda (menor desempleo, más vacantes)</w:t>
+      </w:r>
+    </w:p>
+    <w:p>
+      <w:pPr>
+        <w:spacing w:after="70"/>
+        <w:ind w:left="504" w:hanging="259"/>
+        <w:jc w:val="both"/>
+      </w:pPr>
+      <w:r>
+        <w:rPr>
+          <w:rFonts w:ascii="Calibri" w:hAnsi="Calibri"/>
+          <w:b/>
+          <w:color w:val="76927A"/>
+        </w:rPr>
+        <w:t xml:space="preserve">•  </w:t>
+      </w:r>
+      <w:r>
+        <w:rPr>
+          <w:rFonts w:ascii="Calibri" w:hAnsi="Calibri"/>
+          <w:b/>
+          <w:color w:val="566B56"/>
+        </w:rPr>
+        <w:t xml:space="preserve">Desplazamientos de la curva: </w:t>
+      </w:r>
+      <w:r>
+        <w:rPr>
+          <w:rFonts w:ascii="Calibri" w:hAnsi="Calibri"/>
+          <w:color w:val="2F3A30"/>
+        </w:rPr>
+        <w:t>Indican cambios estructurales en el mercado laboral:</w:t>
+      </w:r>
+    </w:p>
+    <w:p>
+      <w:pPr>
+        <w:spacing w:after="90" w:line="276" w:lineRule="auto"/>
+        <w:ind w:left="0" w:firstLine="0"/>
+        <w:jc w:val="both"/>
+      </w:pPr>
+      <w:r>
+        <w:rPr>
+          <w:rFonts w:ascii="Calibri" w:hAnsi="Calibri"/>
+          <w:b/>
+          <w:color w:val="2F3A30"/>
+          <w:sz w:val="21"/>
+        </w:rPr>
+        <w:t>Desplazamiento hacia afuera (alejándose del origen): Sugiere un empeoramiento en la eficiencia del emparejamiento, posiblemente debido a un aumento en el desempleo estructural</w:t>
+      </w:r>
+    </w:p>
+    <w:p>
+      <w:pPr>
+        <w:spacing w:after="70"/>
+        <w:ind w:left="504" w:hanging="259"/>
+        <w:jc w:val="both"/>
+      </w:pPr>
+      <w:r>
+        <w:rPr>
+          <w:rFonts w:ascii="Calibri" w:hAnsi="Calibri"/>
+          <w:b/>
+          <w:color w:val="76927A"/>
+        </w:rPr>
+        <w:t xml:space="preserve">•  </w:t>
+      </w:r>
+      <w:r>
+        <w:rPr>
+          <w:rFonts w:ascii="Calibri" w:hAnsi="Calibri"/>
+          <w:b/>
+          <w:color w:val="566B56"/>
+        </w:rPr>
+        <w:t xml:space="preserve">Desplazamiento hacia adentro: </w:t>
+      </w:r>
+      <w:r>
+        <w:rPr>
+          <w:rFonts w:ascii="Calibri" w:hAnsi="Calibri"/>
+          <w:color w:val="2F3A30"/>
+        </w:rPr>
+        <w:t>Indica una mejora en la eficiencia del mercado laboral</w:t>
+      </w:r>
+    </w:p>
+    <w:p>
+      <w:pPr>
+        <w:pStyle w:val="Heading2"/>
+        <w:keepNext/>
+        <w:spacing w:before="360" w:after="100"/>
+        <w:jc w:val="left"/>
+      </w:pPr>
+      <w:r>
+        <w:rPr>
+          <w:rFonts w:ascii="Poppins" w:hAnsi="Poppins"/>
+          <w:b/>
+          <w:color w:val="76927A"/>
+          <w:sz w:val="25"/>
+        </w:rPr>
+        <w:t>6.3. Eficiencia del proceso de emparejamiento</w:t>
+      </w:r>
+    </w:p>
+    <w:p>
+      <w:pPr>
+        <w:spacing w:after="90" w:line="276" w:lineRule="auto"/>
+        <w:ind w:left="0" w:firstLine="0"/>
+        <w:jc w:val="both"/>
+      </w:pPr>
+      <w:r>
+        <w:rPr>
+          <w:rFonts w:ascii="Calibri" w:hAnsi="Calibri"/>
+          <w:b/>
+          <w:color w:val="2F3A30"/>
+          <w:sz w:val="21"/>
+        </w:rPr>
+        <w:t>Principales características de la función de emparejamiento:</w:t>
+      </w:r>
+    </w:p>
+    <w:p>
+      <w:pPr>
+        <w:spacing w:after="70"/>
+        <w:ind w:left="504" w:hanging="259"/>
+        <w:jc w:val="both"/>
+      </w:pPr>
+      <w:r>
+        <w:rPr>
+          <w:rFonts w:ascii="Calibri" w:hAnsi="Calibri"/>
+          <w:b/>
+          <w:color w:val="76927A"/>
+        </w:rPr>
+        <w:t xml:space="preserve">•  </w:t>
+      </w:r>
+      <w:r>
+        <w:rPr>
+          <w:rFonts w:ascii="Calibri" w:hAnsi="Calibri"/>
+          <w:b/>
+          <w:color w:val="566B56"/>
+        </w:rPr>
+        <w:t xml:space="preserve">Relación inversa: </w:t>
+      </w:r>
+      <w:r>
+        <w:rPr>
+          <w:rFonts w:ascii="Calibri" w:hAnsi="Calibri"/>
+          <w:color w:val="2F3A30"/>
+        </w:rPr>
+        <w:t>Típicamente muestra una relación negativa entre vacantes y desempleo. Cuando hay muchas vacantes, el desempleo tiende a ser bajo, y viceversa.</w:t>
+      </w:r>
+    </w:p>
+    <w:p>
+      <w:pPr>
+        <w:spacing w:after="70"/>
+        <w:ind w:left="504" w:hanging="259"/>
+        <w:jc w:val="both"/>
+      </w:pPr>
+      <w:r>
+        <w:rPr>
+          <w:rFonts w:ascii="Calibri" w:hAnsi="Calibri"/>
+          <w:b/>
+          <w:color w:val="76927A"/>
+        </w:rPr>
+        <w:t xml:space="preserve">•  </w:t>
+      </w:r>
+      <w:r>
+        <w:rPr>
+          <w:rFonts w:ascii="Calibri" w:hAnsi="Calibri"/>
+          <w:b/>
+          <w:color w:val="566B56"/>
+        </w:rPr>
+        <w:t xml:space="preserve">Eficiencia del mercado laboral: </w:t>
+      </w:r>
+      <w:r>
+        <w:rPr>
+          <w:rFonts w:ascii="Calibri" w:hAnsi="Calibri"/>
+          <w:color w:val="2F3A30"/>
+        </w:rPr>
+        <w:t>La posición de la curva respecto al origen indica qué tan eficiente es el proceso de emparejamiento entre trabajadores y puestos vacantes. Una curva más cercana al origen sugiere un mercado laboral más eficiente.</w:t>
+      </w:r>
+    </w:p>
+    <w:p>
+      <w:pPr>
+        <w:spacing w:after="70"/>
+        <w:ind w:left="504" w:hanging="259"/>
+        <w:jc w:val="both"/>
+      </w:pPr>
+      <w:r>
+        <w:rPr>
+          <w:rFonts w:ascii="Calibri" w:hAnsi="Calibri"/>
+          <w:b/>
+          <w:color w:val="76927A"/>
+        </w:rPr>
+        <w:t xml:space="preserve">•  </w:t>
+      </w:r>
+      <w:r>
+        <w:rPr>
+          <w:rFonts w:ascii="Calibri" w:hAnsi="Calibri"/>
+          <w:b/>
+          <w:color w:val="566B56"/>
+        </w:rPr>
+        <w:t xml:space="preserve">Tipos de desempleo: </w:t>
+      </w:r>
+      <w:r>
+        <w:rPr>
+          <w:rFonts w:ascii="Calibri" w:hAnsi="Calibri"/>
+          <w:color w:val="2F3A30"/>
+        </w:rPr>
+        <w:t>Ayuda a distinguir entre:</w:t>
+      </w:r>
+    </w:p>
+    <w:p>
+      <w:pPr>
+        <w:spacing w:after="70"/>
+        <w:ind w:left="504" w:hanging="259"/>
+        <w:jc w:val="both"/>
+      </w:pPr>
+      <w:r>
+        <w:rPr>
+          <w:rFonts w:ascii="Calibri" w:hAnsi="Calibri"/>
+          <w:b/>
+          <w:color w:val="76927A"/>
+        </w:rPr>
+        <w:t xml:space="preserve">•  </w:t>
+      </w:r>
+      <w:r>
+        <w:rPr>
+          <w:rFonts w:ascii="Calibri" w:hAnsi="Calibri"/>
+          <w:b/>
+          <w:color w:val="566B56"/>
+        </w:rPr>
+        <w:t xml:space="preserve">Desempleo friccional/cíclico: </w:t>
+      </w:r>
+      <w:r>
+        <w:rPr>
+          <w:rFonts w:ascii="Calibri" w:hAnsi="Calibri"/>
+          <w:color w:val="2F3A30"/>
+        </w:rPr>
+        <w:t>Movimientos a lo largo de la curva</w:t>
+      </w:r>
+    </w:p>
+    <w:p>
+      <w:pPr>
+        <w:spacing w:after="70"/>
+        <w:ind w:left="504" w:hanging="259"/>
+        <w:jc w:val="both"/>
+      </w:pPr>
+      <w:r>
+        <w:rPr>
+          <w:rFonts w:ascii="Calibri" w:hAnsi="Calibri"/>
+          <w:b/>
+          <w:color w:val="76927A"/>
+        </w:rPr>
+        <w:t xml:space="preserve">•  </w:t>
+      </w:r>
+      <w:r>
+        <w:rPr>
+          <w:rFonts w:ascii="Calibri" w:hAnsi="Calibri"/>
+          <w:b/>
+          <w:color w:val="566B56"/>
+        </w:rPr>
+        <w:t xml:space="preserve">Desempleo estructural: </w:t>
+      </w:r>
+      <w:r>
+        <w:rPr>
+          <w:rFonts w:ascii="Calibri" w:hAnsi="Calibri"/>
+          <w:color w:val="2F3A30"/>
+        </w:rPr>
+        <w:t>Desplazamientos de la curva</w:t>
+      </w:r>
+    </w:p>
+    <w:p>
+      <w:pPr>
+        <w:spacing w:after="70"/>
+        <w:ind w:left="504" w:hanging="259"/>
+        <w:jc w:val="both"/>
+      </w:pPr>
+      <w:r>
+        <w:rPr>
+          <w:rFonts w:ascii="Calibri" w:hAnsi="Calibri"/>
+          <w:b/>
+          <w:color w:val="76927A"/>
+        </w:rPr>
+        <w:t xml:space="preserve">•  </w:t>
+      </w:r>
+      <w:r>
+        <w:rPr>
+          <w:rFonts w:ascii="Calibri" w:hAnsi="Calibri"/>
+          <w:b/>
+          <w:color w:val="566B56"/>
+        </w:rPr>
+        <w:t xml:space="preserve">Análisis dinámico: </w:t>
+      </w:r>
+      <w:r>
+        <w:rPr>
+          <w:rFonts w:ascii="Calibri" w:hAnsi="Calibri"/>
+          <w:color w:val="2F3A30"/>
+        </w:rPr>
+        <w:t>Permite estudiar cómo cambia la relación entre vacantes y desempleo a lo largo del tiempo.</w:t>
+      </w:r>
+    </w:p>
+    <w:p>
+      <w:pPr>
+        <w:spacing w:after="70"/>
+        <w:ind w:left="504" w:hanging="259"/>
+        <w:jc w:val="both"/>
+      </w:pPr>
+      <w:r>
+        <w:rPr>
+          <w:rFonts w:ascii="Calibri" w:hAnsi="Calibri"/>
+          <w:b/>
+          <w:color w:val="76927A"/>
+        </w:rPr>
+        <w:t xml:space="preserve">•  </w:t>
+      </w:r>
+      <w:r>
+        <w:rPr>
+          <w:rFonts w:ascii="Calibri" w:hAnsi="Calibri"/>
+          <w:b/>
+          <w:color w:val="566B56"/>
+        </w:rPr>
+        <w:t xml:space="preserve">Herramienta de política: </w:t>
+      </w:r>
+      <w:r>
+        <w:rPr>
+          <w:rFonts w:ascii="Calibri" w:hAnsi="Calibri"/>
+          <w:color w:val="2F3A30"/>
+        </w:rPr>
+        <w:t>Es útil para analizar la efectividad de políticas laborales y identificar problemas estructurales en el mercado de trabajo.</w:t>
+      </w:r>
+    </w:p>
+    <w:p>
+      <w:pPr>
+        <w:spacing w:after="90" w:line="276" w:lineRule="auto"/>
+        <w:ind w:left="0" w:firstLine="0"/>
+        <w:jc w:val="both"/>
+      </w:pPr>
+      <w:r>
+        <w:rPr>
+          <w:rFonts w:ascii="Calibri" w:hAnsi="Calibri"/>
+          <w:b/>
+          <w:color w:val="2F3A30"/>
+          <w:sz w:val="21"/>
+        </w:rPr>
+        <w:t>Análisis de los Movimientos Específicos en la Curva de Beveridge:</w:t>
+      </w:r>
+    </w:p>
+    <w:p>
+      <w:pPr>
+        <w:spacing w:after="70"/>
+        <w:ind w:left="504" w:hanging="259"/>
+        <w:jc w:val="both"/>
+      </w:pPr>
+      <w:r>
+        <w:rPr>
+          <w:rFonts w:ascii="Calibri" w:hAnsi="Calibri"/>
+          <w:b/>
+          <w:color w:val="76927A"/>
+        </w:rPr>
+        <w:t xml:space="preserve">•  </w:t>
+      </w:r>
+      <w:r>
+        <w:rPr>
+          <w:rFonts w:ascii="Calibri" w:hAnsi="Calibri"/>
+          <w:b/>
+          <w:color w:val="566B56"/>
+        </w:rPr>
+        <w:t xml:space="preserve">Punto A (Tasa Natural de Paro): </w:t>
+      </w:r>
+      <w:r>
+        <w:rPr>
+          <w:rFonts w:ascii="Calibri" w:hAnsi="Calibri"/>
+          <w:color w:val="2F3A30"/>
+        </w:rPr>
+        <w:t>Representa una situación donde la tasa de desempleo es igual a la tasa de vacantes. En este punto, todo el desempleo es friccional o estructural, sin componente cíclico.</w:t>
+      </w:r>
+    </w:p>
+    <w:p>
+      <w:pPr>
+        <w:spacing w:after="90" w:line="276" w:lineRule="auto"/>
+        <w:ind w:left="0" w:firstLine="0"/>
+        <w:jc w:val="both"/>
+      </w:pPr>
+      <w:r>
+        <w:rPr>
+          <w:rFonts w:ascii="Calibri" w:hAnsi="Calibri"/>
+          <w:color w:val="2F3A30"/>
+          <w:sz w:val="21"/>
+        </w:rPr>
+        <w:t>Analogía del baile perfecto:</w:t>
+      </w:r>
+    </w:p>
+    <w:p>
+      <w:pPr>
+        <w:spacing w:after="70"/>
+        <w:ind w:left="504" w:hanging="259"/>
+        <w:jc w:val="both"/>
+      </w:pPr>
+      <w:r>
+        <w:rPr>
+          <w:rFonts w:ascii="Calibri" w:hAnsi="Calibri"/>
+          <w:b/>
+          <w:color w:val="76927A"/>
+        </w:rPr>
+        <w:t xml:space="preserve">•  </w:t>
+      </w:r>
+      <w:r>
+        <w:rPr>
+          <w:rFonts w:ascii="Calibri" w:hAnsi="Calibri"/>
+          <w:b/>
+          <w:color w:val="566B56"/>
+        </w:rPr>
+        <w:t xml:space="preserve">Equilibrio perfecto: </w:t>
+      </w:r>
+      <w:r>
+        <w:rPr>
+          <w:rFonts w:ascii="Calibri" w:hAnsi="Calibri"/>
+          <w:color w:val="2F3A30"/>
+        </w:rPr>
+        <w:t>Hay casi tantas personas buscando pareja de baile como espacios libres en la pista</w:t>
+      </w:r>
+    </w:p>
+    <w:p>
+      <w:pPr>
+        <w:spacing w:after="70"/>
+        <w:ind w:left="504" w:hanging="259"/>
+        <w:jc w:val="both"/>
+      </w:pPr>
+      <w:r>
+        <w:rPr>
+          <w:rFonts w:ascii="Calibri" w:hAnsi="Calibri"/>
+          <w:b/>
+          <w:color w:val="76927A"/>
+        </w:rPr>
+        <w:t xml:space="preserve">•  </w:t>
+      </w:r>
+      <w:r>
+        <w:rPr>
+          <w:rFonts w:ascii="Calibri" w:hAnsi="Calibri"/>
+          <w:b/>
+          <w:color w:val="566B56"/>
+        </w:rPr>
+        <w:t xml:space="preserve">Ritmo natural: </w:t>
+      </w:r>
+      <w:r>
+        <w:rPr>
+          <w:rFonts w:ascii="Calibri" w:hAnsi="Calibri"/>
+          <w:color w:val="2F3A30"/>
+        </w:rPr>
+        <w:t>La fiesta fluye con naturalidad, con movimiento constante pero no caótico</w:t>
+      </w:r>
+    </w:p>
+    <w:p>
+      <w:pPr>
+        <w:spacing w:after="70"/>
+        <w:ind w:left="504" w:hanging="259"/>
+        <w:jc w:val="both"/>
+      </w:pPr>
+      <w:r>
+        <w:rPr>
+          <w:rFonts w:ascii="Calibri" w:hAnsi="Calibri"/>
+          <w:b/>
+          <w:color w:val="76927A"/>
+        </w:rPr>
+        <w:t xml:space="preserve">•  </w:t>
+      </w:r>
+      <w:r>
+        <w:rPr>
+          <w:rFonts w:ascii="Calibri" w:hAnsi="Calibri"/>
+          <w:b/>
+          <w:color w:val="566B56"/>
+        </w:rPr>
+        <w:t xml:space="preserve">Ni muy aburrido, ni muy alocado: </w:t>
+      </w:r>
+      <w:r>
+        <w:rPr>
+          <w:rFonts w:ascii="Calibri" w:hAnsi="Calibri"/>
+          <w:color w:val="2F3A30"/>
+        </w:rPr>
+        <w:t>No hay sobrecalentamiento ni recesión</w:t>
+      </w:r>
+    </w:p>
+    <w:p>
+      <w:pPr>
+        <w:spacing w:after="70"/>
+        <w:ind w:left="504" w:hanging="259"/>
+        <w:jc w:val="both"/>
+      </w:pPr>
+      <w:r>
+        <w:rPr>
+          <w:rFonts w:ascii="Calibri" w:hAnsi="Calibri"/>
+          <w:b/>
+          <w:color w:val="76927A"/>
+        </w:rPr>
+        <w:t xml:space="preserve">•  </w:t>
+      </w:r>
+      <w:r>
+        <w:rPr>
+          <w:rFonts w:ascii="Calibri" w:hAnsi="Calibri"/>
+          <w:b/>
+          <w:color w:val="566B56"/>
+        </w:rPr>
+        <w:t xml:space="preserve">Punto de referencia: </w:t>
+      </w:r>
+      <w:r>
+        <w:rPr>
+          <w:rFonts w:ascii="Calibri" w:hAnsi="Calibri"/>
+          <w:color w:val="2F3A30"/>
+        </w:rPr>
+        <w:t>Los responsables de política económica usan este momento como referencia ideal</w:t>
+      </w:r>
+    </w:p>
+    <w:p>
+      <w:pPr>
+        <w:spacing w:after="70"/>
+        <w:ind w:left="504" w:hanging="259"/>
+        <w:jc w:val="both"/>
+      </w:pPr>
+      <w:r>
+        <w:rPr>
+          <w:rFonts w:ascii="Calibri" w:hAnsi="Calibri"/>
+          <w:b/>
+          <w:color w:val="76927A"/>
+        </w:rPr>
+        <w:t xml:space="preserve">•  </w:t>
+      </w:r>
+      <w:r>
+        <w:rPr>
+          <w:rFonts w:ascii="Calibri" w:hAnsi="Calibri"/>
+          <w:b/>
+          <w:color w:val="566B56"/>
+        </w:rPr>
+        <w:t xml:space="preserve">Punto B (Desempleo Alto): </w:t>
+      </w:r>
+      <w:r>
+        <w:rPr>
+          <w:rFonts w:ascii="Calibri" w:hAnsi="Calibri"/>
+          <w:color w:val="2F3A30"/>
+        </w:rPr>
+        <w:t>Situado por debajo de la bisectriz, indica un desempleo superior a la suma de los niveles friccional y estructural, posiblemente debido a insuficiencia de demanda o desempleo tecnológico.</w:t>
+      </w:r>
+    </w:p>
+    <w:p>
+      <w:pPr>
+        <w:spacing w:after="70"/>
+        <w:ind w:left="504" w:hanging="259"/>
+        <w:jc w:val="both"/>
+      </w:pPr>
+      <w:r>
+        <w:rPr>
+          <w:rFonts w:ascii="Calibri" w:hAnsi="Calibri"/>
+          <w:b/>
+          <w:color w:val="76927A"/>
+        </w:rPr>
+        <w:t xml:space="preserve">•  </w:t>
+      </w:r>
+      <w:r>
+        <w:rPr>
+          <w:rFonts w:ascii="Calibri" w:hAnsi="Calibri"/>
+          <w:b/>
+          <w:color w:val="566B56"/>
+        </w:rPr>
+        <w:t xml:space="preserve">Punto C (Recalentamiento): </w:t>
+      </w:r>
+      <w:r>
+        <w:rPr>
+          <w:rFonts w:ascii="Calibri" w:hAnsi="Calibri"/>
+          <w:color w:val="2F3A30"/>
+        </w:rPr>
+        <w:t>Ubicado por encima de la bisectriz, muestra una tasa de desempleo menor que la de vacantes e inferior a la suma del desempleo friccional y estructural. Puede indicar un "recalentamiento" de la economía.</w:t>
+      </w:r>
+    </w:p>
+    <w:p>
+      <w:pPr>
+        <w:pStyle w:val="Heading2"/>
+        <w:keepNext/>
+        <w:spacing w:before="360" w:after="100"/>
+        <w:jc w:val="left"/>
+      </w:pPr>
+      <w:r>
+        <w:rPr>
+          <w:rFonts w:ascii="Poppins" w:hAnsi="Poppins"/>
+          <w:b/>
+          <w:color w:val="76927A"/>
+          <w:sz w:val="25"/>
+        </w:rPr>
+        <w:t>6.4. Aplicación: el caso español durante la crisis</w:t>
+      </w:r>
+    </w:p>
+    <w:p>
+      <w:pPr>
+        <w:spacing w:after="90" w:line="276" w:lineRule="auto"/>
+        <w:ind w:left="0" w:firstLine="0"/>
+        <w:jc w:val="both"/>
+      </w:pPr>
+      <w:r>
+        <w:rPr>
+          <w:rFonts w:ascii="Calibri" w:hAnsi="Calibri"/>
+          <w:b/>
+          <w:color w:val="2F3A30"/>
+          <w:sz w:val="21"/>
+        </w:rPr>
+        <w:t>Análisis empírico del caso español (2008-2016):</w:t>
+      </w:r>
+    </w:p>
+    <w:p>
+      <w:pPr>
+        <w:spacing w:after="90" w:line="276" w:lineRule="auto"/>
+        <w:ind w:left="0" w:firstLine="0"/>
+        <w:jc w:val="both"/>
+      </w:pPr>
+      <w:r>
+        <w:rPr>
+          <w:rFonts w:ascii="Calibri" w:hAnsi="Calibri"/>
+          <w:color w:val="2F3A30"/>
+          <w:sz w:val="21"/>
+        </w:rPr>
+        <w:t>El estudio de la curva de Beveridge en España durante la crisis financiera proporciona un ejemplo práctico excepcional de cómo los cambios en la eficiencia del emparejamiento pueden impactar significativamente la economía.</w:t>
+      </w:r>
+    </w:p>
+    <w:p>
+      <w:pPr>
+        <w:spacing w:after="70"/>
+        <w:ind w:left="504" w:hanging="259"/>
+        <w:jc w:val="both"/>
+      </w:pPr>
+      <w:r>
+        <w:rPr>
+          <w:rFonts w:ascii="Calibri" w:hAnsi="Calibri"/>
+          <w:b/>
+          <w:color w:val="76927A"/>
+        </w:rPr>
+        <w:t xml:space="preserve">•  </w:t>
+      </w:r>
+      <w:r>
+        <w:rPr>
+          <w:rFonts w:ascii="Calibri" w:hAnsi="Calibri"/>
+          <w:b/>
+          <w:color w:val="566B56"/>
+        </w:rPr>
+        <w:t xml:space="preserve">Desafíos metodológicos: </w:t>
+      </w:r>
+      <w:r>
+        <w:rPr>
+          <w:rFonts w:ascii="Calibri" w:hAnsi="Calibri"/>
+          <w:color w:val="2F3A30"/>
+        </w:rPr>
+        <w:t>Los investigadores enfrentaron el desafío de la falta de una serie homogénea de datos sobre vacantes laborales. Para superar esta dificultad, construyeron una serie uniforme de vacantes desde 1980 hasta 2016, combinando datos de diversas fuentes como la OCDE, la Encuesta de Coyuntura Laboral y la Encuesta Trimestral de Coste Laboral.</w:t>
+      </w:r>
+    </w:p>
+    <w:p>
+      <w:pPr>
+        <w:spacing w:after="90" w:line="276" w:lineRule="auto"/>
+        <w:ind w:left="0" w:firstLine="0"/>
+        <w:jc w:val="both"/>
+      </w:pPr>
+      <w:r>
+        <w:rPr>
+          <w:rFonts w:ascii="Calibri" w:hAnsi="Calibri"/>
+          <w:b/>
+          <w:color w:val="2F3A30"/>
+          <w:sz w:val="21"/>
+        </w:rPr>
+        <w:t>Tres fases macroeconómicas identificadas en la serie histórica (ver Panel B de la Figura 1.9):</w:t>
+      </w:r>
+    </w:p>
+    <w:p>
+      <w:pPr>
+        <w:spacing w:after="70"/>
+        <w:ind w:left="504" w:hanging="259"/>
+        <w:jc w:val="both"/>
+      </w:pPr>
+      <w:r>
+        <w:rPr>
+          <w:rFonts w:ascii="Calibri" w:hAnsi="Calibri"/>
+          <w:b/>
+          <w:color w:val="76927A"/>
+        </w:rPr>
+        <w:t xml:space="preserve">•  </w:t>
+      </w:r>
+      <w:r>
+        <w:rPr>
+          <w:rFonts w:ascii="Calibri" w:hAnsi="Calibri"/>
+          <w:b/>
+          <w:color w:val="566B56"/>
+        </w:rPr>
+        <w:t xml:space="preserve">Fase 1 (1980–2007: </w:t>
+      </w:r>
+      <w:r>
+        <w:rPr>
+          <w:rFonts w:ascii="Calibri" w:hAnsi="Calibri"/>
+          <w:color w:val="2F3A30"/>
+        </w:rPr>
+        <w:t>Estabilidad pre-crisis y ancla en Punto A)</w:t>
+      </w:r>
+    </w:p>
+    <w:p>
+      <w:pPr>
+        <w:spacing w:after="90" w:line="276" w:lineRule="auto"/>
+        <w:ind w:left="0" w:firstLine="0"/>
+        <w:jc w:val="both"/>
+      </w:pPr>
+      <w:r>
+        <w:rPr>
+          <w:rFonts w:ascii="Calibri" w:hAnsi="Calibri"/>
+          <w:color w:val="2F3A30"/>
+          <w:sz w:val="21"/>
+        </w:rPr>
+        <w:t>Durante el período de expansión económica, la curva se mantuvo relativamente estable y cercana al origen</w:t>
+      </w:r>
+    </w:p>
+    <w:p>
+      <w:pPr>
+        <w:spacing w:after="90" w:line="276" w:lineRule="auto"/>
+        <w:ind w:left="0" w:firstLine="0"/>
+        <w:jc w:val="both"/>
+      </w:pPr>
+      <w:r>
+        <w:rPr>
+          <w:rFonts w:ascii="Calibri" w:hAnsi="Calibri"/>
+          <w:color w:val="2F3A30"/>
+          <w:sz w:val="21"/>
+        </w:rPr>
+        <w:t>Indicaba un funcionamiento eficiente del mercado laboral español</w:t>
+      </w:r>
+    </w:p>
+    <w:p>
+      <w:pPr>
+        <w:spacing w:after="70"/>
+        <w:ind w:left="504" w:hanging="259"/>
+        <w:jc w:val="both"/>
+      </w:pPr>
+      <w:r>
+        <w:rPr>
+          <w:rFonts w:ascii="Calibri" w:hAnsi="Calibri"/>
+          <w:b/>
+          <w:color w:val="76927A"/>
+        </w:rPr>
+        <w:t xml:space="preserve">•  </w:t>
+      </w:r>
+      <w:r>
+        <w:rPr>
+          <w:rFonts w:ascii="Calibri" w:hAnsi="Calibri"/>
+          <w:b/>
+          <w:color w:val="566B56"/>
+        </w:rPr>
+        <w:t xml:space="preserve">Fase 2 (2008–2013: </w:t>
+      </w:r>
+      <w:r>
+        <w:rPr>
+          <w:rFonts w:ascii="Calibri" w:hAnsi="Calibri"/>
+          <w:color w:val="2F3A30"/>
+        </w:rPr>
+        <w:t>Gran Recesión y desplazamiento hacia el Punto B)</w:t>
+      </w:r>
+    </w:p>
+    <w:p>
+      <w:pPr>
+        <w:spacing w:after="90" w:line="276" w:lineRule="auto"/>
+        <w:ind w:left="0" w:firstLine="0"/>
+        <w:jc w:val="both"/>
+      </w:pPr>
+      <w:r>
+        <w:rPr>
+          <w:rFonts w:ascii="Calibri" w:hAnsi="Calibri"/>
+          <w:color w:val="2F3A30"/>
+          <w:sz w:val="21"/>
+        </w:rPr>
+        <w:t>A partir de la crisis financiera de 2008, la curva experimentó un desplazamiento significativo hacia la derecha</w:t>
       </w:r>
     </w:p>
     <w:p>
@@ -11532,41 +12842,37 @@
           <w:color w:val="566B56"/>
           <w:sz w:val="21"/>
         </w:rPr>
-        <w:t>= Número de desempleados al comienzo del período</w:t>
-      </w:r>
-    </w:p>
-    <w:p>
-      <w:pPr>
-        <w:keepNext/>
-        <w:spacing w:after="40" w:line="276" w:lineRule="auto" w:before="160"/>
+        <w:t>Indicaba una menor eficiencia en el mercado laboral</w:t>
+      </w:r>
+    </w:p>
+    <w:p>
+      <w:pPr>
+        <w:spacing w:after="90" w:line="276" w:lineRule="auto"/>
         <w:ind w:left="0" w:firstLine="0"/>
-        <w:jc w:val="left"/>
-      </w:pPr>
-      <w:r>
-        <w:rPr>
-          <w:rFonts w:ascii="Calibri" w:hAnsi="Calibri"/>
-          <w:b/>
-          <w:color w:val="566B56"/>
+        <w:jc w:val="both"/>
+      </w:pPr>
+      <w:r>
+        <w:rPr>
+          <w:rFonts w:ascii="Calibri" w:hAnsi="Calibri"/>
+          <w:color w:val="2F3A30"/>
           <w:sz w:val="21"/>
         </w:rPr>
-        <w:t>= Número de vacantes al comienzo del período</w:t>
-      </w:r>
-    </w:p>
-    <w:p>
-      <w:pPr>
-        <w:keepNext/>
-        <w:spacing w:after="40" w:line="276" w:lineRule="auto" w:before="160"/>
+        <w:t>Reflejaba un desajuste importante entre oferta y demanda de trabajo</w:t>
+      </w:r>
+    </w:p>
+    <w:p>
+      <w:pPr>
+        <w:spacing w:after="90" w:line="276" w:lineRule="auto"/>
         <w:ind w:left="0" w:firstLine="0"/>
-        <w:jc w:val="left"/>
-      </w:pPr>
-      <w:r>
-        <w:rPr>
-          <w:rFonts w:ascii="Calibri" w:hAnsi="Calibri"/>
-          <w:b/>
-          <w:color w:val="566B56"/>
+        <w:jc w:val="both"/>
+      </w:pPr>
+      <w:r>
+        <w:rPr>
+          <w:rFonts w:ascii="Calibri" w:hAnsi="Calibri"/>
+          <w:color w:val="2F3A30"/>
           <w:sz w:val="21"/>
         </w:rPr>
-        <w:t>= Eficiencia del proceso de emparejamiento</w:t>
+        <w:t>Posiblemente vinculado a cambios estructurales como la crisis del sector de la construcción</w:t>
       </w:r>
     </w:p>
     <w:p>
@@ -11589,1094 +12895,14 @@
           <w:b/>
           <w:color w:val="566B56"/>
         </w:rPr>
-        <w:t xml:space="preserve">Insight fundamental: </w:t>
-      </w:r>
-      <w:r>
-        <w:rPr>
-          <w:rFonts w:ascii="Calibri" w:hAnsi="Calibri"/>
-          <w:color w:val="2F3A30"/>
-        </w:rPr>
-        <w:t>Esta ecuación destaca que el número de contrataciones no solo depende del número de vacantes y desempleados, sino también de la eficiencia del proceso de emparejamiento. Dos economías con el mismo número de vacantes y desempleados podrían tener diferentes tasas de paro debido a diferencias en la eficiencia del emparejamiento.</w:t>
-      </w:r>
-    </w:p>
-    <w:p>
-      <w:pPr>
-        <w:pStyle w:val="Heading2"/>
-        <w:keepNext/>
-        <w:spacing w:before="360" w:after="100"/>
-        <w:jc w:val="left"/>
-      </w:pPr>
-      <w:r>
-        <w:rPr>
-          <w:rFonts w:ascii="Poppins" w:hAnsi="Poppins"/>
-          <w:b/>
-          <w:color w:val="76927A"/>
-          <w:sz w:val="25"/>
-        </w:rPr>
-        <w:t>6.2. Interpretación de movimientos y desplazamientos</w:t>
-      </w:r>
-    </w:p>
-    <w:p>
-      <w:pPr>
-        <w:spacing w:after="90" w:line="276" w:lineRule="auto"/>
-        <w:ind w:left="0" w:firstLine="0"/>
-        <w:jc w:val="both"/>
-      </w:pPr>
-      <w:r>
-        <w:rPr>
-          <w:rFonts w:ascii="Calibri" w:hAnsi="Calibri"/>
-          <w:b/>
-          <w:color w:val="2F3A30"/>
-          <w:sz w:val="21"/>
-        </w:rPr>
-        <w:t>Características Clave de la Curva de Beveridge:</w:t>
-      </w:r>
-    </w:p>
-    <w:p>
-      <w:pPr>
-        <w:spacing w:after="70"/>
-        <w:ind w:left="504" w:hanging="259"/>
-        <w:jc w:val="both"/>
-      </w:pPr>
-      <w:r>
-        <w:rPr>
-          <w:rFonts w:ascii="Calibri" w:hAnsi="Calibri"/>
-          <w:b/>
-          <w:color w:val="76927A"/>
-        </w:rPr>
-        <w:t xml:space="preserve">•  </w:t>
-      </w:r>
-      <w:r>
-        <w:rPr>
-          <w:rFonts w:ascii="Calibri" w:hAnsi="Calibri"/>
-          <w:b/>
-          <w:color w:val="566B56"/>
-        </w:rPr>
-        <w:t xml:space="preserve">Forma: </w:t>
-      </w:r>
-      <w:r>
-        <w:rPr>
-          <w:rFonts w:ascii="Calibri" w:hAnsi="Calibri"/>
-          <w:color w:val="2F3A30"/>
-        </w:rPr>
-        <w:t>La curva tiene una pendiente negativa, reflejando la relación inversa entre vacantes y desempleo.</w:t>
-      </w:r>
-    </w:p>
-    <w:p>
-      <w:pPr>
-        <w:spacing w:after="70"/>
-        <w:ind w:left="504" w:hanging="259"/>
-        <w:jc w:val="both"/>
-      </w:pPr>
-      <w:r>
-        <w:rPr>
-          <w:rFonts w:ascii="Calibri" w:hAnsi="Calibri"/>
-          <w:b/>
-          <w:color w:val="76927A"/>
-        </w:rPr>
-        <w:t xml:space="preserve">•  </w:t>
-      </w:r>
-      <w:r>
-        <w:rPr>
-          <w:rFonts w:ascii="Calibri" w:hAnsi="Calibri"/>
-          <w:b/>
-          <w:color w:val="566B56"/>
-        </w:rPr>
-        <w:t xml:space="preserve">No intersección con los ejes: </w:t>
-      </w:r>
-      <w:r>
-        <w:rPr>
-          <w:rFonts w:ascii="Calibri" w:hAnsi="Calibri"/>
-          <w:color w:val="2F3A30"/>
-        </w:rPr>
-        <w:t>La curva nunca corta los ejes, indicando que siempre existirá algún nivel de vacantes y desempleo en la economía.</w:t>
-      </w:r>
-    </w:p>
-    <w:p>
-      <w:pPr>
-        <w:spacing w:after="70"/>
-        <w:ind w:left="504" w:hanging="259"/>
-        <w:jc w:val="both"/>
-      </w:pPr>
-      <w:r>
-        <w:rPr>
-          <w:rFonts w:ascii="Calibri" w:hAnsi="Calibri"/>
-          <w:b/>
-          <w:color w:val="76927A"/>
-        </w:rPr>
-        <w:t xml:space="preserve">•  </w:t>
-      </w:r>
-      <w:r>
-        <w:rPr>
-          <w:rFonts w:ascii="Calibri" w:hAnsi="Calibri"/>
-          <w:b/>
-          <w:color w:val="566B56"/>
-        </w:rPr>
-        <w:t xml:space="preserve">Punto de equilibrio: </w:t>
-      </w:r>
-      <w:r>
-        <w:rPr>
-          <w:rFonts w:ascii="Calibri" w:hAnsi="Calibri"/>
-          <w:color w:val="2F3A30"/>
-        </w:rPr>
-        <w:t>El punto donde la curva cruza la línea de 45 grados representa la tasa natural de desempleo, donde la tasa de vacantes iguala a la tasa de paro.</w:t>
-      </w:r>
-    </w:p>
-    <w:p>
-      <w:pPr>
-        <w:spacing w:after="90" w:line="276" w:lineRule="auto"/>
-        <w:ind w:left="0" w:firstLine="0"/>
-        <w:jc w:val="both"/>
-      </w:pPr>
-      <w:r>
-        <w:rPr>
-          <w:rFonts w:ascii="Calibri" w:hAnsi="Calibri"/>
-          <w:b/>
-          <w:color w:val="2F3A30"/>
-          <w:sz w:val="21"/>
-        </w:rPr>
-        <w:t>Interpretación de movimientos:</w:t>
-      </w:r>
-    </w:p>
-    <w:p>
-      <w:pPr>
-        <w:spacing w:after="90" w:line="276" w:lineRule="auto"/>
-        <w:ind w:left="0" w:firstLine="0"/>
-        <w:jc w:val="both"/>
-      </w:pPr>
-      <w:r>
-        <w:rPr>
-          <w:rFonts w:ascii="Calibri" w:hAnsi="Calibri"/>
-          <w:color w:val="2F3A30"/>
-          <w:sz w:val="21"/>
-        </w:rPr>
-        <w:t>La Curva de Beveridge proporciona información valiosa sobre el estado del mercado laboral:</w:t>
-      </w:r>
-    </w:p>
-    <w:p>
-      <w:pPr>
-        <w:spacing w:after="70"/>
-        <w:ind w:left="504" w:hanging="259"/>
-        <w:jc w:val="both"/>
-      </w:pPr>
-      <w:r>
-        <w:rPr>
-          <w:rFonts w:ascii="Calibri" w:hAnsi="Calibri"/>
-          <w:b/>
-          <w:color w:val="76927A"/>
-        </w:rPr>
-        <w:t xml:space="preserve">•  </w:t>
-      </w:r>
-      <w:r>
-        <w:rPr>
-          <w:rFonts w:ascii="Calibri" w:hAnsi="Calibri"/>
-          <w:b/>
-          <w:color w:val="566B56"/>
-        </w:rPr>
-        <w:t xml:space="preserve">Movimientos a lo largo de la curva: </w:t>
-      </w:r>
-      <w:r>
-        <w:rPr>
-          <w:rFonts w:ascii="Calibri" w:hAnsi="Calibri"/>
-          <w:color w:val="2F3A30"/>
-        </w:rPr>
-        <w:t>Reflejan cambios cíclicos en la economía:</w:t>
-      </w:r>
-    </w:p>
-    <w:p>
-      <w:pPr>
-        <w:spacing w:after="70"/>
-        <w:ind w:left="504" w:hanging="259"/>
-        <w:jc w:val="both"/>
-      </w:pPr>
-      <w:r>
-        <w:rPr>
-          <w:rFonts w:ascii="Calibri" w:hAnsi="Calibri"/>
-          <w:b/>
-          <w:color w:val="76927A"/>
-        </w:rPr>
-        <w:t xml:space="preserve">•  </w:t>
-      </w:r>
-      <w:r>
-        <w:rPr>
-          <w:rFonts w:ascii="Calibri" w:hAnsi="Calibri"/>
-          <w:b/>
-          <w:color w:val="566B56"/>
-        </w:rPr>
-        <w:t xml:space="preserve">Durante una recesión: </w:t>
-      </w:r>
-      <w:r>
-        <w:rPr>
-          <w:rFonts w:ascii="Calibri" w:hAnsi="Calibri"/>
-          <w:color w:val="2F3A30"/>
-        </w:rPr>
-        <w:t>La economía se mueve hacia arriba y a la derecha (mayor desempleo, menos vacantes)</w:t>
-      </w:r>
-    </w:p>
-    <w:p>
-      <w:pPr>
-        <w:spacing w:after="70"/>
-        <w:ind w:left="504" w:hanging="259"/>
-        <w:jc w:val="both"/>
-      </w:pPr>
-      <w:r>
-        <w:rPr>
-          <w:rFonts w:ascii="Calibri" w:hAnsi="Calibri"/>
-          <w:b/>
-          <w:color w:val="76927A"/>
-        </w:rPr>
-        <w:t xml:space="preserve">•  </w:t>
-      </w:r>
-      <w:r>
-        <w:rPr>
-          <w:rFonts w:ascii="Calibri" w:hAnsi="Calibri"/>
-          <w:b/>
-          <w:color w:val="566B56"/>
-        </w:rPr>
-        <w:t xml:space="preserve">En períodos de expansión: </w:t>
-      </w:r>
-      <w:r>
-        <w:rPr>
-          <w:rFonts w:ascii="Calibri" w:hAnsi="Calibri"/>
-          <w:color w:val="2F3A30"/>
-        </w:rPr>
-        <w:t>Se mueve hacia abajo y a la izquierda (menor desempleo, más vacantes)</w:t>
-      </w:r>
-    </w:p>
-    <w:p>
-      <w:pPr>
-        <w:spacing w:after="70"/>
-        <w:ind w:left="504" w:hanging="259"/>
-        <w:jc w:val="both"/>
-      </w:pPr>
-      <w:r>
-        <w:rPr>
-          <w:rFonts w:ascii="Calibri" w:hAnsi="Calibri"/>
-          <w:b/>
-          <w:color w:val="76927A"/>
-        </w:rPr>
-        <w:t xml:space="preserve">•  </w:t>
-      </w:r>
-      <w:r>
-        <w:rPr>
-          <w:rFonts w:ascii="Calibri" w:hAnsi="Calibri"/>
-          <w:b/>
-          <w:color w:val="566B56"/>
-        </w:rPr>
-        <w:t xml:space="preserve">Desplazamientos de la curva: </w:t>
-      </w:r>
-      <w:r>
-        <w:rPr>
-          <w:rFonts w:ascii="Calibri" w:hAnsi="Calibri"/>
-          <w:color w:val="2F3A30"/>
-        </w:rPr>
-        <w:t>Indican cambios estructurales en el mercado laboral:</w:t>
-      </w:r>
-    </w:p>
-    <w:p>
-      <w:pPr>
-        <w:spacing w:after="90" w:line="276" w:lineRule="auto"/>
-        <w:ind w:left="0" w:firstLine="0"/>
-        <w:jc w:val="both"/>
-      </w:pPr>
-      <w:r>
-        <w:rPr>
-          <w:rFonts w:ascii="Calibri" w:hAnsi="Calibri"/>
-          <w:b/>
-          <w:color w:val="2F3A30"/>
-          <w:sz w:val="21"/>
-        </w:rPr>
-        <w:t>Desplazamiento hacia afuera (alejándose del origen): Sugiere un empeoramiento en la eficiencia del emparejamiento, posiblemente debido a un aumento en el desempleo estructural</w:t>
-      </w:r>
-    </w:p>
-    <w:p>
-      <w:pPr>
-        <w:spacing w:after="70"/>
-        <w:ind w:left="504" w:hanging="259"/>
-        <w:jc w:val="both"/>
-      </w:pPr>
-      <w:r>
-        <w:rPr>
-          <w:rFonts w:ascii="Calibri" w:hAnsi="Calibri"/>
-          <w:b/>
-          <w:color w:val="76927A"/>
-        </w:rPr>
-        <w:t xml:space="preserve">•  </w:t>
-      </w:r>
-      <w:r>
-        <w:rPr>
-          <w:rFonts w:ascii="Calibri" w:hAnsi="Calibri"/>
-          <w:b/>
-          <w:color w:val="566B56"/>
-        </w:rPr>
-        <w:t xml:space="preserve">Desplazamiento hacia adentro: </w:t>
-      </w:r>
-      <w:r>
-        <w:rPr>
-          <w:rFonts w:ascii="Calibri" w:hAnsi="Calibri"/>
-          <w:color w:val="2F3A30"/>
-        </w:rPr>
-        <w:t>Indica una mejora en la eficiencia del mercado laboral</w:t>
-      </w:r>
-    </w:p>
-    <w:p>
-      <w:pPr>
-        <w:pStyle w:val="Heading2"/>
-        <w:keepNext/>
-        <w:spacing w:before="360" w:after="100"/>
-        <w:jc w:val="left"/>
-      </w:pPr>
-      <w:r>
-        <w:rPr>
-          <w:rFonts w:ascii="Poppins" w:hAnsi="Poppins"/>
-          <w:b/>
-          <w:color w:val="76927A"/>
-          <w:sz w:val="25"/>
-        </w:rPr>
-        <w:t>6.3. Eficiencia del proceso de emparejamiento</w:t>
-      </w:r>
-    </w:p>
-    <w:p>
-      <w:pPr>
-        <w:spacing w:after="90" w:line="276" w:lineRule="auto"/>
-        <w:ind w:left="0" w:firstLine="0"/>
-        <w:jc w:val="both"/>
-      </w:pPr>
-      <w:r>
-        <w:rPr>
-          <w:rFonts w:ascii="Calibri" w:hAnsi="Calibri"/>
-          <w:b/>
-          <w:color w:val="2F3A30"/>
-          <w:sz w:val="21"/>
-        </w:rPr>
-        <w:t>Principales características de la función de emparejamiento:</w:t>
-      </w:r>
-    </w:p>
-    <w:p>
-      <w:pPr>
-        <w:spacing w:after="70"/>
-        <w:ind w:left="504" w:hanging="259"/>
-        <w:jc w:val="both"/>
-      </w:pPr>
-      <w:r>
-        <w:rPr>
-          <w:rFonts w:ascii="Calibri" w:hAnsi="Calibri"/>
-          <w:b/>
-          <w:color w:val="76927A"/>
-        </w:rPr>
-        <w:t xml:space="preserve">•  </w:t>
-      </w:r>
-      <w:r>
-        <w:rPr>
-          <w:rFonts w:ascii="Calibri" w:hAnsi="Calibri"/>
-          <w:b/>
-          <w:color w:val="566B56"/>
-        </w:rPr>
-        <w:t xml:space="preserve">Relación inversa: </w:t>
-      </w:r>
-      <w:r>
-        <w:rPr>
-          <w:rFonts w:ascii="Calibri" w:hAnsi="Calibri"/>
-          <w:color w:val="2F3A30"/>
-        </w:rPr>
-        <w:t>Típicamente muestra una relación negativa entre vacantes y desempleo. Cuando hay muchas vacantes, el desempleo tiende a ser bajo, y viceversa.</w:t>
-      </w:r>
-    </w:p>
-    <w:p>
-      <w:pPr>
-        <w:spacing w:after="70"/>
-        <w:ind w:left="504" w:hanging="259"/>
-        <w:jc w:val="both"/>
-      </w:pPr>
-      <w:r>
-        <w:rPr>
-          <w:rFonts w:ascii="Calibri" w:hAnsi="Calibri"/>
-          <w:b/>
-          <w:color w:val="76927A"/>
-        </w:rPr>
-        <w:t xml:space="preserve">•  </w:t>
-      </w:r>
-      <w:r>
-        <w:rPr>
-          <w:rFonts w:ascii="Calibri" w:hAnsi="Calibri"/>
-          <w:b/>
-          <w:color w:val="566B56"/>
-        </w:rPr>
-        <w:t xml:space="preserve">Eficiencia del mercado laboral: </w:t>
-      </w:r>
-      <w:r>
-        <w:rPr>
-          <w:rFonts w:ascii="Calibri" w:hAnsi="Calibri"/>
-          <w:color w:val="2F3A30"/>
-        </w:rPr>
-        <w:t>La posición de la curva respecto al origen indica qué tan eficiente es el proceso de emparejamiento entre trabajadores y puestos vacantes. Una curva más cercana al origen sugiere un mercado laboral más eficiente.</w:t>
-      </w:r>
-    </w:p>
-    <w:p>
-      <w:pPr>
-        <w:spacing w:after="70"/>
-        <w:ind w:left="504" w:hanging="259"/>
-        <w:jc w:val="both"/>
-      </w:pPr>
-      <w:r>
-        <w:rPr>
-          <w:rFonts w:ascii="Calibri" w:hAnsi="Calibri"/>
-          <w:b/>
-          <w:color w:val="76927A"/>
-        </w:rPr>
-        <w:t xml:space="preserve">•  </w:t>
-      </w:r>
-      <w:r>
-        <w:rPr>
-          <w:rFonts w:ascii="Calibri" w:hAnsi="Calibri"/>
-          <w:b/>
-          <w:color w:val="566B56"/>
-        </w:rPr>
-        <w:t xml:space="preserve">Tipos de desempleo: </w:t>
-      </w:r>
-      <w:r>
-        <w:rPr>
-          <w:rFonts w:ascii="Calibri" w:hAnsi="Calibri"/>
-          <w:color w:val="2F3A30"/>
-        </w:rPr>
-        <w:t>Ayuda a distinguir entre:</w:t>
-      </w:r>
-    </w:p>
-    <w:p>
-      <w:pPr>
-        <w:spacing w:after="70"/>
-        <w:ind w:left="504" w:hanging="259"/>
-        <w:jc w:val="both"/>
-      </w:pPr>
-      <w:r>
-        <w:rPr>
-          <w:rFonts w:ascii="Calibri" w:hAnsi="Calibri"/>
-          <w:b/>
-          <w:color w:val="76927A"/>
-        </w:rPr>
-        <w:t xml:space="preserve">•  </w:t>
-      </w:r>
-      <w:r>
-        <w:rPr>
-          <w:rFonts w:ascii="Calibri" w:hAnsi="Calibri"/>
-          <w:b/>
-          <w:color w:val="566B56"/>
-        </w:rPr>
-        <w:t xml:space="preserve">Desempleo friccional/cíclico: </w:t>
-      </w:r>
-      <w:r>
-        <w:rPr>
-          <w:rFonts w:ascii="Calibri" w:hAnsi="Calibri"/>
-          <w:color w:val="2F3A30"/>
-        </w:rPr>
-        <w:t>Movimientos a lo largo de la curva</w:t>
-      </w:r>
-    </w:p>
-    <w:p>
-      <w:pPr>
-        <w:spacing w:after="70"/>
-        <w:ind w:left="504" w:hanging="259"/>
-        <w:jc w:val="both"/>
-      </w:pPr>
-      <w:r>
-        <w:rPr>
-          <w:rFonts w:ascii="Calibri" w:hAnsi="Calibri"/>
-          <w:b/>
-          <w:color w:val="76927A"/>
-        </w:rPr>
-        <w:t xml:space="preserve">•  </w:t>
-      </w:r>
-      <w:r>
-        <w:rPr>
-          <w:rFonts w:ascii="Calibri" w:hAnsi="Calibri"/>
-          <w:b/>
-          <w:color w:val="566B56"/>
-        </w:rPr>
-        <w:t xml:space="preserve">Desempleo estructural: </w:t>
-      </w:r>
-      <w:r>
-        <w:rPr>
-          <w:rFonts w:ascii="Calibri" w:hAnsi="Calibri"/>
-          <w:color w:val="2F3A30"/>
-        </w:rPr>
-        <w:t>Desplazamientos de la curva</w:t>
-      </w:r>
-    </w:p>
-    <w:p>
-      <w:pPr>
-        <w:spacing w:after="70"/>
-        <w:ind w:left="504" w:hanging="259"/>
-        <w:jc w:val="both"/>
-      </w:pPr>
-      <w:r>
-        <w:rPr>
-          <w:rFonts w:ascii="Calibri" w:hAnsi="Calibri"/>
-          <w:b/>
-          <w:color w:val="76927A"/>
-        </w:rPr>
-        <w:t xml:space="preserve">•  </w:t>
-      </w:r>
-      <w:r>
-        <w:rPr>
-          <w:rFonts w:ascii="Calibri" w:hAnsi="Calibri"/>
-          <w:b/>
-          <w:color w:val="566B56"/>
-        </w:rPr>
-        <w:t xml:space="preserve">Análisis dinámico: </w:t>
-      </w:r>
-      <w:r>
-        <w:rPr>
-          <w:rFonts w:ascii="Calibri" w:hAnsi="Calibri"/>
-          <w:color w:val="2F3A30"/>
-        </w:rPr>
-        <w:t>Permite estudiar cómo cambia la relación entre vacantes y desempleo a lo largo del tiempo.</w:t>
-      </w:r>
-    </w:p>
-    <w:p>
-      <w:pPr>
-        <w:spacing w:after="70"/>
-        <w:ind w:left="504" w:hanging="259"/>
-        <w:jc w:val="both"/>
-      </w:pPr>
-      <w:r>
-        <w:rPr>
-          <w:rFonts w:ascii="Calibri" w:hAnsi="Calibri"/>
-          <w:b/>
-          <w:color w:val="76927A"/>
-        </w:rPr>
-        <w:t xml:space="preserve">•  </w:t>
-      </w:r>
-      <w:r>
-        <w:rPr>
-          <w:rFonts w:ascii="Calibri" w:hAnsi="Calibri"/>
-          <w:b/>
-          <w:color w:val="566B56"/>
-        </w:rPr>
-        <w:t xml:space="preserve">Herramienta de política: </w:t>
-      </w:r>
-      <w:r>
-        <w:rPr>
-          <w:rFonts w:ascii="Calibri" w:hAnsi="Calibri"/>
-          <w:color w:val="2F3A30"/>
-        </w:rPr>
-        <w:t>Es útil para analizar la efectividad de políticas laborales y identificar problemas estructurales en el mercado de trabajo.</w:t>
-      </w:r>
-    </w:p>
-    <w:p>
-      <w:pPr>
-        <w:spacing w:after="90" w:line="276" w:lineRule="auto"/>
-        <w:ind w:left="0" w:firstLine="0"/>
-        <w:jc w:val="both"/>
-      </w:pPr>
-      <w:r>
-        <w:rPr>
-          <w:rFonts w:ascii="Calibri" w:hAnsi="Calibri"/>
-          <w:b/>
-          <w:color w:val="2F3A30"/>
-          <w:sz w:val="21"/>
-        </w:rPr>
-        <w:t>Análisis de los Movimientos Específicos en la Curva de Beveridge:</w:t>
-      </w:r>
-    </w:p>
-    <w:p>
-      <w:pPr>
-        <w:spacing w:after="70"/>
-        <w:ind w:left="504" w:hanging="259"/>
-        <w:jc w:val="both"/>
-      </w:pPr>
-      <w:r>
-        <w:rPr>
-          <w:rFonts w:ascii="Calibri" w:hAnsi="Calibri"/>
-          <w:b/>
-          <w:color w:val="76927A"/>
-        </w:rPr>
-        <w:t xml:space="preserve">•  </w:t>
-      </w:r>
-      <w:r>
-        <w:rPr>
-          <w:rFonts w:ascii="Calibri" w:hAnsi="Calibri"/>
-          <w:b/>
-          <w:color w:val="566B56"/>
-        </w:rPr>
-        <w:t xml:space="preserve">Punto A (Tasa Natural de Paro): </w:t>
-      </w:r>
-      <w:r>
-        <w:rPr>
-          <w:rFonts w:ascii="Calibri" w:hAnsi="Calibri"/>
-          <w:color w:val="2F3A30"/>
-        </w:rPr>
-        <w:t>Representa una situación donde la tasa de desempleo es igual a la tasa de vacantes. En este punto, todo el desempleo es friccional o estructural, sin componente cíclico.</w:t>
-      </w:r>
-    </w:p>
-    <w:p>
-      <w:pPr>
-        <w:spacing w:after="90" w:line="276" w:lineRule="auto"/>
-        <w:ind w:left="0" w:firstLine="0"/>
-        <w:jc w:val="both"/>
-      </w:pPr>
-      <w:r>
-        <w:rPr>
-          <w:rFonts w:ascii="Calibri" w:hAnsi="Calibri"/>
-          <w:color w:val="2F3A30"/>
-          <w:sz w:val="21"/>
-        </w:rPr>
-        <w:t>Analogía del baile perfecto:</w:t>
-      </w:r>
-    </w:p>
-    <w:p>
-      <w:pPr>
-        <w:spacing w:after="70"/>
-        <w:ind w:left="504" w:hanging="259"/>
-        <w:jc w:val="both"/>
-      </w:pPr>
-      <w:r>
-        <w:rPr>
-          <w:rFonts w:ascii="Calibri" w:hAnsi="Calibri"/>
-          <w:b/>
-          <w:color w:val="76927A"/>
-        </w:rPr>
-        <w:t xml:space="preserve">•  </w:t>
-      </w:r>
-      <w:r>
-        <w:rPr>
-          <w:rFonts w:ascii="Calibri" w:hAnsi="Calibri"/>
-          <w:b/>
-          <w:color w:val="566B56"/>
-        </w:rPr>
-        <w:t xml:space="preserve">Equilibrio perfecto: </w:t>
-      </w:r>
-      <w:r>
-        <w:rPr>
-          <w:rFonts w:ascii="Calibri" w:hAnsi="Calibri"/>
-          <w:color w:val="2F3A30"/>
-        </w:rPr>
-        <w:t>Hay casi tantas personas buscando pareja de baile como espacios libres en la pista</w:t>
-      </w:r>
-    </w:p>
-    <w:p>
-      <w:pPr>
-        <w:spacing w:after="70"/>
-        <w:ind w:left="504" w:hanging="259"/>
-        <w:jc w:val="both"/>
-      </w:pPr>
-      <w:r>
-        <w:rPr>
-          <w:rFonts w:ascii="Calibri" w:hAnsi="Calibri"/>
-          <w:b/>
-          <w:color w:val="76927A"/>
-        </w:rPr>
-        <w:t xml:space="preserve">•  </w:t>
-      </w:r>
-      <w:r>
-        <w:rPr>
-          <w:rFonts w:ascii="Calibri" w:hAnsi="Calibri"/>
-          <w:b/>
-          <w:color w:val="566B56"/>
-        </w:rPr>
-        <w:t xml:space="preserve">Ritmo natural: </w:t>
-      </w:r>
-      <w:r>
-        <w:rPr>
-          <w:rFonts w:ascii="Calibri" w:hAnsi="Calibri"/>
-          <w:color w:val="2F3A30"/>
-        </w:rPr>
-        <w:t>La fiesta fluye con naturalidad, con movimiento constante pero no caótico</w:t>
-      </w:r>
-    </w:p>
-    <w:p>
-      <w:pPr>
-        <w:spacing w:after="70"/>
-        <w:ind w:left="504" w:hanging="259"/>
-        <w:jc w:val="both"/>
-      </w:pPr>
-      <w:r>
-        <w:rPr>
-          <w:rFonts w:ascii="Calibri" w:hAnsi="Calibri"/>
-          <w:b/>
-          <w:color w:val="76927A"/>
-        </w:rPr>
-        <w:t xml:space="preserve">•  </w:t>
-      </w:r>
-      <w:r>
-        <w:rPr>
-          <w:rFonts w:ascii="Calibri" w:hAnsi="Calibri"/>
-          <w:b/>
-          <w:color w:val="566B56"/>
-        </w:rPr>
-        <w:t xml:space="preserve">Ni muy aburrido, ni muy alocado: </w:t>
-      </w:r>
-      <w:r>
-        <w:rPr>
-          <w:rFonts w:ascii="Calibri" w:hAnsi="Calibri"/>
-          <w:color w:val="2F3A30"/>
-        </w:rPr>
-        <w:t>No hay sobrecalentamiento ni recesión</w:t>
-      </w:r>
-    </w:p>
-    <w:p>
-      <w:pPr>
-        <w:spacing w:after="70"/>
-        <w:ind w:left="504" w:hanging="259"/>
-        <w:jc w:val="both"/>
-      </w:pPr>
-      <w:r>
-        <w:rPr>
-          <w:rFonts w:ascii="Calibri" w:hAnsi="Calibri"/>
-          <w:b/>
-          <w:color w:val="76927A"/>
-        </w:rPr>
-        <w:t xml:space="preserve">•  </w:t>
-      </w:r>
-      <w:r>
-        <w:rPr>
-          <w:rFonts w:ascii="Calibri" w:hAnsi="Calibri"/>
-          <w:b/>
-          <w:color w:val="566B56"/>
-        </w:rPr>
-        <w:t xml:space="preserve">Punto de referencia: </w:t>
-      </w:r>
-      <w:r>
-        <w:rPr>
-          <w:rFonts w:ascii="Calibri" w:hAnsi="Calibri"/>
-          <w:color w:val="2F3A30"/>
-        </w:rPr>
-        <w:t>Los responsables de política económica usan este momento como referencia ideal</w:t>
-      </w:r>
-    </w:p>
-    <w:p>
-      <w:pPr>
-        <w:spacing w:after="70"/>
-        <w:ind w:left="504" w:hanging="259"/>
-        <w:jc w:val="both"/>
-      </w:pPr>
-      <w:r>
-        <w:rPr>
-          <w:rFonts w:ascii="Calibri" w:hAnsi="Calibri"/>
-          <w:b/>
-          <w:color w:val="76927A"/>
-        </w:rPr>
-        <w:t xml:space="preserve">•  </w:t>
-      </w:r>
-      <w:r>
-        <w:rPr>
-          <w:rFonts w:ascii="Calibri" w:hAnsi="Calibri"/>
-          <w:b/>
-          <w:color w:val="566B56"/>
-        </w:rPr>
-        <w:t xml:space="preserve">Punto B (Desempleo Alto): </w:t>
-      </w:r>
-      <w:r>
-        <w:rPr>
-          <w:rFonts w:ascii="Calibri" w:hAnsi="Calibri"/>
-          <w:color w:val="2F3A30"/>
-        </w:rPr>
-        <w:t>Situado por debajo de la bisectriz, indica un desempleo superior a la suma de los niveles friccional y estructural, posiblemente debido a insuficiencia de demanda o desempleo tecnológico.</w:t>
-      </w:r>
-    </w:p>
-    <w:p>
-      <w:pPr>
-        <w:spacing w:after="70"/>
-        <w:ind w:left="504" w:hanging="259"/>
-        <w:jc w:val="both"/>
-      </w:pPr>
-      <w:r>
-        <w:rPr>
-          <w:rFonts w:ascii="Calibri" w:hAnsi="Calibri"/>
-          <w:b/>
-          <w:color w:val="76927A"/>
-        </w:rPr>
-        <w:t xml:space="preserve">•  </w:t>
-      </w:r>
-      <w:r>
-        <w:rPr>
-          <w:rFonts w:ascii="Calibri" w:hAnsi="Calibri"/>
-          <w:b/>
-          <w:color w:val="566B56"/>
-        </w:rPr>
-        <w:t xml:space="preserve">Punto C (Recalentamiento): </w:t>
-      </w:r>
-      <w:r>
-        <w:rPr>
-          <w:rFonts w:ascii="Calibri" w:hAnsi="Calibri"/>
-          <w:color w:val="2F3A30"/>
-        </w:rPr>
-        <w:t>Ubicado por encima de la bisectriz, muestra una tasa de desempleo menor que la de vacantes e inferior a la suma del desempleo friccional y estructural. Puede indicar un "recalentamiento" de la economía.</w:t>
-      </w:r>
-    </w:p>
-    <w:p>
-      <w:pPr>
-        <w:pStyle w:val="Heading2"/>
-        <w:keepNext/>
-        <w:spacing w:before="360" w:after="100"/>
-        <w:jc w:val="left"/>
-      </w:pPr>
-      <w:r>
-        <w:rPr>
-          <w:rFonts w:ascii="Poppins" w:hAnsi="Poppins"/>
-          <w:b/>
-          <w:color w:val="76927A"/>
-          <w:sz w:val="25"/>
-        </w:rPr>
-        <w:t>6.4. Aplicación: el caso español durante la crisis</w:t>
-      </w:r>
-    </w:p>
-    <w:p>
-      <w:pPr>
-        <w:spacing w:after="90" w:line="276" w:lineRule="auto"/>
-        <w:ind w:left="0" w:firstLine="0"/>
-        <w:jc w:val="both"/>
-      </w:pPr>
-      <w:r>
-        <w:rPr>
-          <w:rFonts w:ascii="Calibri" w:hAnsi="Calibri"/>
-          <w:b/>
-          <w:color w:val="2F3A30"/>
-          <w:sz w:val="21"/>
-        </w:rPr>
-        <w:t>Análisis empírico del caso español (2008-2016):</w:t>
-      </w:r>
-    </w:p>
-    <w:p>
-      <w:pPr>
-        <w:spacing w:after="90" w:line="276" w:lineRule="auto"/>
-        <w:ind w:left="0" w:firstLine="0"/>
-        <w:jc w:val="both"/>
-      </w:pPr>
-      <w:r>
-        <w:rPr>
-          <w:rFonts w:ascii="Calibri" w:hAnsi="Calibri"/>
-          <w:color w:val="2F3A30"/>
-          <w:sz w:val="21"/>
-        </w:rPr>
-        <w:t>El estudio de la curva de Beveridge en España durante la crisis financiera proporciona un ejemplo práctico excepcional de cómo los cambios en la eficiencia del emparejamiento pueden impactar significativamente la economía.</w:t>
-      </w:r>
-    </w:p>
-    <w:p>
-      <w:pPr>
-        <w:spacing w:after="70"/>
-        <w:ind w:left="504" w:hanging="259"/>
-        <w:jc w:val="both"/>
-      </w:pPr>
-      <w:r>
-        <w:rPr>
-          <w:rFonts w:ascii="Calibri" w:hAnsi="Calibri"/>
-          <w:b/>
-          <w:color w:val="76927A"/>
-        </w:rPr>
-        <w:t xml:space="preserve">•  </w:t>
-      </w:r>
-      <w:r>
-        <w:rPr>
-          <w:rFonts w:ascii="Calibri" w:hAnsi="Calibri"/>
-          <w:b/>
-          <w:color w:val="566B56"/>
-        </w:rPr>
-        <w:t xml:space="preserve">Desafíos metodológicos: </w:t>
-      </w:r>
-      <w:r>
-        <w:rPr>
-          <w:rFonts w:ascii="Calibri" w:hAnsi="Calibri"/>
-          <w:color w:val="2F3A30"/>
-        </w:rPr>
-        <w:t>Los investigadores enfrentaron el desafío de la falta de una serie homogénea de datos sobre vacantes laborales. Para superar esta dificultad, construyeron una serie uniforme de vacantes desde 1980 hasta 2016, combinando datos de diversas fuentes como la OCDE, la Encuesta de Coyuntura Laboral y la Encuesta Trimestral de Coste Laboral.</w:t>
-      </w:r>
-    </w:p>
-    <w:p>
-      <w:pPr>
-        <w:spacing w:after="90" w:line="276" w:lineRule="auto"/>
-        <w:ind w:left="0" w:firstLine="0"/>
-        <w:jc w:val="both"/>
-      </w:pPr>
-      <w:r>
-        <w:rPr>
-          <w:rFonts w:ascii="Calibri" w:hAnsi="Calibri"/>
-          <w:b/>
-          <w:color w:val="2F3A30"/>
-          <w:sz w:val="21"/>
-        </w:rPr>
-        <w:t>Dos fases distintas identificadas:</w:t>
-      </w:r>
-    </w:p>
-    <w:p>
-      <w:pPr>
-        <w:spacing w:after="70"/>
-        <w:ind w:left="504" w:hanging="259"/>
-        <w:jc w:val="both"/>
-      </w:pPr>
-      <w:r>
-        <w:rPr>
-          <w:rFonts w:ascii="Calibri" w:hAnsi="Calibri"/>
-          <w:b/>
-          <w:color w:val="76927A"/>
-        </w:rPr>
-        <w:t xml:space="preserve">•  </w:t>
-      </w:r>
-      <w:r>
-        <w:rPr>
-          <w:rFonts w:ascii="Calibri" w:hAnsi="Calibri"/>
-          <w:b/>
-          <w:color w:val="566B56"/>
-        </w:rPr>
-        <w:t xml:space="preserve">Fase 1 (1994-2007): </w:t>
-      </w:r>
-      <w:r>
-        <w:rPr>
-          <w:rFonts w:ascii="Calibri" w:hAnsi="Calibri"/>
-          <w:color w:val="2F3A30"/>
-        </w:rPr>
-        <w:t>Estabilidad pre-crisis</w:t>
-      </w:r>
-    </w:p>
-    <w:p>
-      <w:pPr>
-        <w:spacing w:after="90" w:line="276" w:lineRule="auto"/>
-        <w:ind w:left="0" w:firstLine="0"/>
-        <w:jc w:val="both"/>
-      </w:pPr>
-      <w:r>
-        <w:rPr>
-          <w:rFonts w:ascii="Calibri" w:hAnsi="Calibri"/>
-          <w:color w:val="2F3A30"/>
-          <w:sz w:val="21"/>
-        </w:rPr>
-        <w:t>Durante el período de expansión económica, la curva se mantuvo relativamente estable y cercana al origen</w:t>
-      </w:r>
-    </w:p>
-    <w:p>
-      <w:pPr>
-        <w:spacing w:after="90" w:line="276" w:lineRule="auto"/>
-        <w:ind w:left="0" w:firstLine="0"/>
-        <w:jc w:val="both"/>
-      </w:pPr>
-      <w:r>
-        <w:rPr>
-          <w:rFonts w:ascii="Calibri" w:hAnsi="Calibri"/>
-          <w:color w:val="2F3A30"/>
-          <w:sz w:val="21"/>
-        </w:rPr>
-        <w:t>Indicaba un funcionamiento eficiente del mercado laboral español</w:t>
-      </w:r>
-    </w:p>
-    <w:p>
-      <w:pPr>
-        <w:spacing w:after="70"/>
-        <w:ind w:left="504" w:hanging="259"/>
-        <w:jc w:val="both"/>
-      </w:pPr>
-      <w:r>
-        <w:rPr>
-          <w:rFonts w:ascii="Calibri" w:hAnsi="Calibri"/>
-          <w:b/>
-          <w:color w:val="76927A"/>
-        </w:rPr>
-        <w:t xml:space="preserve">•  </w:t>
-      </w:r>
-      <w:r>
-        <w:rPr>
-          <w:rFonts w:ascii="Calibri" w:hAnsi="Calibri"/>
-          <w:b/>
-          <w:color w:val="566B56"/>
-        </w:rPr>
-        <w:t xml:space="preserve">Fase 2 (2008-2014): </w:t>
-      </w:r>
-      <w:r>
-        <w:rPr>
-          <w:rFonts w:ascii="Calibri" w:hAnsi="Calibri"/>
-          <w:color w:val="2F3A30"/>
-        </w:rPr>
-        <w:t>Crisis y desplazamiento</w:t>
-      </w:r>
-    </w:p>
-    <w:p>
-      <w:pPr>
-        <w:spacing w:after="90" w:line="276" w:lineRule="auto"/>
-        <w:ind w:left="0" w:firstLine="0"/>
-        <w:jc w:val="both"/>
-      </w:pPr>
-      <w:r>
-        <w:rPr>
-          <w:rFonts w:ascii="Calibri" w:hAnsi="Calibri"/>
-          <w:color w:val="2F3A30"/>
-          <w:sz w:val="21"/>
-        </w:rPr>
-        <w:t>A partir de la crisis financiera de 2008, la curva experimentó un desplazamiento significativo hacia la derecha</w:t>
-      </w:r>
-    </w:p>
-    <w:p>
-      <w:pPr>
-        <w:keepNext/>
-        <w:spacing w:after="40" w:line="276" w:lineRule="auto" w:before="160"/>
-        <w:ind w:left="0" w:firstLine="0"/>
-        <w:jc w:val="left"/>
-      </w:pPr>
-      <w:r>
-        <w:rPr>
-          <w:rFonts w:ascii="Calibri" w:hAnsi="Calibri"/>
-          <w:b/>
-          <w:color w:val="566B56"/>
-          <w:sz w:val="21"/>
-        </w:rPr>
-        <w:t>Indicaba una menor eficiencia en el mercado laboral</w:t>
-      </w:r>
-    </w:p>
-    <w:p>
-      <w:pPr>
-        <w:spacing w:after="90" w:line="276" w:lineRule="auto"/>
-        <w:ind w:left="0" w:firstLine="0"/>
-        <w:jc w:val="both"/>
-      </w:pPr>
-      <w:r>
-        <w:rPr>
-          <w:rFonts w:ascii="Calibri" w:hAnsi="Calibri"/>
-          <w:color w:val="2F3A30"/>
-          <w:sz w:val="21"/>
-        </w:rPr>
-        <w:t>Reflejaba un desajuste importante entre oferta y demanda de trabajo</w:t>
-      </w:r>
-    </w:p>
-    <w:p>
-      <w:pPr>
-        <w:spacing w:after="90" w:line="276" w:lineRule="auto"/>
-        <w:ind w:left="0" w:firstLine="0"/>
-        <w:jc w:val="both"/>
-      </w:pPr>
-      <w:r>
-        <w:rPr>
-          <w:rFonts w:ascii="Calibri" w:hAnsi="Calibri"/>
-          <w:color w:val="2F3A30"/>
-          <w:sz w:val="21"/>
-        </w:rPr>
-        <w:t>Posiblemente vinculado a cambios estructurales como la crisis del sector de la construcción</w:t>
-      </w:r>
-    </w:p>
-    <w:p>
-      <w:pPr>
-        <w:spacing w:after="70"/>
-        <w:ind w:left="504" w:hanging="259"/>
-        <w:jc w:val="both"/>
-      </w:pPr>
-      <w:r>
-        <w:rPr>
-          <w:rFonts w:ascii="Calibri" w:hAnsi="Calibri"/>
-          <w:b/>
-          <w:color w:val="76927A"/>
-        </w:rPr>
-        <w:t xml:space="preserve">•  </w:t>
-      </w:r>
-      <w:r>
-        <w:rPr>
-          <w:rFonts w:ascii="Calibri" w:hAnsi="Calibri"/>
-          <w:b/>
-          <w:color w:val="566B56"/>
-        </w:rPr>
-        <w:t xml:space="preserve">Fase 3 (2014-2016): </w:t>
-      </w:r>
-      <w:r>
-        <w:rPr>
-          <w:rFonts w:ascii="Calibri" w:hAnsi="Calibri"/>
-          <w:color w:val="2F3A30"/>
-        </w:rPr>
-        <w:t>Recuperación única</w:t>
+        <w:t xml:space="preserve">Fase 3 (2014–2024: </w:t>
+      </w:r>
+      <w:r>
+        <w:rPr>
+          <w:rFonts w:ascii="Calibri" w:hAnsi="Calibri"/>
+          <w:color w:val="2F3A30"/>
+        </w:rPr>
+        <w:t>Recuperación económica y récord histórico de vacantes)</w:t>
       </w:r>
     </w:p>
     <w:p>

</xml_diff>

<commit_message>
Tema 1: consolidar en Tema 1 2627_maquetado.docx como versión canónica
- Re-inserta las 6 etiquetas de sesión (S1→S5, orden lineal) en
  Tema 1 2627_maquetado.docx, que se habían perdido en el proceso de
  maquetación con figuras/encabezados nativos.
- Archiva la versión anterior (sin figuras) en Versiones antiguas/,
  siguiendo la convención ya usada en Tema 2.
- Actualiza los 4 guiones de sesión (enlaces a "Material Base") para
  apuntar al nuevo archivo canónico en vez del archivado.

Validado contra el esquema OOXML: PASSED.

Co-Authored-By: Claude Sonnet 5 <noreply@anthropic.com>
Claude-Session: https://claude.ai/code/session_01Xho3ag6hb22Yfu5Qf5kBYC
</commit_message>
<xml_diff>
--- a/Temas EB/Tema 1/Apuntes/Tema 1 2627_maquetado.docx
+++ b/Temas EB/Tema 1/Apuntes/Tema 1 2627_maquetado.docx
@@ -168,6 +168,23 @@
           <w:sz w:val="30"/>
         </w:rPr>
         <w:t>1. FUNDAMENTOS DEL MERCADO DE TRABAJO</w:t>
+      </w:r>
+    </w:p>
+    <w:p>
+      <w:pPr>
+        <w:shd w:val="clear" w:color="auto" w:fill="76927A"/>
+        <w:spacing w:before="120" w:after="120"/>
+        <w:jc w:val="left"/>
+      </w:pPr>
+      <w:r>
+        <w:rPr>
+          <w:b/>
+          <w:bCs/>
+          <w:color w:val="FFFFFF"/>
+          <w:sz w:val="20"/>
+          <w:szCs w:val="20"/>
+        </w:rPr>
+        <w:t xml:space="preserve">📍 SESIÓN 1 · Semana 1 (Lunes 14/09, últimos 30 min de la sesión, tras Tema 0) — Arranque de Tema 1, sin dinámica de innovación todavía</w:t>
       </w:r>
     </w:p>
     <w:tbl>
@@ -2816,6 +2833,23 @@
         <w:t>2. EL PIB Y LA PRODUCTIVIDAD EN EL MERCADO LABORAL</w:t>
       </w:r>
     </w:p>
+    <w:p>
+      <w:pPr>
+        <w:shd w:val="clear" w:color="auto" w:fill="76927A"/>
+        <w:spacing w:before="120" w:after="120"/>
+        <w:jc w:val="left"/>
+      </w:pPr>
+      <w:r>
+        <w:rPr>
+          <w:b/>
+          <w:bCs/>
+          <w:color w:val="FFFFFF"/>
+          <w:sz w:val="20"/>
+          <w:szCs w:val="20"/>
+        </w:rPr>
+        <w:t xml:space="preserve">📍 SESIÓN 2 · Semana 1 (Martes 15/09 · Viernes 18/09, 120 min)</w:t>
+      </w:r>
+    </w:p>
     <w:tbl>
       <w:tblPr>
         <w:tblW w:type="auto" w:w="0"/>
@@ -5208,6 +5242,23 @@
         <w:t>EQUILIBRIO EN EL MERCADO DE TRABAJO</w:t>
       </w:r>
     </w:p>
+    <w:p>
+      <w:pPr>
+        <w:shd w:val="clear" w:color="auto" w:fill="76927A"/>
+        <w:spacing w:before="120" w:after="120"/>
+        <w:jc w:val="left"/>
+      </w:pPr>
+      <w:r>
+        <w:rPr>
+          <w:b/>
+          <w:bCs/>
+          <w:color w:val="FFFFFF"/>
+          <w:sz w:val="20"/>
+          <w:szCs w:val="20"/>
+        </w:rPr>
+        <w:t xml:space="preserve">📍 SESIÓN 3 · Semana 2 (Lunes 21/09, 90 min)</w:t>
+      </w:r>
+    </w:p>
     <w:tbl>
       <w:tblPr>
         <w:tblW w:type="auto" w:w="0"/>
@@ -6990,6 +7041,23 @@
         <w:t>4. TIPOLOGÍA DEL DESEMPLEO</w:t>
       </w:r>
     </w:p>
+    <w:p>
+      <w:pPr>
+        <w:shd w:val="clear" w:color="auto" w:fill="76927A"/>
+        <w:spacing w:before="120" w:after="120"/>
+        <w:jc w:val="left"/>
+      </w:pPr>
+      <w:r>
+        <w:rPr>
+          <w:b/>
+          <w:bCs/>
+          <w:color w:val="FFFFFF"/>
+          <w:sz w:val="20"/>
+          <w:szCs w:val="20"/>
+        </w:rPr>
+        <w:t xml:space="preserve">📍 SESIÓN 4 · Semana 2 (Martes 22/09 · Viernes 25/09, 120 min)</w:t>
+      </w:r>
+    </w:p>
     <w:tbl>
       <w:tblPr>
         <w:tblW w:type="auto" w:w="0"/>
@@ -9866,6 +9934,23 @@
         <w:t>5. LA TASA NATURAL DE DESEMPLEO Y LA CURVA DE PHILLIPS</w:t>
       </w:r>
     </w:p>
+    <w:p>
+      <w:pPr>
+        <w:shd w:val="clear" w:color="auto" w:fill="76927A"/>
+        <w:spacing w:before="120" w:after="120"/>
+        <w:jc w:val="left"/>
+      </w:pPr>
+      <w:r>
+        <w:rPr>
+          <w:b/>
+          <w:bCs/>
+          <w:color w:val="FFFFFF"/>
+          <w:sz w:val="20"/>
+          <w:szCs w:val="20"/>
+        </w:rPr>
+        <w:t xml:space="preserve">📍 SESIÓN 4 (continuación) · mismo bloque de 120 min</w:t>
+      </w:r>
+    </w:p>
     <w:tbl>
       <w:tblPr>
         <w:tblW w:type="auto" w:w="0"/>
@@ -11109,6 +11194,23 @@
           <w:sz w:val="30"/>
         </w:rPr>
         <w:t>6. LA CURVA DE BEVERIDGE: ANÁLISIS MICROECONÓMICO DEL MERCADO LABORAL</w:t>
+      </w:r>
+    </w:p>
+    <w:p>
+      <w:pPr>
+        <w:shd w:val="clear" w:color="auto" w:fill="76927A"/>
+        <w:spacing w:before="120" w:after="120"/>
+        <w:jc w:val="left"/>
+      </w:pPr>
+      <w:r>
+        <w:rPr>
+          <w:b/>
+          <w:bCs/>
+          <w:color w:val="FFFFFF"/>
+          <w:sz w:val="20"/>
+          <w:szCs w:val="20"/>
+        </w:rPr>
+        <w:t xml:space="preserve">📍 SESIÓN 5 · Semana 3 (primera sesión: Martes 29/09 en L1, 2h · Lunes 28/09 en L2, 1,5h) — Beveridge completo, cierre y síntesis de Tema 1</w:t>
       </w:r>
     </w:p>
     <w:tbl>

</xml_diff>